<commit_message>
docs(qa): propuesta de diseño en Word con diagramado de revista (APA 7), notas centradas, resumen y referencias
</commit_message>
<xml_diff>
--- a/docs/qa/motor-ppt-2026-10-06/4-recetario/propuesta-word.docx
+++ b/docs/qa/motor-ppt-2026-10-06/4-recetario/propuesta-word.docx
@@ -269,9 +269,36 @@
           <w:bottom w:val="none" w:sz="0" w:space="0" w:color="000000"/>
           <w:right w:val="none" w:sz="0" w:space="0" w:color="000000"/>
         </w:pBdr>
-        <w:spacing w:after="280" w:before="0" w:line="312"/>
+        <w:spacing w:after="120" w:before="0" w:line="312"/>
         <w:ind w:left="0" w:right="0" w:firstLine="0" w:firstLineChars="0"/>
         <w:jc w:val="left"/>
+      </w:pPr>
+      <w:r>
+        <w:rPr>
+          <w:rFonts w:ascii="Arial" w:hAnsi="Arial" w:eastAsia="Arial" w:cs="Arial"/>
+          <w:i w:val="false"/>
+          <w:b w:val="true"/>
+          <w:u w:val="none"/>
+          <w:strike w:val="false"/>
+          <w:sz w:val="25"/>
+          <w:szCs w:val="25"/>
+          <w:color w:val="002060"/>
+        </w:rPr>
+        <w:t xml:space="preserve">Resumen</w:t>
+      </w:r>
+    </w:p>
+    <w:p>
+      <w:pPr>
+        <w:pStyle w:val="Normal"/>
+        <w:pBdr>
+          <w:top w:val="none" w:sz="0" w:space="0" w:color="000000"/>
+          <w:left w:val="none" w:sz="0" w:space="0" w:color="000000"/>
+          <w:bottom w:val="none" w:sz="0" w:space="0" w:color="000000"/>
+          <w:right w:val="none" w:sz="0" w:space="0" w:color="000000"/>
+        </w:pBdr>
+        <w:spacing w:after="160" w:before="0" w:line="312"/>
+        <w:ind w:left="0" w:right="0" w:firstLine="0" w:firstLineChars="0"/>
+        <w:jc w:val="both"/>
       </w:pPr>
       <w:r>
         <w:rPr>
@@ -280,11 +307,57 @@
           <w:b w:val="false"/>
           <w:u w:val="none"/>
           <w:strike w:val="false"/>
-          <w:sz w:val="20"/>
-          <w:szCs w:val="20"/>
-          <w:color w:val="5A6480"/>
-        </w:rPr>
-        <w:t xml:space="preserve">Esta propuesta acompaña a la propuesta de diseño en PPT. Muestra cómo se arma el informe en Word: el documento y sus partes, la página, los estilos, cómo pasa un gráfico del PPT al Word, todos los gráficos del motor con su rótulo, su base y su lectura, las situaciones de datos más frecuentes, las tablas y un ejemplo por tipo de estudio. El capítulo de acreditación usa los datos del proyecto de referencia. Los demás usan cifras ficticias.</w:t>
+          <w:sz w:val="21"/>
+          <w:szCs w:val="21"/>
+          <w:color w:val="26303F"/>
+        </w:rPr>
+        <w:t xml:space="preserve">Esta propuesta define cómo se diagraman los informes cuantitativos de PULSO PUCP en Word y acompaña a la propuesta de diseño en PPT. Presenta la estructura del documento y sus partes, las reglas de página y de estilo, la traducción de las láminas del PPT a figuras de Word, los gráficos del motor con su rótulo, su nota y su lectura, las situaciones de datos más frecuentes, las tablas y un ejemplo por tipo de estudio. Los rótulos, las notas y las referencias siguen las convenciones editoriales de la American Psychological Association (2020). El capítulo de acreditación usa los datos del proyecto de referencia. Los demás usan cifras ficticias.</w:t>
+      </w:r>
+    </w:p>
+    <w:p>
+      <w:pPr>
+        <w:pStyle w:val="Normal"/>
+        <w:pBdr>
+          <w:top w:val="none" w:sz="0" w:space="0" w:color="000000"/>
+          <w:left w:val="none" w:sz="0" w:space="0" w:color="000000"/>
+          <w:bottom w:val="none" w:sz="0" w:space="0" w:color="000000"/>
+          <w:right w:val="none" w:sz="0" w:space="0" w:color="000000"/>
+        </w:pBdr>
+        <w:spacing w:after="280" w:before="0" w:line="312"/>
+        <w:ind w:left="0" w:right="0" w:firstLine="0" w:firstLineChars="0"/>
+        <w:jc w:val="left"/>
+      </w:pPr>
+      <w:r>
+        <w:rPr>
+          <w:rFonts w:ascii="Arial" w:hAnsi="Arial" w:eastAsia="Arial" w:cs="Arial"/>
+          <w:i w:val="false"/>
+          <w:b w:val="true"/>
+          <w:u w:val="none"/>
+          <w:strike w:val="false"/>
+          <w:sz w:val="21"/>
+          <w:szCs w:val="21"/>
+          <w:color w:val="002060"/>
+        </w:rPr>
+        <w:t xml:space="preserve">Palabras clave: </w:t>
+      </w:r>
+      <w:r>
+        <w:rPr>
+          <w:rFonts w:ascii="Arial" w:hAnsi="Arial" w:eastAsia="Arial" w:cs="Arial"/>
+          <w:i w:val="false"/>
+          <w:b w:val="false"/>
+          <w:u w:val="none"/>
+          <w:strike w:val="false"/>
+          <w:sz w:val="21"/>
+          <w:szCs w:val="21"/>
+          <w:color w:val="26303F"/>
+        </w:rPr>
+        <w:t xml:space="preserve">diseño de informes, visualización de datos, encuestas, identidad visual, Word</w:t>
+      </w:r>
+    </w:p>
+    <w:p>
+      <w:pPr/>
+      <w:r>
+        <w:br w:type="page"/>
       </w:r>
     </w:p>
     <w:p>
@@ -545,7 +618,7 @@
         </w:pBdr>
         <w:spacing w:after="160" w:before="0" w:line="312"/>
         <w:ind w:left="0" w:right="0" w:firstLine="0" w:firstLineChars="0"/>
-        <w:jc w:val="left"/>
+        <w:jc w:val="both"/>
       </w:pPr>
       <w:r>
         <w:rPr>
@@ -2302,7 +2375,7 @@
         </w:pBdr>
         <w:spacing w:after="160" w:before="0" w:line="312"/>
         <w:ind w:left="0" w:right="0" w:firstLine="0" w:firstLineChars="0"/>
-        <w:jc w:val="left"/>
+        <w:jc w:val="both"/>
       </w:pPr>
       <w:r>
         <w:rPr>
@@ -2830,7 +2903,7 @@
         </w:pBdr>
         <w:spacing w:after="160" w:before="0" w:line="312"/>
         <w:ind w:left="0" w:right="0" w:firstLine="0" w:firstLineChars="0"/>
-        <w:jc w:val="left"/>
+        <w:jc w:val="both"/>
       </w:pPr>
       <w:r>
         <w:rPr>
@@ -3203,7 +3276,7 @@
         </w:pBdr>
         <w:spacing w:after="160" w:before="0" w:line="312"/>
         <w:ind w:left="0" w:right="0" w:firstLine="0" w:firstLineChars="0"/>
-        <w:jc w:val="left"/>
+        <w:jc w:val="both"/>
       </w:pPr>
       <w:r>
         <w:rPr>
@@ -3576,7 +3649,7 @@
         </w:pBdr>
         <w:spacing w:after="160" w:before="0" w:line="312"/>
         <w:ind w:left="0" w:right="0" w:firstLine="0" w:firstLineChars="0"/>
-        <w:jc w:val="left"/>
+        <w:jc w:val="both"/>
       </w:pPr>
       <w:r>
         <w:rPr>
@@ -4011,7 +4084,7 @@
           <w:szCs w:val="23"/>
           <w:color w:val="26303F"/>
         </w:rPr>
-        <w:t xml:space="preserve">La página, los estilos de Word, la escala tipográfica y los colores que comparten todos los informes.</w:t>
+        <w:t xml:space="preserve">La página, los estilos de Word, la escala tipográfica y los colores que comparten todos los informes. Siguen los principios de claridad y economía visual que proponen Few (2012) y Tufte (2001).</w:t>
       </w:r>
     </w:p>
     <w:p>
@@ -4034,7 +4107,7 @@
         </w:pBdr>
         <w:spacing w:after="160" w:before="0" w:line="312"/>
         <w:ind w:left="0" w:right="0" w:firstLine="0" w:firstLineChars="0"/>
-        <w:jc w:val="left"/>
+        <w:jc w:val="both"/>
       </w:pPr>
       <w:r>
         <w:rPr>
@@ -4091,12 +4164,14 @@
         <w:fldChar w:fldCharType="end"/>
       </w:r>
       <w:r>
-        <w:rPr>
-          <w:rStyle w:val="NumeroRotulo"/>
-        </w:rPr>
-        <w:t xml:space="preserve">. </w:t>
-      </w:r>
-      <w:r>
+        <w:br w:type="textWrapping"/>
+      </w:r>
+      <w:r>
+        <w:rPr>
+          <w:rFonts/>
+          <w:i w:val="true"/>
+          <w:strike w:val="false"/>
+        </w:rPr>
         <w:t xml:space="preserve">La página del informe y sus partes</w:t>
       </w:r>
     </w:p>
@@ -4112,7 +4187,7 @@
         </w:pBdr>
         <w:spacing w:after="0" w:before="0" w:line="240"/>
         <w:ind w:left="0" w:right="0" w:firstLine="0" w:firstLineChars="0"/>
-        <w:jc w:val="left"/>
+        <w:jc w:val="center"/>
       </w:pPr>
       <w:r>
         <w:rPr/>
@@ -4160,6 +4235,14 @@
         <w:pStyle w:val="BaseFuente"/>
       </w:pPr>
       <w:r>
+        <w:rPr>
+          <w:rFonts/>
+          <w:i w:val="true"/>
+          <w:strike w:val="false"/>
+        </w:rPr>
+        <w:t xml:space="preserve">Nota. </w:t>
+      </w:r>
+      <w:r>
         <w:t xml:space="preserve">Base: esquema medido de una página del informe. Fuente: PULSO PUCP 2026.</w:t>
       </w:r>
     </w:p>
@@ -5008,7 +5091,7 @@
         </w:pBdr>
         <w:spacing w:after="160" w:before="0" w:line="312"/>
         <w:ind w:left="0" w:right="0" w:firstLine="0" w:firstLineChars="0"/>
-        <w:jc w:val="left"/>
+        <w:jc w:val="both"/>
       </w:pPr>
       <w:r>
         <w:rPr>
@@ -5065,12 +5148,14 @@
         <w:fldChar w:fldCharType="end"/>
       </w:r>
       <w:r>
-        <w:rPr>
-          <w:rStyle w:val="NumeroRotulo"/>
-        </w:rPr>
-        <w:t xml:space="preserve">. </w:t>
-      </w:r>
-      <w:r>
+        <w:br w:type="textWrapping"/>
+      </w:r>
+      <w:r>
+        <w:rPr>
+          <w:rFonts/>
+          <w:i w:val="true"/>
+          <w:strike w:val="false"/>
+        </w:rPr>
         <w:t xml:space="preserve">La Unidad cuenta con servicios de tutoría académica</w:t>
       </w:r>
     </w:p>
@@ -5086,7 +5171,7 @@
         </w:pBdr>
         <w:spacing w:after="0" w:before="0" w:line="240"/>
         <w:ind w:left="0" w:right="0" w:firstLine="0" w:firstLineChars="0"/>
-        <w:jc w:val="left"/>
+        <w:jc w:val="center"/>
       </w:pPr>
       <w:r>
         <w:rPr/>
@@ -5134,6 +5219,14 @@
         <w:pStyle w:val="BaseFuente"/>
       </w:pPr>
       <w:r>
+        <w:rPr>
+          <w:rFonts/>
+          <w:i w:val="true"/>
+          <w:strike w:val="false"/>
+        </w:rPr>
+        <w:t xml:space="preserve">Nota. </w:t>
+      </w:r>
+      <w:r>
         <w:t xml:space="preserve">Base: 148 docentes, 1,234 estudiantes y 314 egresados. Fuente: PULSO PUCP 2026.</w:t>
       </w:r>
     </w:p>
@@ -6058,7 +6151,7 @@
         </w:pBdr>
         <w:spacing w:after="160" w:before="0" w:line="312"/>
         <w:ind w:left="0" w:right="0" w:firstLine="0" w:firstLineChars="0"/>
-        <w:jc w:val="left"/>
+        <w:jc w:val="both"/>
       </w:pPr>
       <w:r>
         <w:rPr>
@@ -7645,7 +7738,7 @@
         </w:pBdr>
         <w:spacing w:after="160" w:before="0" w:line="312"/>
         <w:ind w:left="0" w:right="0" w:firstLine="0" w:firstLineChars="0"/>
-        <w:jc w:val="left"/>
+        <w:jc w:val="both"/>
       </w:pPr>
       <w:r>
         <w:rPr>
@@ -9402,7 +9495,7 @@
         </w:pBdr>
         <w:spacing w:after="160" w:before="0" w:line="312"/>
         <w:ind w:left="0" w:right="0" w:firstLine="0" w:firstLineChars="0"/>
-        <w:jc w:val="left"/>
+        <w:jc w:val="both"/>
       </w:pPr>
       <w:r>
         <w:rPr>
@@ -9459,12 +9552,14 @@
         <w:fldChar w:fldCharType="end"/>
       </w:r>
       <w:r>
-        <w:rPr>
-          <w:rStyle w:val="NumeroRotulo"/>
-        </w:rPr>
-        <w:t xml:space="preserve">. </w:t>
-      </w:r>
-      <w:r>
+        <w:br w:type="textWrapping"/>
+      </w:r>
+      <w:r>
+        <w:rPr>
+          <w:rFonts/>
+          <w:i w:val="true"/>
+          <w:strike w:val="false"/>
+        </w:rPr>
         <w:t xml:space="preserve">Las cuatro paletas del informe</w:t>
       </w:r>
     </w:p>
@@ -9480,7 +9575,7 @@
         </w:pBdr>
         <w:spacing w:after="0" w:before="0" w:line="240"/>
         <w:ind w:left="0" w:right="0" w:firstLine="0" w:firstLineChars="0"/>
-        <w:jc w:val="left"/>
+        <w:jc w:val="center"/>
       </w:pPr>
       <w:r>
         <w:rPr/>
@@ -9528,6 +9623,14 @@
         <w:pStyle w:val="BaseFuente"/>
       </w:pPr>
       <w:r>
+        <w:rPr>
+          <w:rFonts/>
+          <w:i w:val="true"/>
+          <w:strike w:val="false"/>
+        </w:rPr>
+        <w:t xml:space="preserve">Nota. </w:t>
+      </w:r>
+      <w:r>
         <w:t xml:space="preserve">Base: paletas de la identidad de PULSO PUCP. Fuente: PULSO PUCP 2026.</w:t>
       </w:r>
     </w:p>
@@ -11123,7 +11226,7 @@
         </w:pBdr>
         <w:spacing w:after="160" w:before="0" w:line="312"/>
         <w:ind w:left="0" w:right="0" w:firstLine="0" w:firstLineChars="0"/>
-        <w:jc w:val="left"/>
+        <w:jc w:val="both"/>
       </w:pPr>
       <w:r>
         <w:rPr>
@@ -12612,7 +12715,7 @@
         </w:pBdr>
         <w:spacing w:after="160" w:before="0" w:line="312"/>
         <w:ind w:left="0" w:right="0" w:firstLine="0" w:firstLineChars="0"/>
-        <w:jc w:val="left"/>
+        <w:jc w:val="both"/>
       </w:pPr>
       <w:r>
         <w:rPr>
@@ -12706,6 +12809,14 @@
         <w:pStyle w:val="BaseFuente"/>
       </w:pPr>
       <w:r>
+        <w:rPr>
+          <w:rFonts/>
+          <w:i w:val="true"/>
+          <w:strike w:val="false"/>
+        </w:rPr>
+        <w:t xml:space="preserve">Nota. </w:t>
+      </w:r>
+      <w:r>
         <w:t xml:space="preserve">Lámina «Dos gráficos con narrativa» del PPT</w:t>
       </w:r>
     </w:p>
@@ -12778,12 +12889,14 @@
         <w:fldChar w:fldCharType="end"/>
       </w:r>
       <w:r>
-        <w:rPr>
-          <w:rStyle w:val="NumeroRotulo"/>
-        </w:rPr>
-        <w:t xml:space="preserve">. </w:t>
-      </w:r>
-      <w:r>
+        <w:br w:type="textWrapping"/>
+      </w:r>
+      <w:r>
+        <w:rPr>
+          <w:rFonts/>
+          <w:i w:val="true"/>
+          <w:strike w:val="false"/>
+        </w:rPr>
         <w:t xml:space="preserve">¿En qué año obtuvo su título universitario?, egresados</w:t>
       </w:r>
     </w:p>
@@ -12799,7 +12912,7 @@
         </w:pBdr>
         <w:spacing w:after="0" w:before="0" w:line="240"/>
         <w:ind w:left="0" w:right="0" w:firstLine="0" w:firstLineChars="0"/>
-        <w:jc w:val="left"/>
+        <w:jc w:val="center"/>
       </w:pPr>
       <w:r>
         <w:rPr/>
@@ -12847,6 +12960,14 @@
         <w:pStyle w:val="BaseFuente"/>
       </w:pPr>
       <w:r>
+        <w:rPr>
+          <w:rFonts/>
+          <w:i w:val="true"/>
+          <w:strike w:val="false"/>
+        </w:rPr>
+        <w:t xml:space="preserve">Nota. </w:t>
+      </w:r>
+      <w:r>
         <w:t xml:space="preserve">Base: 56 egresados que tienen título. Fuente: PULSO PUCP 2026.</w:t>
       </w:r>
     </w:p>
@@ -12891,12 +13012,14 @@
         <w:fldChar w:fldCharType="end"/>
       </w:r>
       <w:r>
-        <w:rPr>
-          <w:rStyle w:val="NumeroRotulo"/>
-        </w:rPr>
-        <w:t xml:space="preserve">. </w:t>
-      </w:r>
-      <w:r>
+        <w:br w:type="textWrapping"/>
+      </w:r>
+      <w:r>
+        <w:rPr>
+          <w:rFonts/>
+          <w:i w:val="true"/>
+          <w:strike w:val="false"/>
+        </w:rPr>
         <w:t xml:space="preserve">Sueldo mensual bruto, egresados</w:t>
       </w:r>
     </w:p>
@@ -12912,7 +13035,7 @@
         </w:pBdr>
         <w:spacing w:after="0" w:before="0" w:line="240"/>
         <w:ind w:left="0" w:right="0" w:firstLine="0" w:firstLineChars="0"/>
-        <w:jc w:val="left"/>
+        <w:jc w:val="center"/>
       </w:pPr>
       <w:r>
         <w:rPr/>
@@ -12960,6 +13083,14 @@
         <w:pStyle w:val="BaseFuente"/>
       </w:pPr>
       <w:r>
+        <w:rPr>
+          <w:rFonts/>
+          <w:i w:val="true"/>
+          <w:strike w:val="false"/>
+        </w:rPr>
+        <w:t xml:space="preserve">Nota. </w:t>
+      </w:r>
+      <w:r>
         <w:t xml:space="preserve">Base: 167 egresados que respondieron. Fuente: PULSO PUCP 2026.</w:t>
       </w:r>
     </w:p>
@@ -13046,7 +13177,7 @@
         </w:pBdr>
         <w:spacing w:after="160" w:before="0" w:line="312"/>
         <w:ind w:left="0" w:right="0" w:firstLine="0" w:firstLineChars="0"/>
-        <w:jc w:val="left"/>
+        <w:jc w:val="both"/>
       </w:pPr>
       <w:r>
         <w:rPr>
@@ -13140,6 +13271,14 @@
         <w:pStyle w:val="BaseFuente"/>
       </w:pPr>
       <w:r>
+        <w:rPr>
+          <w:rFonts/>
+          <w:i w:val="true"/>
+          <w:strike w:val="false"/>
+        </w:rPr>
+        <w:t xml:space="preserve">Nota. </w:t>
+      </w:r>
+      <w:r>
         <w:t xml:space="preserve">Lámina «Cifras en banda superior» del PPT</w:t>
       </w:r>
     </w:p>
@@ -13660,12 +13799,14 @@
         <w:fldChar w:fldCharType="end"/>
       </w:r>
       <w:r>
-        <w:rPr>
-          <w:rStyle w:val="NumeroRotulo"/>
-        </w:rPr>
-        <w:t xml:space="preserve">. </w:t>
-      </w:r>
-      <w:r>
+        <w:br w:type="textWrapping"/>
+      </w:r>
+      <w:r>
+        <w:rPr>
+          <w:rFonts/>
+          <w:i w:val="true"/>
+          <w:strike w:val="false"/>
+        </w:rPr>
         <w:t xml:space="preserve">¿Qué herramientas de inteligencia artificial usa en sus funciones laborales?</w:t>
       </w:r>
     </w:p>
@@ -13681,7 +13822,7 @@
         </w:pBdr>
         <w:spacing w:after="0" w:before="0" w:line="240"/>
         <w:ind w:left="0" w:right="0" w:firstLine="0" w:firstLineChars="0"/>
-        <w:jc w:val="left"/>
+        <w:jc w:val="center"/>
       </w:pPr>
       <w:r>
         <w:rPr/>
@@ -13729,6 +13870,14 @@
         <w:pStyle w:val="BaseFuente"/>
       </w:pPr>
       <w:r>
+        <w:rPr>
+          <w:rFonts/>
+          <w:i w:val="true"/>
+          <w:strike w:val="false"/>
+        </w:rPr>
+        <w:t xml:space="preserve">Nota. </w:t>
+      </w:r>
+      <w:r>
         <w:t xml:space="preserve">Base: 174 egresados que usan IA. Opción múltiple: los porcentajes pueden sumar más de 100. Fuente: PULSO PUCP 2026.</w:t>
       </w:r>
     </w:p>
@@ -13809,12 +13958,14 @@
         <w:fldChar w:fldCharType="end"/>
       </w:r>
       <w:r>
-        <w:rPr>
-          <w:rStyle w:val="NumeroRotulo"/>
-        </w:rPr>
-        <w:t xml:space="preserve">. </w:t>
-      </w:r>
-      <w:r>
+        <w:br w:type="textWrapping"/>
+      </w:r>
+      <w:r>
+        <w:rPr>
+          <w:rFonts/>
+          <w:i w:val="true"/>
+          <w:strike w:val="false"/>
+        </w:rPr>
         <w:t xml:space="preserve">En una escala de 1 a 10, ¿cuánto confía en el Congreso?</w:t>
       </w:r>
     </w:p>
@@ -13830,7 +13981,7 @@
         </w:pBdr>
         <w:spacing w:after="0" w:before="0" w:line="240"/>
         <w:ind w:left="0" w:right="0" w:firstLine="0" w:firstLineChars="0"/>
-        <w:jc w:val="left"/>
+        <w:jc w:val="center"/>
       </w:pPr>
       <w:r>
         <w:rPr/>
@@ -13878,6 +14029,14 @@
         <w:pStyle w:val="BaseFuente"/>
       </w:pPr>
       <w:r>
+        <w:rPr>
+          <w:rFonts/>
+          <w:i w:val="true"/>
+          <w:strike w:val="false"/>
+        </w:rPr>
+        <w:t xml:space="preserve">Nota. </w:t>
+      </w:r>
+      <w:r>
         <w:t xml:space="preserve">Base: 1,200 entrevistados. Fuente: PULSO PUCP 2026.</w:t>
       </w:r>
     </w:p>
@@ -13958,12 +14117,14 @@
         <w:fldChar w:fldCharType="end"/>
       </w:r>
       <w:r>
-        <w:rPr>
-          <w:rStyle w:val="NumeroRotulo"/>
-        </w:rPr>
-        <w:t xml:space="preserve">. </w:t>
-      </w:r>
-      <w:r>
+        <w:br w:type="textWrapping"/>
+      </w:r>
+      <w:r>
+        <w:rPr>
+          <w:rFonts/>
+          <w:i w:val="true"/>
+          <w:strike w:val="false"/>
+        </w:rPr>
         <w:t xml:space="preserve">La Unidad cuenta con servicios de tutoría académica.</w:t>
       </w:r>
     </w:p>
@@ -13979,7 +14140,7 @@
         </w:pBdr>
         <w:spacing w:after="0" w:before="0" w:line="240"/>
         <w:ind w:left="0" w:right="0" w:firstLine="0" w:firstLineChars="0"/>
-        <w:jc w:val="left"/>
+        <w:jc w:val="center"/>
       </w:pPr>
       <w:r>
         <w:rPr/>
@@ -14027,6 +14188,14 @@
         <w:pStyle w:val="BaseFuente"/>
       </w:pPr>
       <w:r>
+        <w:rPr>
+          <w:rFonts/>
+          <w:i w:val="true"/>
+          <w:strike w:val="false"/>
+        </w:rPr>
+        <w:t xml:space="preserve">Nota. </w:t>
+      </w:r>
+      <w:r>
         <w:t xml:space="preserve">Base: 52 docentes y 172 estudiantes. Fuente: PULSO PUCP 2026.</w:t>
       </w:r>
     </w:p>
@@ -14107,12 +14276,14 @@
         <w:fldChar w:fldCharType="end"/>
       </w:r>
       <w:r>
-        <w:rPr>
-          <w:rStyle w:val="NumeroRotulo"/>
-        </w:rPr>
-        <w:t xml:space="preserve">. </w:t>
-      </w:r>
-      <w:r>
+        <w:br w:type="textWrapping"/>
+      </w:r>
+      <w:r>
+        <w:rPr>
+          <w:rFonts/>
+          <w:i w:val="true"/>
+          <w:strike w:val="false"/>
+        </w:rPr>
         <w:t xml:space="preserve">La Unidad cuenta con servicios de tutoría académica. (2026 frente a 2021)</w:t>
       </w:r>
     </w:p>
@@ -14128,7 +14299,7 @@
         </w:pBdr>
         <w:spacing w:after="0" w:before="0" w:line="240"/>
         <w:ind w:left="0" w:right="0" w:firstLine="0" w:firstLineChars="0"/>
-        <w:jc w:val="left"/>
+        <w:jc w:val="center"/>
       </w:pPr>
       <w:r>
         <w:rPr/>
@@ -14176,6 +14347,14 @@
         <w:pStyle w:val="BaseFuente"/>
       </w:pPr>
       <w:r>
+        <w:rPr>
+          <w:rFonts/>
+          <w:i w:val="true"/>
+          <w:strike w:val="false"/>
+        </w:rPr>
+        <w:t xml:space="preserve">Nota. </w:t>
+      </w:r>
+      <w:r>
         <w:t xml:space="preserve">Base: 52 docentes y 172 estudiantes. 2021: informe consolidado anterior. Fuente: PULSO PUCP 2026.</w:t>
       </w:r>
     </w:p>
@@ -14256,12 +14435,14 @@
         <w:fldChar w:fldCharType="end"/>
       </w:r>
       <w:r>
-        <w:rPr>
-          <w:rStyle w:val="NumeroRotulo"/>
-        </w:rPr>
-        <w:t xml:space="preserve">. </w:t>
-      </w:r>
-      <w:r>
+        <w:br w:type="textWrapping"/>
+      </w:r>
+      <w:r>
+        <w:rPr>
+          <w:rFonts/>
+          <w:i w:val="true"/>
+          <w:strike w:val="false"/>
+        </w:rPr>
         <w:t xml:space="preserve">¿Cuenta con título universitario?, egresados</w:t>
       </w:r>
     </w:p>
@@ -14277,7 +14458,7 @@
         </w:pBdr>
         <w:spacing w:after="0" w:before="0" w:line="240"/>
         <w:ind w:left="0" w:right="0" w:firstLine="0" w:firstLineChars="0"/>
-        <w:jc w:val="left"/>
+        <w:jc w:val="center"/>
       </w:pPr>
       <w:r>
         <w:rPr/>
@@ -14325,6 +14506,14 @@
         <w:pStyle w:val="BaseFuente"/>
       </w:pPr>
       <w:r>
+        <w:rPr>
+          <w:rFonts/>
+          <w:i w:val="true"/>
+          <w:strike w:val="false"/>
+        </w:rPr>
+        <w:t xml:space="preserve">Nota. </w:t>
+      </w:r>
+      <w:r>
         <w:t xml:space="preserve">Base: 178 egresados. Fuente: PULSO PUCP 2026.</w:t>
       </w:r>
     </w:p>
@@ -14405,12 +14594,14 @@
         <w:fldChar w:fldCharType="end"/>
       </w:r>
       <w:r>
-        <w:rPr>
-          <w:rStyle w:val="NumeroRotulo"/>
-        </w:rPr>
-        <w:t xml:space="preserve">. </w:t>
-      </w:r>
-      <w:r>
+        <w:br w:type="textWrapping"/>
+      </w:r>
+      <w:r>
+        <w:rPr>
+          <w:rFonts/>
+          <w:i w:val="true"/>
+          <w:strike w:val="false"/>
+        </w:rPr>
         <w:t xml:space="preserve">Situación laboral actual</w:t>
       </w:r>
     </w:p>
@@ -14426,7 +14617,7 @@
         </w:pBdr>
         <w:spacing w:after="0" w:before="0" w:line="240"/>
         <w:ind w:left="0" w:right="0" w:firstLine="0" w:firstLineChars="0"/>
-        <w:jc w:val="left"/>
+        <w:jc w:val="center"/>
       </w:pPr>
       <w:r>
         <w:rPr/>
@@ -14474,6 +14665,14 @@
         <w:pStyle w:val="BaseFuente"/>
       </w:pPr>
       <w:r>
+        <w:rPr>
+          <w:rFonts/>
+          <w:i w:val="true"/>
+          <w:strike w:val="false"/>
+        </w:rPr>
+        <w:t xml:space="preserve">Nota. </w:t>
+      </w:r>
+      <w:r>
         <w:t xml:space="preserve">Base: 178 egresados. Fuente: PULSO PUCP 2026.</w:t>
       </w:r>
     </w:p>
@@ -14554,12 +14753,14 @@
         <w:fldChar w:fldCharType="end"/>
       </w:r>
       <w:r>
-        <w:rPr>
-          <w:rStyle w:val="NumeroRotulo"/>
-        </w:rPr>
-        <w:t xml:space="preserve">. </w:t>
-      </w:r>
-      <w:r>
+        <w:br w:type="textWrapping"/>
+      </w:r>
+      <w:r>
+        <w:rPr>
+          <w:rFonts/>
+          <w:i w:val="true"/>
+          <w:strike w:val="false"/>
+        </w:rPr>
         <w:t xml:space="preserve">Edad de los estudiantes</w:t>
       </w:r>
     </w:p>
@@ -14575,7 +14776,7 @@
         </w:pBdr>
         <w:spacing w:after="0" w:before="0" w:line="240"/>
         <w:ind w:left="0" w:right="0" w:firstLine="0" w:firstLineChars="0"/>
-        <w:jc w:val="left"/>
+        <w:jc w:val="center"/>
       </w:pPr>
       <w:r>
         <w:rPr/>
@@ -14623,6 +14824,14 @@
         <w:pStyle w:val="BaseFuente"/>
       </w:pPr>
       <w:r>
+        <w:rPr>
+          <w:rFonts/>
+          <w:i w:val="true"/>
+          <w:strike w:val="false"/>
+        </w:rPr>
+        <w:t xml:space="preserve">Nota. </w:t>
+      </w:r>
+      <w:r>
         <w:t xml:space="preserve">Base: 170 estudiantes que declararon su edad. Fuente: PULSO PUCP 2026.</w:t>
       </w:r>
     </w:p>
@@ -14703,12 +14912,14 @@
         <w:fldChar w:fldCharType="end"/>
       </w:r>
       <w:r>
-        <w:rPr>
-          <w:rStyle w:val="NumeroRotulo"/>
-        </w:rPr>
-        <w:t xml:space="preserve">. </w:t>
-      </w:r>
-      <w:r>
+        <w:br w:type="textWrapping"/>
+      </w:r>
+      <w:r>
+        <w:rPr>
+          <w:rFonts/>
+          <w:i w:val="true"/>
+          <w:strike w:val="false"/>
+        </w:rPr>
         <w:t xml:space="preserve">Edad promedio por nivel curricular</w:t>
       </w:r>
     </w:p>
@@ -14724,7 +14935,7 @@
         </w:pBdr>
         <w:spacing w:after="0" w:before="0" w:line="240"/>
         <w:ind w:left="0" w:right="0" w:firstLine="0" w:firstLineChars="0"/>
-        <w:jc w:val="left"/>
+        <w:jc w:val="center"/>
       </w:pPr>
       <w:r>
         <w:rPr/>
@@ -14772,6 +14983,14 @@
         <w:pStyle w:val="BaseFuente"/>
       </w:pPr>
       <w:r>
+        <w:rPr>
+          <w:rFonts/>
+          <w:i w:val="true"/>
+          <w:strike w:val="false"/>
+        </w:rPr>
+        <w:t xml:space="preserve">Nota. </w:t>
+      </w:r>
+      <w:r>
         <w:t xml:space="preserve">Base: 172 estudiantes que declararon su edad. Fuente: PULSO PUCP 2026.</w:t>
       </w:r>
     </w:p>
@@ -14852,12 +15071,14 @@
         <w:fldChar w:fldCharType="end"/>
       </w:r>
       <w:r>
-        <w:rPr>
-          <w:rStyle w:val="NumeroRotulo"/>
-        </w:rPr>
-        <w:t xml:space="preserve">. </w:t>
-      </w:r>
-      <w:r>
+        <w:br w:type="textWrapping"/>
+      </w:r>
+      <w:r>
+        <w:rPr>
+          <w:rFonts/>
+          <w:i w:val="true"/>
+          <w:strike w:val="false"/>
+        </w:rPr>
         <w:t xml:space="preserve">Distribución de la edad por nivel curricular</w:t>
       </w:r>
     </w:p>
@@ -14873,7 +15094,7 @@
         </w:pBdr>
         <w:spacing w:after="0" w:before="0" w:line="240"/>
         <w:ind w:left="0" w:right="0" w:firstLine="0" w:firstLineChars="0"/>
-        <w:jc w:val="left"/>
+        <w:jc w:val="center"/>
       </w:pPr>
       <w:r>
         <w:rPr/>
@@ -14921,6 +15142,14 @@
         <w:pStyle w:val="BaseFuente"/>
       </w:pPr>
       <w:r>
+        <w:rPr>
+          <w:rFonts/>
+          <w:i w:val="true"/>
+          <w:strike w:val="false"/>
+        </w:rPr>
+        <w:t xml:space="preserve">Nota. </w:t>
+      </w:r>
+      <w:r>
         <w:t xml:space="preserve">Base: 172 estudiantes. Fuente: PULSO PUCP 2026.</w:t>
       </w:r>
     </w:p>
@@ -15001,12 +15230,14 @@
         <w:fldChar w:fldCharType="end"/>
       </w:r>
       <w:r>
-        <w:rPr>
-          <w:rStyle w:val="NumeroRotulo"/>
-        </w:rPr>
-        <w:t xml:space="preserve">. </w:t>
-      </w:r>
-      <w:r>
+        <w:br w:type="textWrapping"/>
+      </w:r>
+      <w:r>
+        <w:rPr>
+          <w:rFonts/>
+          <w:i w:val="true"/>
+          <w:strike w:val="false"/>
+        </w:rPr>
         <w:t xml:space="preserve">Edad por público</w:t>
       </w:r>
     </w:p>
@@ -15022,7 +15253,7 @@
         </w:pBdr>
         <w:spacing w:after="0" w:before="0" w:line="240"/>
         <w:ind w:left="0" w:right="0" w:firstLine="0" w:firstLineChars="0"/>
-        <w:jc w:val="left"/>
+        <w:jc w:val="center"/>
       </w:pPr>
       <w:r>
         <w:rPr/>
@@ -15070,6 +15301,14 @@
         <w:pStyle w:val="BaseFuente"/>
       </w:pPr>
       <w:r>
+        <w:rPr>
+          <w:rFonts/>
+          <w:i w:val="true"/>
+          <w:strike w:val="false"/>
+        </w:rPr>
+        <w:t xml:space="preserve">Nota. </w:t>
+      </w:r>
+      <w:r>
         <w:t xml:space="preserve">Base: 52 docentes, 172 estudiantes, 178 egresados, 15 administrativos. El punto es la media. La línea va de la edad mínima a la máxima. Fuente: PULSO PUCP 2026.</w:t>
       </w:r>
     </w:p>
@@ -15150,12 +15389,14 @@
         <w:fldChar w:fldCharType="end"/>
       </w:r>
       <w:r>
-        <w:rPr>
-          <w:rStyle w:val="NumeroRotulo"/>
-        </w:rPr>
-        <w:t xml:space="preserve">. </w:t>
-      </w:r>
-      <w:r>
+        <w:br w:type="textWrapping"/>
+      </w:r>
+      <w:r>
+        <w:rPr>
+          <w:rFonts/>
+          <w:i w:val="true"/>
+          <w:strike w:val="false"/>
+        </w:rPr>
         <w:t xml:space="preserve">Valoración de la gestión de la carrera, docentes</w:t>
       </w:r>
     </w:p>
@@ -15171,7 +15412,7 @@
         </w:pBdr>
         <w:spacing w:after="0" w:before="0" w:line="240"/>
         <w:ind w:left="0" w:right="0" w:firstLine="0" w:firstLineChars="0"/>
-        <w:jc w:val="left"/>
+        <w:jc w:val="center"/>
       </w:pPr>
       <w:r>
         <w:rPr/>
@@ -15219,6 +15460,14 @@
         <w:pStyle w:val="BaseFuente"/>
       </w:pPr>
       <w:r>
+        <w:rPr>
+          <w:rFonts/>
+          <w:i w:val="true"/>
+          <w:strike w:val="false"/>
+        </w:rPr>
+        <w:t xml:space="preserve">Nota. </w:t>
+      </w:r>
+      <w:r>
         <w:t xml:space="preserve">Base: 148 docentes. Fuente: PULSO PUCP 2026.</w:t>
       </w:r>
     </w:p>
@@ -15299,12 +15548,14 @@
         <w:fldChar w:fldCharType="end"/>
       </w:r>
       <w:r>
-        <w:rPr>
-          <w:rStyle w:val="NumeroRotulo"/>
-        </w:rPr>
-        <w:t xml:space="preserve">. </w:t>
-      </w:r>
-      <w:r>
+        <w:br w:type="textWrapping"/>
+      </w:r>
+      <w:r>
+        <w:rPr>
+          <w:rFonts/>
+          <w:i w:val="true"/>
+          <w:strike w:val="false"/>
+        </w:rPr>
         <w:t xml:space="preserve">Qué podría mejorar la carrera (cinco opciones más mencionadas)</w:t>
       </w:r>
     </w:p>
@@ -15320,7 +15571,7 @@
         </w:pBdr>
         <w:spacing w:after="0" w:before="0" w:line="240"/>
         <w:ind w:left="0" w:right="0" w:firstLine="0" w:firstLineChars="0"/>
-        <w:jc w:val="left"/>
+        <w:jc w:val="center"/>
       </w:pPr>
       <w:r>
         <w:rPr/>
@@ -15368,6 +15619,14 @@
         <w:pStyle w:val="BaseFuente"/>
       </w:pPr>
       <w:r>
+        <w:rPr>
+          <w:rFonts/>
+          <w:i w:val="true"/>
+          <w:strike w:val="false"/>
+        </w:rPr>
+        <w:t xml:space="preserve">Nota. </w:t>
+      </w:r>
+      <w:r>
         <w:t xml:space="preserve">Base: 131 egresados. Fuente: PULSO PUCP 2026.</w:t>
       </w:r>
     </w:p>
@@ -15448,12 +15707,14 @@
         <w:fldChar w:fldCharType="end"/>
       </w:r>
       <w:r>
-        <w:rPr>
-          <w:rStyle w:val="NumeroRotulo"/>
-        </w:rPr>
-        <w:t xml:space="preserve">. </w:t>
-      </w:r>
-      <w:r>
+        <w:br w:type="textWrapping"/>
+      </w:r>
+      <w:r>
+        <w:rPr>
+          <w:rFonts/>
+          <w:i w:val="true"/>
+          <w:strike w:val="false"/>
+        </w:rPr>
         <w:t xml:space="preserve">Conocer la misión frente a saber dónde consultarla, por público</w:t>
       </w:r>
     </w:p>
@@ -15469,7 +15730,7 @@
         </w:pBdr>
         <w:spacing w:after="0" w:before="0" w:line="240"/>
         <w:ind w:left="0" w:right="0" w:firstLine="0" w:firstLineChars="0"/>
-        <w:jc w:val="left"/>
+        <w:jc w:val="center"/>
       </w:pPr>
       <w:r>
         <w:rPr/>
@@ -15517,6 +15778,14 @@
         <w:pStyle w:val="BaseFuente"/>
       </w:pPr>
       <w:r>
+        <w:rPr>
+          <w:rFonts/>
+          <w:i w:val="true"/>
+          <w:strike w:val="false"/>
+        </w:rPr>
+        <w:t xml:space="preserve">Nota. </w:t>
+      </w:r>
+      <w:r>
         <w:t xml:space="preserve">Base: 52 docentes, 172 estudiantes, 178 egresados, 15 administrativos. Fuente: PULSO PUCP 2026.</w:t>
       </w:r>
     </w:p>
@@ -15597,12 +15866,14 @@
         <w:fldChar w:fldCharType="end"/>
       </w:r>
       <w:r>
-        <w:rPr>
-          <w:rStyle w:val="NumeroRotulo"/>
-        </w:rPr>
-        <w:t xml:space="preserve">. </w:t>
-      </w:r>
-      <w:r>
+        <w:br w:type="textWrapping"/>
+      </w:r>
+      <w:r>
+        <w:rPr>
+          <w:rFonts/>
+          <w:i w:val="true"/>
+          <w:strike w:val="false"/>
+        </w:rPr>
         <w:t xml:space="preserve">Top Two Box de la tutoría académica en cuatro procesos de acreditación</w:t>
       </w:r>
     </w:p>
@@ -15618,7 +15889,7 @@
         </w:pBdr>
         <w:spacing w:after="0" w:before="0" w:line="240"/>
         <w:ind w:left="0" w:right="0" w:firstLine="0" w:firstLineChars="0"/>
-        <w:jc w:val="left"/>
+        <w:jc w:val="center"/>
       </w:pPr>
       <w:r>
         <w:rPr/>
@@ -15666,6 +15937,14 @@
         <w:pStyle w:val="BaseFuente"/>
       </w:pPr>
       <w:r>
+        <w:rPr>
+          <w:rFonts/>
+          <w:i w:val="true"/>
+          <w:strike w:val="false"/>
+        </w:rPr>
+        <w:t xml:space="preserve">Nota. </w:t>
+      </w:r>
+      <w:r>
         <w:t xml:space="preserve">Base: 46, 49, 51 y 52 docentes. 702, 845, 1,102 y 1,234 estudiantes. Fuente: PULSO PUCP 2026.</w:t>
       </w:r>
     </w:p>
@@ -15746,12 +16025,14 @@
         <w:fldChar w:fldCharType="end"/>
       </w:r>
       <w:r>
-        <w:rPr>
-          <w:rStyle w:val="NumeroRotulo"/>
-        </w:rPr>
-        <w:t xml:space="preserve">. </w:t>
-      </w:r>
-      <w:r>
+        <w:br w:type="textWrapping"/>
+      </w:r>
+      <w:r>
+        <w:rPr>
+          <w:rFonts/>
+          <w:i w:val="true"/>
+          <w:strike w:val="false"/>
+        </w:rPr>
         <w:t xml:space="preserve">Top Two Box de las competencias por dimensión y grupo, estudiantes</w:t>
       </w:r>
     </w:p>
@@ -15767,7 +16048,7 @@
         </w:pBdr>
         <w:spacing w:after="0" w:before="0" w:line="240"/>
         <w:ind w:left="0" w:right="0" w:firstLine="0" w:firstLineChars="0"/>
-        <w:jc w:val="left"/>
+        <w:jc w:val="center"/>
       </w:pPr>
       <w:r>
         <w:rPr/>
@@ -15815,6 +16096,14 @@
         <w:pStyle w:val="BaseFuente"/>
       </w:pPr>
       <w:r>
+        <w:rPr>
+          <w:rFonts/>
+          <w:i w:val="true"/>
+          <w:strike w:val="false"/>
+        </w:rPr>
+        <w:t xml:space="preserve">Nota. </w:t>
+      </w:r>
+      <w:r>
         <w:t xml:space="preserve">Base: 109 estudiantes. Las columnas de Quinto a Décimo son los ciclos. El tono va de 80% (claro) a 100% (oscuro). Fuente: PULSO PUCP 2026.</w:t>
       </w:r>
     </w:p>
@@ -15895,12 +16184,14 @@
         <w:fldChar w:fldCharType="end"/>
       </w:r>
       <w:r>
-        <w:rPr>
-          <w:rStyle w:val="NumeroRotulo"/>
-        </w:rPr>
-        <w:t xml:space="preserve">. </w:t>
-      </w:r>
-      <w:r>
+        <w:br w:type="textWrapping"/>
+      </w:r>
+      <w:r>
+        <w:rPr>
+          <w:rFonts/>
+          <w:i w:val="true"/>
+          <w:strike w:val="false"/>
+        </w:rPr>
         <w:t xml:space="preserve">Índice de cada dimensión por sexo, estudiantes</w:t>
       </w:r>
     </w:p>
@@ -15916,7 +16207,7 @@
         </w:pBdr>
         <w:spacing w:after="0" w:before="0" w:line="240"/>
         <w:ind w:left="0" w:right="0" w:firstLine="0" w:firstLineChars="0"/>
-        <w:jc w:val="left"/>
+        <w:jc w:val="center"/>
       </w:pPr>
       <w:r>
         <w:rPr/>
@@ -15964,6 +16255,14 @@
         <w:pStyle w:val="BaseFuente"/>
       </w:pPr>
       <w:r>
+        <w:rPr>
+          <w:rFonts/>
+          <w:i w:val="true"/>
+          <w:strike w:val="false"/>
+        </w:rPr>
+        <w:t xml:space="preserve">Nota. </w:t>
+      </w:r>
+      <w:r>
         <w:t xml:space="preserve">Base: 89 estudiantes hombres y 83 mujeres. Fuente: PULSO PUCP 2026.</w:t>
       </w:r>
     </w:p>
@@ -16044,12 +16343,14 @@
         <w:fldChar w:fldCharType="end"/>
       </w:r>
       <w:r>
-        <w:rPr>
-          <w:rStyle w:val="NumeroRotulo"/>
-        </w:rPr>
-        <w:t xml:space="preserve">. </w:t>
-      </w:r>
-      <w:r>
+        <w:br w:type="textWrapping"/>
+      </w:r>
+      <w:r>
+        <w:rPr>
+          <w:rFonts/>
+          <w:i w:val="true"/>
+          <w:strike w:val="false"/>
+        </w:rPr>
         <w:t xml:space="preserve">Top Two Box de las competencias del perfil de egreso, por actor</w:t>
       </w:r>
     </w:p>
@@ -16065,7 +16366,7 @@
         </w:pBdr>
         <w:spacing w:after="0" w:before="0" w:line="240"/>
         <w:ind w:left="0" w:right="0" w:firstLine="0" w:firstLineChars="0"/>
-        <w:jc w:val="left"/>
+        <w:jc w:val="center"/>
       </w:pPr>
       <w:r>
         <w:rPr/>
@@ -16113,6 +16414,14 @@
         <w:pStyle w:val="BaseFuente"/>
       </w:pPr>
       <w:r>
+        <w:rPr>
+          <w:rFonts/>
+          <w:i w:val="true"/>
+          <w:strike w:val="false"/>
+        </w:rPr>
+        <w:t xml:space="preserve">Nota. </w:t>
+      </w:r>
+      <w:r>
         <w:t xml:space="preserve">Base: 51 docentes, 109 estudiantes y 161 egresados. Fuente: PULSO PUCP 2026.</w:t>
       </w:r>
     </w:p>
@@ -16193,12 +16502,14 @@
         <w:fldChar w:fldCharType="end"/>
       </w:r>
       <w:r>
-        <w:rPr>
-          <w:rStyle w:val="NumeroRotulo"/>
-        </w:rPr>
-        <w:t xml:space="preserve">. </w:t>
-      </w:r>
-      <w:r>
+        <w:br w:type="textWrapping"/>
+      </w:r>
+      <w:r>
+        <w:rPr>
+          <w:rFonts/>
+          <w:i w:val="true"/>
+          <w:strike w:val="false"/>
+        </w:rPr>
         <w:t xml:space="preserve">Peso de cada aspecto en la satisfacción con la atención</w:t>
       </w:r>
     </w:p>
@@ -16214,7 +16525,7 @@
         </w:pBdr>
         <w:spacing w:after="0" w:before="0" w:line="240"/>
         <w:ind w:left="0" w:right="0" w:firstLine="0" w:firstLineChars="0"/>
-        <w:jc w:val="left"/>
+        <w:jc w:val="center"/>
       </w:pPr>
       <w:r>
         <w:rPr/>
@@ -16262,6 +16573,14 @@
         <w:pStyle w:val="BaseFuente"/>
       </w:pPr>
       <w:r>
+        <w:rPr>
+          <w:rFonts/>
+          <w:i w:val="true"/>
+          <w:strike w:val="false"/>
+        </w:rPr>
+        <w:t xml:space="preserve">Nota. </w:t>
+      </w:r>
+      <w:r>
         <w:t xml:space="preserve">Base: 224 usuarios. Cifras ficticias. Peso estimado con una regresión lineal. Fuente: PULSO PUCP 2026.</w:t>
       </w:r>
     </w:p>
@@ -16342,12 +16661,14 @@
         <w:fldChar w:fldCharType="end"/>
       </w:r>
       <w:r>
-        <w:rPr>
-          <w:rStyle w:val="NumeroRotulo"/>
-        </w:rPr>
-        <w:t xml:space="preserve">. </w:t>
-      </w:r>
-      <w:r>
+        <w:br w:type="textWrapping"/>
+      </w:r>
+      <w:r>
+        <w:rPr>
+          <w:rFonts/>
+          <w:i w:val="true"/>
+          <w:strike w:val="false"/>
+        </w:rPr>
         <w:t xml:space="preserve">Entidades que reconocieron la labor docente, por año</w:t>
       </w:r>
     </w:p>
@@ -16363,7 +16684,7 @@
         </w:pBdr>
         <w:spacing w:after="0" w:before="0" w:line="240"/>
         <w:ind w:left="0" w:right="0" w:firstLine="0" w:firstLineChars="0"/>
-        <w:jc w:val="left"/>
+        <w:jc w:val="center"/>
       </w:pPr>
       <w:r>
         <w:rPr/>
@@ -16411,6 +16732,14 @@
         <w:pStyle w:val="BaseFuente"/>
       </w:pPr>
       <w:r>
+        <w:rPr>
+          <w:rFonts/>
+          <w:i w:val="true"/>
+          <w:strike w:val="false"/>
+        </w:rPr>
+        <w:t xml:space="preserve">Nota. </w:t>
+      </w:r>
+      <w:r>
         <w:t xml:space="preserve">Base: 26 docentes que respondieron «Sí». Un docente puede declarar varias. Fuente: PULSO PUCP 2026.</w:t>
       </w:r>
     </w:p>
@@ -16491,12 +16820,14 @@
         <w:fldChar w:fldCharType="end"/>
       </w:r>
       <w:r>
-        <w:rPr>
-          <w:rStyle w:val="NumeroRotulo"/>
-        </w:rPr>
-        <w:t xml:space="preserve">. </w:t>
-      </w:r>
-      <w:r>
+        <w:br w:type="textWrapping"/>
+      </w:r>
+      <w:r>
+        <w:rPr>
+          <w:rFonts/>
+          <w:i w:val="true"/>
+          <w:strike w:val="false"/>
+        </w:rPr>
         <w:t xml:space="preserve">Indicadores de la asistencia en efectivo frente a su meta</w:t>
       </w:r>
     </w:p>
@@ -16512,7 +16843,7 @@
         </w:pBdr>
         <w:spacing w:after="0" w:before="0" w:line="240"/>
         <w:ind w:left="0" w:right="0" w:firstLine="0" w:firstLineChars="0"/>
-        <w:jc w:val="left"/>
+        <w:jc w:val="center"/>
       </w:pPr>
       <w:r>
         <w:rPr/>
@@ -16560,6 +16891,14 @@
         <w:pStyle w:val="BaseFuente"/>
       </w:pPr>
       <w:r>
+        <w:rPr>
+          <w:rFonts/>
+          <w:i w:val="true"/>
+          <w:strike w:val="false"/>
+        </w:rPr>
+        <w:t xml:space="preserve">Nota. </w:t>
+      </w:r>
+      <w:r>
         <w:t xml:space="preserve">La línea coral marca la meta. N = 2,296 hogares. Cifras ficticias. Fuente: PULSO PUCP 2026.</w:t>
       </w:r>
     </w:p>
@@ -16640,12 +16979,14 @@
         <w:fldChar w:fldCharType="end"/>
       </w:r>
       <w:r>
-        <w:rPr>
-          <w:rStyle w:val="NumeroRotulo"/>
-        </w:rPr>
-        <w:t xml:space="preserve">. </w:t>
-      </w:r>
-      <w:r>
+        <w:br w:type="textWrapping"/>
+      </w:r>
+      <w:r>
+        <w:rPr>
+          <w:rFonts/>
+          <w:i w:val="true"/>
+          <w:strike w:val="false"/>
+        </w:rPr>
         <w:t xml:space="preserve">Palabras más mencionadas por los egresados sobre lo que cambiarían en la carrera</w:t>
       </w:r>
     </w:p>
@@ -16661,7 +17002,7 @@
         </w:pBdr>
         <w:spacing w:after="0" w:before="0" w:line="240"/>
         <w:ind w:left="0" w:right="0" w:firstLine="0" w:firstLineChars="0"/>
-        <w:jc w:val="left"/>
+        <w:jc w:val="center"/>
       </w:pPr>
       <w:r>
         <w:rPr/>
@@ -16709,6 +17050,14 @@
         <w:pStyle w:val="BaseFuente"/>
       </w:pPr>
       <w:r>
+        <w:rPr>
+          <w:rFonts/>
+          <w:i w:val="true"/>
+          <w:strike w:val="false"/>
+        </w:rPr>
+        <w:t xml:space="preserve">Nota. </w:t>
+      </w:r>
+      <w:r>
         <w:t xml:space="preserve">Base: 131 egresados que respondieron la pregunta abierta. Fuente: PULSO PUCP 2026.</w:t>
       </w:r>
     </w:p>
@@ -16789,12 +17138,14 @@
         <w:fldChar w:fldCharType="end"/>
       </w:r>
       <w:r>
-        <w:rPr>
-          <w:rStyle w:val="NumeroRotulo"/>
-        </w:rPr>
-        <w:t xml:space="preserve">. </w:t>
-      </w:r>
-      <w:r>
+        <w:br w:type="textWrapping"/>
+      </w:r>
+      <w:r>
+        <w:rPr>
+          <w:rFonts/>
+          <w:i w:val="true"/>
+          <w:strike w:val="false"/>
+        </w:rPr>
         <w:t xml:space="preserve">Satisfechos o muy satisfechos con el servicio, por distrito</w:t>
       </w:r>
     </w:p>
@@ -16810,7 +17161,7 @@
         </w:pBdr>
         <w:spacing w:after="0" w:before="0" w:line="240"/>
         <w:ind w:left="0" w:right="0" w:firstLine="0" w:firstLineChars="0"/>
-        <w:jc w:val="left"/>
+        <w:jc w:val="center"/>
       </w:pPr>
       <w:r>
         <w:rPr/>
@@ -16858,6 +17209,14 @@
         <w:pStyle w:val="BaseFuente"/>
       </w:pPr>
       <w:r>
+        <w:rPr>
+          <w:rFonts/>
+          <w:i w:val="true"/>
+          <w:strike w:val="false"/>
+        </w:rPr>
+        <w:t xml:space="preserve">Nota. </w:t>
+      </w:r>
+      <w:r>
         <w:t xml:space="preserve">Base: 1,184 personas en doce distritos. Cifras ficticias sobre la cartografía de Lima Metropolitana y Callao (IMP PlanMet 2040). Fuente: PULSO PUCP 2026.</w:t>
       </w:r>
     </w:p>
@@ -16938,12 +17297,14 @@
         <w:fldChar w:fldCharType="end"/>
       </w:r>
       <w:r>
-        <w:rPr>
-          <w:rStyle w:val="NumeroRotulo"/>
-        </w:rPr>
-        <w:t xml:space="preserve">. </w:t>
-      </w:r>
-      <w:r>
+        <w:br w:type="textWrapping"/>
+      </w:r>
+      <w:r>
+        <w:rPr>
+          <w:rFonts/>
+          <w:i w:val="true"/>
+          <w:strike w:val="false"/>
+        </w:rPr>
         <w:t xml:space="preserve">Encuestas logradas por zona en Comas</w:t>
       </w:r>
     </w:p>
@@ -16959,7 +17320,7 @@
         </w:pBdr>
         <w:spacing w:after="0" w:before="0" w:line="240"/>
         <w:ind w:left="0" w:right="0" w:firstLine="0" w:firstLineChars="0"/>
-        <w:jc w:val="left"/>
+        <w:jc w:val="center"/>
       </w:pPr>
       <w:r>
         <w:rPr/>
@@ -17007,6 +17368,14 @@
         <w:pStyle w:val="BaseFuente"/>
       </w:pPr>
       <w:r>
+        <w:rPr>
+          <w:rFonts/>
+          <w:i w:val="true"/>
+          <w:strike w:val="false"/>
+        </w:rPr>
+        <w:t xml:space="preserve">Nota. </w:t>
+      </w:r>
+      <w:r>
         <w:t xml:space="preserve">Base: 110 encuestas en 18 de 76 zonas. Cifras ficticias sobre las zonas censales INEI 2017. Fuente: PULSO PUCP 2026.</w:t>
       </w:r>
     </w:p>
@@ -17172,12 +17541,14 @@
         <w:fldChar w:fldCharType="end"/>
       </w:r>
       <w:r>
-        <w:rPr>
-          <w:rStyle w:val="NumeroRotulo"/>
-        </w:rPr>
-        <w:t xml:space="preserve">. </w:t>
-      </w:r>
-      <w:r>
+        <w:br w:type="textWrapping"/>
+      </w:r>
+      <w:r>
+        <w:rPr>
+          <w:rFonts/>
+          <w:i w:val="true"/>
+          <w:strike w:val="false"/>
+        </w:rPr>
         <w:t xml:space="preserve">La carrera cuenta con un cuerpo académico suficiente en número, dedicación y calificaciones</w:t>
       </w:r>
     </w:p>
@@ -17193,7 +17564,7 @@
         </w:pBdr>
         <w:spacing w:after="0" w:before="0" w:line="240"/>
         <w:ind w:left="0" w:right="0" w:firstLine="0" w:firstLineChars="0"/>
-        <w:jc w:val="left"/>
+        <w:jc w:val="center"/>
       </w:pPr>
       <w:r>
         <w:rPr/>
@@ -17241,6 +17612,14 @@
         <w:pStyle w:val="BaseFuente"/>
       </w:pPr>
       <w:r>
+        <w:rPr>
+          <w:rFonts/>
+          <w:i w:val="true"/>
+          <w:strike w:val="false"/>
+        </w:rPr>
+        <w:t xml:space="preserve">Nota. </w:t>
+      </w:r>
+      <w:r>
         <w:t xml:space="preserve">Base: 39 estudiantes, 67 egresados, 18 docentes, 12 autoridades, 17 administrativos y 26 empleadores. Fuente: PULSO PUCP 2026.</w:t>
       </w:r>
     </w:p>
@@ -17321,12 +17700,14 @@
         <w:fldChar w:fldCharType="end"/>
       </w:r>
       <w:r>
-        <w:rPr>
-          <w:rStyle w:val="NumeroRotulo"/>
-        </w:rPr>
-        <w:t xml:space="preserve">. </w:t>
-      </w:r>
-      <w:r>
+        <w:br w:type="textWrapping"/>
+      </w:r>
+      <w:r>
+        <w:rPr>
+          <w:rFonts/>
+          <w:i w:val="true"/>
+          <w:strike w:val="false"/>
+        </w:rPr>
         <w:t xml:space="preserve">La Unidad cuenta con servicios de tutoría académica</w:t>
       </w:r>
     </w:p>
@@ -17342,7 +17723,7 @@
         </w:pBdr>
         <w:spacing w:after="0" w:before="0" w:line="240"/>
         <w:ind w:left="0" w:right="0" w:firstLine="0" w:firstLineChars="0"/>
-        <w:jc w:val="left"/>
+        <w:jc w:val="center"/>
       </w:pPr>
       <w:r>
         <w:rPr/>
@@ -17390,6 +17771,14 @@
         <w:pStyle w:val="BaseFuente"/>
       </w:pPr>
       <w:r>
+        <w:rPr>
+          <w:rFonts/>
+          <w:i w:val="true"/>
+          <w:strike w:val="false"/>
+        </w:rPr>
+        <w:t xml:space="preserve">Nota. </w:t>
+      </w:r>
+      <w:r>
         <w:t xml:space="preserve">Base: 224: 52 docentes y 172 estudiantes. Fuente: PULSO PUCP 2026.</w:t>
       </w:r>
     </w:p>
@@ -17470,12 +17859,14 @@
         <w:fldChar w:fldCharType="end"/>
       </w:r>
       <w:r>
-        <w:rPr>
-          <w:rStyle w:val="NumeroRotulo"/>
-        </w:rPr>
-        <w:t xml:space="preserve">. </w:t>
-      </w:r>
-      <w:r>
+        <w:br w:type="textWrapping"/>
+      </w:r>
+      <w:r>
+        <w:rPr>
+          <w:rFonts/>
+          <w:i w:val="true"/>
+          <w:strike w:val="false"/>
+        </w:rPr>
         <w:t xml:space="preserve">¿Ha participado en programas de intercambio?</w:t>
       </w:r>
     </w:p>
@@ -17491,7 +17882,7 @@
         </w:pBdr>
         <w:spacing w:after="0" w:before="0" w:line="240"/>
         <w:ind w:left="0" w:right="0" w:firstLine="0" w:firstLineChars="0"/>
-        <w:jc w:val="left"/>
+        <w:jc w:val="center"/>
       </w:pPr>
       <w:r>
         <w:rPr/>
@@ -17539,6 +17930,14 @@
         <w:pStyle w:val="BaseFuente"/>
       </w:pPr>
       <w:r>
+        <w:rPr>
+          <w:rFonts/>
+          <w:i w:val="true"/>
+          <w:strike w:val="false"/>
+        </w:rPr>
+        <w:t xml:space="preserve">Nota. </w:t>
+      </w:r>
+      <w:r>
         <w:t xml:space="preserve">Base: 201 estudiantes. Fuente: PULSO PUCP 2026.</w:t>
       </w:r>
     </w:p>
@@ -17583,12 +17982,14 @@
         <w:fldChar w:fldCharType="end"/>
       </w:r>
       <w:r>
-        <w:rPr>
-          <w:rStyle w:val="NumeroRotulo"/>
-        </w:rPr>
-        <w:t xml:space="preserve">. </w:t>
-      </w:r>
-      <w:r>
+        <w:br w:type="textWrapping"/>
+      </w:r>
+      <w:r>
+        <w:rPr>
+          <w:rFonts/>
+          <w:i w:val="true"/>
+          <w:strike w:val="false"/>
+        </w:rPr>
         <w:t xml:space="preserve">Los programas de intercambio fortalecen mis competencias</w:t>
       </w:r>
     </w:p>
@@ -17604,7 +18005,7 @@
         </w:pBdr>
         <w:spacing w:after="0" w:before="0" w:line="240"/>
         <w:ind w:left="0" w:right="0" w:firstLine="0" w:firstLineChars="0"/>
-        <w:jc w:val="left"/>
+        <w:jc w:val="center"/>
       </w:pPr>
       <w:r>
         <w:rPr/>
@@ -17652,6 +18053,14 @@
         <w:pStyle w:val="BaseFuente"/>
       </w:pPr>
       <w:r>
+        <w:rPr>
+          <w:rFonts/>
+          <w:i w:val="true"/>
+          <w:strike w:val="false"/>
+        </w:rPr>
+        <w:t xml:space="preserve">Nota. </w:t>
+      </w:r>
+      <w:r>
         <w:t xml:space="preserve">Base: 20 estudiantes que respondieron «Sí» en la pregunta anterior. Fuente: PULSO PUCP 2026.</w:t>
       </w:r>
     </w:p>
@@ -17732,12 +18141,14 @@
         <w:fldChar w:fldCharType="end"/>
       </w:r>
       <w:r>
-        <w:rPr>
-          <w:rStyle w:val="NumeroRotulo"/>
-        </w:rPr>
-        <w:t xml:space="preserve">. </w:t>
-      </w:r>
-      <w:r>
+        <w:br w:type="textWrapping"/>
+      </w:r>
+      <w:r>
+        <w:rPr>
+          <w:rFonts/>
+          <w:i w:val="true"/>
+          <w:strike w:val="false"/>
+        </w:rPr>
         <w:t xml:space="preserve">Cargo de las autoridades</w:t>
       </w:r>
     </w:p>
@@ -17753,7 +18164,7 @@
         </w:pBdr>
         <w:spacing w:after="0" w:before="0" w:line="240"/>
         <w:ind w:left="0" w:right="0" w:firstLine="0" w:firstLineChars="0"/>
-        <w:jc w:val="left"/>
+        <w:jc w:val="center"/>
       </w:pPr>
       <w:r>
         <w:rPr/>
@@ -17801,6 +18212,14 @@
         <w:pStyle w:val="BaseFuente"/>
       </w:pPr>
       <w:r>
+        <w:rPr>
+          <w:rFonts/>
+          <w:i w:val="true"/>
+          <w:strike w:val="false"/>
+        </w:rPr>
+        <w:t xml:space="preserve">Nota. </w:t>
+      </w:r>
+      <w:r>
         <w:t xml:space="preserve">Base: 12 autoridades. Con menos de 30 casos se lee la frecuencia entre paréntesis. Fuente: PULSO PUCP 2026.</w:t>
       </w:r>
     </w:p>
@@ -17881,12 +18300,14 @@
         <w:fldChar w:fldCharType="end"/>
       </w:r>
       <w:r>
-        <w:rPr>
-          <w:rStyle w:val="NumeroRotulo"/>
-        </w:rPr>
-        <w:t xml:space="preserve">. </w:t>
-      </w:r>
-      <w:r>
+        <w:br w:type="textWrapping"/>
+      </w:r>
+      <w:r>
+        <w:rPr>
+          <w:rFonts/>
+          <w:i w:val="true"/>
+          <w:strike w:val="false"/>
+        </w:rPr>
         <w:t xml:space="preserve">Satisfacción con el servicio médico de la universidad</w:t>
       </w:r>
     </w:p>
@@ -17902,7 +18323,7 @@
         </w:pBdr>
         <w:spacing w:after="0" w:before="0" w:line="240"/>
         <w:ind w:left="0" w:right="0" w:firstLine="0" w:firstLineChars="0"/>
-        <w:jc w:val="left"/>
+        <w:jc w:val="center"/>
       </w:pPr>
       <w:r>
         <w:rPr/>
@@ -17950,6 +18371,14 @@
         <w:pStyle w:val="BaseFuente"/>
       </w:pPr>
       <w:r>
+        <w:rPr>
+          <w:rFonts/>
+          <w:i w:val="true"/>
+          <w:strike w:val="false"/>
+        </w:rPr>
+        <w:t xml:space="preserve">Nota. </w:t>
+      </w:r>
+      <w:r>
         <w:t xml:space="preserve">Base: 201 estudiantes, 92 docentes y 25 administrativos. Fuente: PULSO PUCP 2026.</w:t>
       </w:r>
     </w:p>
@@ -18030,12 +18459,14 @@
         <w:fldChar w:fldCharType="end"/>
       </w:r>
       <w:r>
-        <w:rPr>
-          <w:rStyle w:val="NumeroRotulo"/>
-        </w:rPr>
-        <w:t xml:space="preserve">. </w:t>
-      </w:r>
-      <w:r>
+        <w:br w:type="textWrapping"/>
+      </w:r>
+      <w:r>
+        <w:rPr>
+          <w:rFonts/>
+          <w:i w:val="true"/>
+          <w:strike w:val="false"/>
+        </w:rPr>
         <w:t xml:space="preserve">¿Conoce el servicio de bienestar psicológico?</w:t>
       </w:r>
     </w:p>
@@ -18051,7 +18482,7 @@
         </w:pBdr>
         <w:spacing w:after="0" w:before="0" w:line="240"/>
         <w:ind w:left="0" w:right="0" w:firstLine="0" w:firstLineChars="0"/>
-        <w:jc w:val="left"/>
+        <w:jc w:val="center"/>
       </w:pPr>
       <w:r>
         <w:rPr/>
@@ -18099,6 +18530,14 @@
         <w:pStyle w:val="BaseFuente"/>
       </w:pPr>
       <w:r>
+        <w:rPr>
+          <w:rFonts/>
+          <w:i w:val="true"/>
+          <w:strike w:val="false"/>
+        </w:rPr>
+        <w:t xml:space="preserve">Nota. </w:t>
+      </w:r>
+      <w:r>
         <w:t xml:space="preserve">Base: 1,234 estudiantes, 148 docentes y 43 administrativos. Fuente: PULSO PUCP 2026.</w:t>
       </w:r>
     </w:p>
@@ -18179,12 +18618,14 @@
         <w:fldChar w:fldCharType="end"/>
       </w:r>
       <w:r>
-        <w:rPr>
-          <w:rStyle w:val="NumeroRotulo"/>
-        </w:rPr>
-        <w:t xml:space="preserve">. </w:t>
-      </w:r>
-      <w:r>
+        <w:br w:type="textWrapping"/>
+      </w:r>
+      <w:r>
+        <w:rPr>
+          <w:rFonts/>
+          <w:i w:val="true"/>
+          <w:strike w:val="false"/>
+        </w:rPr>
         <w:t xml:space="preserve">Me siento satisfecho con la formación recibida, estudiantes por etapa</w:t>
       </w:r>
     </w:p>
@@ -18200,7 +18641,7 @@
         </w:pBdr>
         <w:spacing w:after="0" w:before="0" w:line="240"/>
         <w:ind w:left="0" w:right="0" w:firstLine="0" w:firstLineChars="0"/>
-        <w:jc w:val="left"/>
+        <w:jc w:val="center"/>
       </w:pPr>
       <w:r>
         <w:rPr/>
@@ -18248,6 +18689,14 @@
         <w:pStyle w:val="BaseFuente"/>
       </w:pPr>
       <w:r>
+        <w:rPr>
+          <w:rFonts/>
+          <w:i w:val="true"/>
+          <w:strike w:val="false"/>
+        </w:rPr>
+        <w:t xml:space="preserve">Nota. </w:t>
+      </w:r>
+      <w:r>
         <w:t xml:space="preserve">Base: 1,234 estudiantes: 410 de primeros ciclos, 452 de ciclos intermedios y 372 de últimos ciclos. Fuente: PULSO PUCP 2026.</w:t>
       </w:r>
     </w:p>
@@ -18369,12 +18818,14 @@
         <w:fldChar w:fldCharType="end"/>
       </w:r>
       <w:r>
-        <w:rPr>
-          <w:rStyle w:val="NumeroRotulo"/>
-        </w:rPr>
-        <w:t xml:space="preserve">. </w:t>
-      </w:r>
-      <w:r>
+        <w:br w:type="textWrapping"/>
+      </w:r>
+      <w:r>
+        <w:rPr>
+          <w:rFonts/>
+          <w:i w:val="true"/>
+          <w:strike w:val="false"/>
+        </w:rPr>
         <w:t xml:space="preserve">Importancia de las prácticas preprofesionales en la formación</w:t>
       </w:r>
     </w:p>
@@ -18390,7 +18841,7 @@
         </w:pBdr>
         <w:spacing w:after="0" w:before="0" w:line="240"/>
         <w:ind w:left="0" w:right="0" w:firstLine="0" w:firstLineChars="0"/>
-        <w:jc w:val="left"/>
+        <w:jc w:val="center"/>
       </w:pPr>
       <w:r>
         <w:rPr/>
@@ -18438,6 +18889,14 @@
         <w:pStyle w:val="BaseFuente"/>
       </w:pPr>
       <w:r>
+        <w:rPr>
+          <w:rFonts/>
+          <w:i w:val="true"/>
+          <w:strike w:val="false"/>
+        </w:rPr>
+        <w:t xml:space="preserve">Nota. </w:t>
+      </w:r>
+      <w:r>
         <w:t xml:space="preserve">Base: 1,234 estudiantes, 314 egresados y 148 docentes. Fuente: PULSO PUCP 2026.</w:t>
       </w:r>
     </w:p>
@@ -18518,12 +18977,14 @@
         <w:fldChar w:fldCharType="end"/>
       </w:r>
       <w:r>
-        <w:rPr>
-          <w:rStyle w:val="NumeroRotulo"/>
-        </w:rPr>
-        <w:t xml:space="preserve">. </w:t>
-      </w:r>
-      <w:r>
+        <w:br w:type="textWrapping"/>
+      </w:r>
+      <w:r>
+        <w:rPr>
+          <w:rFonts/>
+          <w:i w:val="true"/>
+          <w:strike w:val="false"/>
+        </w:rPr>
         <w:t xml:space="preserve">Gestión institucional: afirmaciones extensas</w:t>
       </w:r>
     </w:p>
@@ -18539,7 +19000,7 @@
         </w:pBdr>
         <w:spacing w:after="0" w:before="0" w:line="240"/>
         <w:ind w:left="0" w:right="0" w:firstLine="0" w:firstLineChars="0"/>
-        <w:jc w:val="left"/>
+        <w:jc w:val="center"/>
       </w:pPr>
       <w:r>
         <w:rPr/>
@@ -18587,6 +19048,14 @@
         <w:pStyle w:val="BaseFuente"/>
       </w:pPr>
       <w:r>
+        <w:rPr>
+          <w:rFonts/>
+          <w:i w:val="true"/>
+          <w:strike w:val="false"/>
+        </w:rPr>
+        <w:t xml:space="preserve">Nota. </w:t>
+      </w:r>
+      <w:r>
         <w:t xml:space="preserve">Base: 148 docentes. Fuente: PULSO PUCP 2026.</w:t>
       </w:r>
     </w:p>
@@ -18667,12 +19136,14 @@
         <w:fldChar w:fldCharType="end"/>
       </w:r>
       <w:r>
-        <w:rPr>
-          <w:rStyle w:val="NumeroRotulo"/>
-        </w:rPr>
-        <w:t xml:space="preserve">. </w:t>
-      </w:r>
-      <w:r>
+        <w:br w:type="textWrapping"/>
+      </w:r>
+      <w:r>
+        <w:rPr>
+          <w:rFonts/>
+          <w:i w:val="true"/>
+          <w:strike w:val="false"/>
+        </w:rPr>
         <w:t xml:space="preserve">El plan de estudios responde a las demandas del mercado laboral</w:t>
       </w:r>
     </w:p>
@@ -18688,7 +19159,7 @@
         </w:pBdr>
         <w:spacing w:after="0" w:before="0" w:line="240"/>
         <w:ind w:left="0" w:right="0" w:firstLine="0" w:firstLineChars="0"/>
-        <w:jc w:val="left"/>
+        <w:jc w:val="center"/>
       </w:pPr>
       <w:r>
         <w:rPr/>
@@ -18736,6 +19207,14 @@
         <w:pStyle w:val="BaseFuente"/>
       </w:pPr>
       <w:r>
+        <w:rPr>
+          <w:rFonts/>
+          <w:i w:val="true"/>
+          <w:strike w:val="false"/>
+        </w:rPr>
+        <w:t xml:space="preserve">Nota. </w:t>
+      </w:r>
+      <w:r>
         <w:t xml:space="preserve">Base: 1,234 estudiantes, 314 egresados y 148 docentes. Fuente: PULSO PUCP 2026.</w:t>
       </w:r>
     </w:p>
@@ -18816,12 +19295,14 @@
         <w:fldChar w:fldCharType="end"/>
       </w:r>
       <w:r>
-        <w:rPr>
-          <w:rStyle w:val="NumeroRotulo"/>
-        </w:rPr>
-        <w:t xml:space="preserve">. </w:t>
-      </w:r>
-      <w:r>
+        <w:br w:type="textWrapping"/>
+      </w:r>
+      <w:r>
+        <w:rPr>
+          <w:rFonts/>
+          <w:i w:val="true"/>
+          <w:strike w:val="false"/>
+        </w:rPr>
         <w:t xml:space="preserve">Top Two Box de los estudiantes en indicadores repetidos, 2026 frente a 2021</w:t>
       </w:r>
     </w:p>
@@ -18837,7 +19318,7 @@
         </w:pBdr>
         <w:spacing w:after="0" w:before="0" w:line="240"/>
         <w:ind w:left="0" w:right="0" w:firstLine="0" w:firstLineChars="0"/>
-        <w:jc w:val="left"/>
+        <w:jc w:val="center"/>
       </w:pPr>
       <w:r>
         <w:rPr/>
@@ -18885,6 +19366,14 @@
         <w:pStyle w:val="BaseFuente"/>
       </w:pPr>
       <w:r>
+        <w:rPr>
+          <w:rFonts/>
+          <w:i w:val="true"/>
+          <w:strike w:val="false"/>
+        </w:rPr>
+        <w:t xml:space="preserve">Nota. </w:t>
+      </w:r>
+      <w:r>
         <w:t xml:space="preserve">Base: 1,234 estudiantes en 2026 y 1,102 en 2021. 2021: informe consolidado anterior. Fuente: PULSO PUCP 2026.</w:t>
       </w:r>
     </w:p>
@@ -18962,7 +19451,7 @@
           <w:szCs w:val="21"/>
           <w:color w:val="5A6480"/>
         </w:rPr>
-        <w:t xml:space="preserve">La tabla da la cifra de cada público y, al lado, las letras de los públicos frente a los que es significativamente mayor. El gráfico muestra las mismas letras junto a la barra.</w:t>
+        <w:t xml:space="preserve">La tabla da la cifra de cada público y, al lado, las letras de los públicos frente a los que es significativamente mayor. El gráfico muestra las mismas letras junto a la barra. La diferencia se juzga con la prueba y no a simple vista, porque comparar barras o intervalos por separado lleva a conclusiones erradas (Cumming y Finch, 2005).</w:t>
       </w:r>
     </w:p>
     <w:p>
@@ -19006,12 +19495,14 @@
         <w:fldChar w:fldCharType="end"/>
       </w:r>
       <w:r>
-        <w:rPr>
-          <w:rStyle w:val="NumeroRotulo"/>
-        </w:rPr>
-        <w:t xml:space="preserve">. </w:t>
-      </w:r>
-      <w:r>
+        <w:br w:type="textWrapping"/>
+      </w:r>
+      <w:r>
+        <w:rPr>
+          <w:rFonts/>
+          <w:i w:val="true"/>
+          <w:strike w:val="false"/>
+        </w:rPr>
         <w:t xml:space="preserve">Conoce la misión, por público, con diferencias significativas</w:t>
       </w:r>
     </w:p>
@@ -20159,7 +20650,15 @@
         <w:pStyle w:val="BaseFuente"/>
       </w:pPr>
       <w:r>
-        <w:t xml:space="preserve">Base: 52 docentes, 172 estudiantes, 178 egresados, 15 administrativos. Prueba z para proporciones con corrección de Bonferroni dentro de la fila (α = 0.05). Fuente: PULSO PUCP 2026.</w:t>
+        <w:rPr>
+          <w:rFonts/>
+          <w:i w:val="true"/>
+          <w:strike w:val="false"/>
+        </w:rPr>
+        <w:t xml:space="preserve">Nota. </w:t>
+      </w:r>
+      <w:r>
+        <w:t xml:space="preserve">Base: 52 docentes, 172 estudiantes, 178 egresados, 15 administrativos. Prueba z para proporciones (Agresti, 2013) con corrección de Bonferroni dentro de la fila (Dunn, 1961), α = 0.05. Fuente: PULSO PUCP 2026.</w:t>
       </w:r>
     </w:p>
     <w:p>
@@ -20203,12 +20702,14 @@
         <w:fldChar w:fldCharType="end"/>
       </w:r>
       <w:r>
-        <w:rPr>
-          <w:rStyle w:val="NumeroRotulo"/>
-        </w:rPr>
-        <w:t xml:space="preserve">. </w:t>
-      </w:r>
-      <w:r>
+        <w:br w:type="textWrapping"/>
+      </w:r>
+      <w:r>
+        <w:rPr>
+          <w:rFonts/>
+          <w:i w:val="true"/>
+          <w:strike w:val="false"/>
+        </w:rPr>
         <w:t xml:space="preserve">¿Conoce la misión y los propósitos de la PUCP?, por público</w:t>
       </w:r>
     </w:p>
@@ -20224,7 +20725,7 @@
         </w:pBdr>
         <w:spacing w:after="0" w:before="0" w:line="240"/>
         <w:ind w:left="0" w:right="0" w:firstLine="0" w:firstLineChars="0"/>
-        <w:jc w:val="left"/>
+        <w:jc w:val="center"/>
       </w:pPr>
       <w:r>
         <w:rPr/>
@@ -20272,6 +20773,14 @@
         <w:pStyle w:val="BaseFuente"/>
       </w:pPr>
       <w:r>
+        <w:rPr>
+          <w:rFonts/>
+          <w:i w:val="true"/>
+          <w:strike w:val="false"/>
+        </w:rPr>
+        <w:t xml:space="preserve">Nota. </w:t>
+      </w:r>
+      <w:r>
         <w:t xml:space="preserve">Base: 52 docentes, 172 estudiantes, 178 egresados, 15 administrativos. Las letras indican frente a qué públicos la cifra es significativamente mayor. Fuente: PULSO PUCP 2026.</w:t>
       </w:r>
     </w:p>
@@ -20382,12 +20891,14 @@
         <w:fldChar w:fldCharType="end"/>
       </w:r>
       <w:r>
-        <w:rPr>
-          <w:rStyle w:val="NumeroRotulo"/>
-        </w:rPr>
-        <w:t xml:space="preserve">. </w:t>
-      </w:r>
-      <w:r>
+        <w:br w:type="textWrapping"/>
+      </w:r>
+      <w:r>
+        <w:rPr>
+          <w:rFonts/>
+          <w:i w:val="true"/>
+          <w:strike w:val="false"/>
+        </w:rPr>
         <w:t xml:space="preserve">Ejemplo de reparto del redondeo</w:t>
       </w:r>
     </w:p>
@@ -21760,6 +22271,14 @@
         <w:pStyle w:val="BaseFuente"/>
       </w:pPr>
       <w:r>
+        <w:rPr>
+          <w:rFonts/>
+          <w:i w:val="true"/>
+          <w:strike w:val="false"/>
+        </w:rPr>
+        <w:t xml:space="preserve">Nota. </w:t>
+      </w:r>
+      <w:r>
         <w:t xml:space="preserve">Base: ejemplo ficticio con 250 casos. El punto repartido va a «En desacuerdo», la categoría con mayor resto (0.4).</w:t>
       </w:r>
     </w:p>
@@ -21897,12 +22416,14 @@
         <w:fldChar w:fldCharType="end"/>
       </w:r>
       <w:r>
-        <w:rPr>
-          <w:rStyle w:val="NumeroRotulo"/>
-        </w:rPr>
-        <w:t xml:space="preserve">. </w:t>
-      </w:r>
-      <w:r>
+        <w:br w:type="textWrapping"/>
+      </w:r>
+      <w:r>
+        <w:rPr>
+          <w:rFonts/>
+          <w:i w:val="true"/>
+          <w:strike w:val="false"/>
+        </w:rPr>
         <w:t xml:space="preserve">Ficha técnica del estudio</w:t>
       </w:r>
     </w:p>
@@ -22613,6 +23134,14 @@
         <w:pStyle w:val="BaseFuente"/>
       </w:pPr>
       <w:r>
+        <w:rPr>
+          <w:rFonts/>
+          <w:i w:val="true"/>
+          <w:strike w:val="false"/>
+        </w:rPr>
+        <w:t xml:space="preserve">Nota. </w:t>
+      </w:r>
+      <w:r>
         <w:t xml:space="preserve">Fuente: PULSO PUCP 2026.</w:t>
       </w:r>
     </w:p>
@@ -22665,12 +23194,14 @@
         <w:fldChar w:fldCharType="end"/>
       </w:r>
       <w:r>
-        <w:rPr>
-          <w:rStyle w:val="NumeroRotulo"/>
-        </w:rPr>
-        <w:t xml:space="preserve">. </w:t>
-      </w:r>
-      <w:r>
+        <w:br w:type="textWrapping"/>
+      </w:r>
+      <w:r>
+        <w:rPr>
+          <w:rFonts/>
+          <w:i w:val="true"/>
+          <w:strike w:val="false"/>
+        </w:rPr>
         <w:t xml:space="preserve">Top Two Box de cada competencia, por actor</w:t>
       </w:r>
     </w:p>
@@ -24268,6 +24799,14 @@
         <w:pStyle w:val="BaseFuente"/>
       </w:pPr>
       <w:r>
+        <w:rPr>
+          <w:rFonts/>
+          <w:i w:val="true"/>
+          <w:strike w:val="false"/>
+        </w:rPr>
+        <w:t xml:space="preserve">Nota. </w:t>
+      </w:r>
+      <w:r>
         <w:t xml:space="preserve">Base: 51 docentes, 109 estudiantes y 161 egresados. Fuente: PULSO PUCP 2026.</w:t>
       </w:r>
     </w:p>
@@ -24291,7 +24830,7 @@
         </w:pBdr>
         <w:spacing w:after="160" w:before="0" w:line="312"/>
         <w:ind w:left="0" w:right="0" w:firstLine="0" w:firstLineChars="0"/>
-        <w:jc w:val="left"/>
+        <w:jc w:val="both"/>
       </w:pPr>
       <w:r>
         <w:rPr>
@@ -24348,12 +24887,14 @@
         <w:fldChar w:fldCharType="end"/>
       </w:r>
       <w:r>
-        <w:rPr>
-          <w:rStyle w:val="NumeroRotulo"/>
-        </w:rPr>
-        <w:t xml:space="preserve">. </w:t>
-      </w:r>
-      <w:r>
+        <w:br w:type="textWrapping"/>
+      </w:r>
+      <w:r>
+        <w:rPr>
+          <w:rFonts/>
+          <w:i w:val="true"/>
+          <w:strike w:val="false"/>
+        </w:rPr>
         <w:t xml:space="preserve">La Unidad cuenta con servicios de tutoría académica.</w:t>
       </w:r>
     </w:p>
@@ -26337,6 +26878,14 @@
         <w:pStyle w:val="BaseFuente"/>
       </w:pPr>
       <w:r>
+        <w:rPr>
+          <w:rFonts/>
+          <w:i w:val="true"/>
+          <w:strike w:val="false"/>
+        </w:rPr>
+        <w:t xml:space="preserve">Nota. </w:t>
+      </w:r>
+      <w:r>
         <w:t xml:space="preserve">Base: 52 docentes y 172 estudiantes. Fuente: PULSO PUCP 2026.</w:t>
       </w:r>
     </w:p>
@@ -26360,7 +26909,7 @@
         </w:pBdr>
         <w:spacing w:after="160" w:before="0" w:line="312"/>
         <w:ind w:left="0" w:right="0" w:firstLine="0" w:firstLineChars="0"/>
-        <w:jc w:val="left"/>
+        <w:jc w:val="both"/>
       </w:pPr>
       <w:r>
         <w:rPr>
@@ -26417,12 +26966,14 @@
         <w:fldChar w:fldCharType="end"/>
       </w:r>
       <w:r>
-        <w:rPr>
-          <w:rStyle w:val="NumeroRotulo"/>
-        </w:rPr>
-        <w:t xml:space="preserve">. </w:t>
-      </w:r>
-      <w:r>
+        <w:br w:type="textWrapping"/>
+      </w:r>
+      <w:r>
+        <w:rPr>
+          <w:rFonts/>
+          <w:i w:val="true"/>
+          <w:strike w:val="false"/>
+        </w:rPr>
         <w:t xml:space="preserve">Respuestas «Otros» a la pregunta ¿Cuál es su puesto actual?</w:t>
       </w:r>
     </w:p>
@@ -28126,6 +28677,14 @@
         <w:pStyle w:val="BaseFuente"/>
       </w:pPr>
       <w:r>
+        <w:rPr>
+          <w:rFonts/>
+          <w:i w:val="true"/>
+          <w:strike w:val="false"/>
+        </w:rPr>
+        <w:t xml:space="preserve">Nota. </w:t>
+      </w:r>
+      <w:r>
         <w:t xml:space="preserve">Base: 62 respuestas en «Otros». Fuente: PULSO PUCP 2026.</w:t>
       </w:r>
     </w:p>
@@ -28149,7 +28708,7 @@
         </w:pBdr>
         <w:spacing w:after="160" w:before="0" w:line="312"/>
         <w:ind w:left="0" w:right="0" w:firstLine="0" w:firstLineChars="0"/>
-        <w:jc w:val="left"/>
+        <w:jc w:val="both"/>
       </w:pPr>
       <w:r>
         <w:rPr>
@@ -28206,12 +28765,14 @@
         <w:fldChar w:fldCharType="end"/>
       </w:r>
       <w:r>
-        <w:rPr>
-          <w:rStyle w:val="NumeroRotulo"/>
-        </w:rPr>
-        <w:t xml:space="preserve">. </w:t>
-      </w:r>
-      <w:r>
+        <w:br w:type="textWrapping"/>
+      </w:r>
+      <w:r>
+        <w:rPr>
+          <w:rFonts/>
+          <w:i w:val="true"/>
+          <w:strike w:val="false"/>
+        </w:rPr>
         <w:t xml:space="preserve">Perfil de las autoridades consultadas</w:t>
       </w:r>
     </w:p>
@@ -30034,6 +30595,14 @@
         <w:pStyle w:val="BaseFuente"/>
       </w:pPr>
       <w:r>
+        <w:rPr>
+          <w:rFonts/>
+          <w:i w:val="true"/>
+          <w:strike w:val="false"/>
+        </w:rPr>
+        <w:t xml:space="preserve">Nota. </w:t>
+      </w:r>
+      <w:r>
         <w:t xml:space="preserve">Base: 12 autoridades. Fuente: PULSO PUCP 2026.</w:t>
       </w:r>
     </w:p>
@@ -30142,7 +30711,7 @@
         </w:pBdr>
         <w:spacing w:after="160" w:before="0" w:line="312"/>
         <w:ind w:left="0" w:right="0" w:firstLine="0" w:firstLineChars="0"/>
-        <w:jc w:val="left"/>
+        <w:jc w:val="both"/>
       </w:pPr>
       <w:r>
         <w:rPr>
@@ -30626,12 +31195,14 @@
         <w:fldChar w:fldCharType="end"/>
       </w:r>
       <w:r>
-        <w:rPr>
-          <w:rStyle w:val="NumeroRotulo"/>
-        </w:rPr>
-        <w:t xml:space="preserve">. </w:t>
-      </w:r>
-      <w:r>
+        <w:br w:type="textWrapping"/>
+      </w:r>
+      <w:r>
+        <w:rPr>
+          <w:rFonts/>
+          <w:i w:val="true"/>
+          <w:strike w:val="false"/>
+        </w:rPr>
         <w:t xml:space="preserve">¿Conoce la misión y los propósitos de la PUCP?</w:t>
       </w:r>
     </w:p>
@@ -30647,7 +31218,7 @@
         </w:pBdr>
         <w:spacing w:after="0" w:before="0" w:line="240"/>
         <w:ind w:left="0" w:right="0" w:firstLine="0" w:firstLineChars="0"/>
-        <w:jc w:val="left"/>
+        <w:jc w:val="center"/>
       </w:pPr>
       <w:r>
         <w:rPr/>
@@ -30695,6 +31266,14 @@
         <w:pStyle w:val="BaseFuente"/>
       </w:pPr>
       <w:r>
+        <w:rPr>
+          <w:rFonts/>
+          <w:i w:val="true"/>
+          <w:strike w:val="false"/>
+        </w:rPr>
+        <w:t xml:space="preserve">Nota. </w:t>
+      </w:r>
+      <w:r>
         <w:t xml:space="preserve">Base: 52 docentes, 172 estudiantes, 178 egresados y 15 administrativos. Fuente: PULSO PUCP 2026.</w:t>
       </w:r>
     </w:p>
@@ -30791,12 +31370,14 @@
         <w:fldChar w:fldCharType="end"/>
       </w:r>
       <w:r>
-        <w:rPr>
-          <w:rStyle w:val="NumeroRotulo"/>
-        </w:rPr>
-        <w:t xml:space="preserve">. </w:t>
-      </w:r>
-      <w:r>
+        <w:br w:type="textWrapping"/>
+      </w:r>
+      <w:r>
+        <w:rPr>
+          <w:rFonts/>
+          <w:i w:val="true"/>
+          <w:strike w:val="false"/>
+        </w:rPr>
         <w:t xml:space="preserve">El estatuto y las normas internas de la institución permiten que la Unidad se organice adecuadamente para el logro de sus propósitos.</w:t>
       </w:r>
     </w:p>
@@ -30812,7 +31393,7 @@
         </w:pBdr>
         <w:spacing w:after="0" w:before="0" w:line="240"/>
         <w:ind w:left="0" w:right="0" w:firstLine="0" w:firstLineChars="0"/>
-        <w:jc w:val="left"/>
+        <w:jc w:val="center"/>
       </w:pPr>
       <w:r>
         <w:rPr/>
@@ -30860,6 +31441,14 @@
         <w:pStyle w:val="BaseFuente"/>
       </w:pPr>
       <w:r>
+        <w:rPr>
+          <w:rFonts/>
+          <w:i w:val="true"/>
+          <w:strike w:val="false"/>
+        </w:rPr>
+        <w:t xml:space="preserve">Nota. </w:t>
+      </w:r>
+      <w:r>
         <w:t xml:space="preserve">Base: 52 docentes y 178 egresados. Fuente: PULSO PUCP 2026.</w:t>
       </w:r>
     </w:p>
@@ -30934,12 +31523,14 @@
         <w:fldChar w:fldCharType="end"/>
       </w:r>
       <w:r>
-        <w:rPr>
-          <w:rStyle w:val="NumeroRotulo"/>
-        </w:rPr>
-        <w:t xml:space="preserve">. </w:t>
-      </w:r>
-      <w:r>
+        <w:br w:type="textWrapping"/>
+      </w:r>
+      <w:r>
+        <w:rPr>
+          <w:rFonts/>
+          <w:i w:val="true"/>
+          <w:strike w:val="false"/>
+        </w:rPr>
         <w:t xml:space="preserve">Actualmente, ¿está usted trabajando? (considere por trabajo cualquier actividad remunerada de por lo menos medio tiempo de dedicación)</w:t>
       </w:r>
     </w:p>
@@ -30955,7 +31546,7 @@
         </w:pBdr>
         <w:spacing w:after="0" w:before="0" w:line="240"/>
         <w:ind w:left="0" w:right="0" w:firstLine="0" w:firstLineChars="0"/>
-        <w:jc w:val="left"/>
+        <w:jc w:val="center"/>
       </w:pPr>
       <w:r>
         <w:rPr/>
@@ -31003,6 +31594,14 @@
         <w:pStyle w:val="BaseFuente"/>
       </w:pPr>
       <w:r>
+        <w:rPr>
+          <w:rFonts/>
+          <w:i w:val="true"/>
+          <w:strike w:val="false"/>
+        </w:rPr>
+        <w:t xml:space="preserve">Nota. </w:t>
+      </w:r>
+      <w:r>
         <w:t xml:space="preserve">Base: 176 egresados. Fuente: PULSO PUCP 2026.</w:t>
       </w:r>
     </w:p>
@@ -31047,12 +31646,14 @@
         <w:fldChar w:fldCharType="end"/>
       </w:r>
       <w:r>
-        <w:rPr>
-          <w:rStyle w:val="NumeroRotulo"/>
-        </w:rPr>
-        <w:t xml:space="preserve">. </w:t>
-      </w:r>
-      <w:r>
+        <w:br w:type="textWrapping"/>
+      </w:r>
+      <w:r>
+        <w:rPr>
+          <w:rFonts/>
+          <w:i w:val="true"/>
+          <w:strike w:val="false"/>
+        </w:rPr>
         <w:t xml:space="preserve">¿El trabajo que usted realiza actualmente y por el cual recibe una remuneración se encuentra relacionado con el quehacer contable?</w:t>
       </w:r>
     </w:p>
@@ -31068,7 +31669,7 @@
         </w:pBdr>
         <w:spacing w:after="0" w:before="0" w:line="240"/>
         <w:ind w:left="0" w:right="0" w:firstLine="0" w:firstLineChars="0"/>
-        <w:jc w:val="left"/>
+        <w:jc w:val="center"/>
       </w:pPr>
       <w:r>
         <w:rPr/>
@@ -31116,6 +31717,14 @@
         <w:pStyle w:val="BaseFuente"/>
       </w:pPr>
       <w:r>
+        <w:rPr>
+          <w:rFonts/>
+          <w:i w:val="true"/>
+          <w:strike w:val="false"/>
+        </w:rPr>
+        <w:t xml:space="preserve">Nota. </w:t>
+      </w:r>
+      <w:r>
         <w:t xml:space="preserve">Base: 172 egresados. Fuente: PULSO PUCP 2026.</w:t>
       </w:r>
     </w:p>
@@ -31139,7 +31748,7 @@
         </w:pBdr>
         <w:spacing w:after="160" w:before="0" w:line="312"/>
         <w:ind w:left="0" w:right="0" w:firstLine="0" w:firstLineChars="0"/>
-        <w:jc w:val="left"/>
+        <w:jc w:val="both"/>
       </w:pPr>
       <w:r>
         <w:rPr>
@@ -31196,12 +31805,14 @@
         <w:fldChar w:fldCharType="end"/>
       </w:r>
       <w:r>
-        <w:rPr>
-          <w:rStyle w:val="NumeroRotulo"/>
-        </w:rPr>
-        <w:t xml:space="preserve">. </w:t>
-      </w:r>
-      <w:r>
+        <w:br w:type="textWrapping"/>
+      </w:r>
+      <w:r>
+        <w:rPr>
+          <w:rFonts/>
+          <w:i w:val="true"/>
+          <w:strike w:val="false"/>
+        </w:rPr>
         <w:t xml:space="preserve">La democracia es preferible a cualquier otra forma de gobierno, por grupo de edad</w:t>
       </w:r>
     </w:p>
@@ -31217,7 +31828,7 @@
         </w:pBdr>
         <w:spacing w:after="0" w:before="0" w:line="240"/>
         <w:ind w:left="0" w:right="0" w:firstLine="0" w:firstLineChars="0"/>
-        <w:jc w:val="left"/>
+        <w:jc w:val="center"/>
       </w:pPr>
       <w:r>
         <w:rPr/>
@@ -31265,6 +31876,14 @@
         <w:pStyle w:val="BaseFuente"/>
       </w:pPr>
       <w:r>
+        <w:rPr>
+          <w:rFonts/>
+          <w:i w:val="true"/>
+          <w:strike w:val="false"/>
+        </w:rPr>
+        <w:t xml:space="preserve">Nota. </w:t>
+      </w:r>
+      <w:r>
         <w:t xml:space="preserve">Base: 1,200 entrevistados: 312 de 18 a 29 años, 641 de 30 a 59 y 247 de 60 a más. Cifras ficticias. Fuente: PULSO PUCP 2026.</w:t>
       </w:r>
     </w:p>
@@ -31309,12 +31928,14 @@
         <w:fldChar w:fldCharType="end"/>
       </w:r>
       <w:r>
-        <w:rPr>
-          <w:rStyle w:val="NumeroRotulo"/>
-        </w:rPr>
-        <w:t xml:space="preserve">. </w:t>
-      </w:r>
-      <w:r>
+        <w:br w:type="textWrapping"/>
+      </w:r>
+      <w:r>
+        <w:rPr>
+          <w:rFonts/>
+          <w:i w:val="true"/>
+          <w:strike w:val="false"/>
+        </w:rPr>
         <w:t xml:space="preserve">Aprobación de la gestión en cuatro mediciones</w:t>
       </w:r>
     </w:p>
@@ -31330,7 +31951,7 @@
         </w:pBdr>
         <w:spacing w:after="0" w:before="0" w:line="240"/>
         <w:ind w:left="0" w:right="0" w:firstLine="0" w:firstLineChars="0"/>
-        <w:jc w:val="left"/>
+        <w:jc w:val="center"/>
       </w:pPr>
       <w:r>
         <w:rPr/>
@@ -31378,6 +31999,14 @@
         <w:pStyle w:val="BaseFuente"/>
       </w:pPr>
       <w:r>
+        <w:rPr>
+          <w:rFonts/>
+          <w:i w:val="true"/>
+          <w:strike w:val="false"/>
+        </w:rPr>
+        <w:t xml:space="preserve">Nota. </w:t>
+      </w:r>
+      <w:r>
         <w:t xml:space="preserve">Base: 1,200 entrevistados en cada ola. Cifras ficticias. Fuente: PULSO PUCP 2026.</w:t>
       </w:r>
     </w:p>
@@ -31442,7 +32071,7 @@
         </w:pBdr>
         <w:spacing w:after="160" w:before="0" w:line="312"/>
         <w:ind w:left="0" w:right="0" w:firstLine="0" w:firstLineChars="0"/>
-        <w:jc w:val="left"/>
+        <w:jc w:val="both"/>
       </w:pPr>
       <w:r>
         <w:rPr>
@@ -31499,12 +32128,14 @@
         <w:fldChar w:fldCharType="end"/>
       </w:r>
       <w:r>
-        <w:rPr>
-          <w:rStyle w:val="NumeroRotulo"/>
-        </w:rPr>
-        <w:t xml:space="preserve">. </w:t>
-      </w:r>
-      <w:r>
+        <w:br w:type="textWrapping"/>
+      </w:r>
+      <w:r>
+        <w:rPr>
+          <w:rFonts/>
+          <w:i w:val="true"/>
+          <w:strike w:val="false"/>
+        </w:rPr>
         <w:t xml:space="preserve">Distritos del estudio por grupo</w:t>
       </w:r>
     </w:p>
@@ -31520,7 +32151,7 @@
         </w:pBdr>
         <w:spacing w:after="0" w:before="0" w:line="240"/>
         <w:ind w:left="0" w:right="0" w:firstLine="0" w:firstLineChars="0"/>
-        <w:jc w:val="left"/>
+        <w:jc w:val="center"/>
       </w:pPr>
       <w:r>
         <w:rPr/>
@@ -31568,6 +32199,14 @@
         <w:pStyle w:val="BaseFuente"/>
       </w:pPr>
       <w:r>
+        <w:rPr>
+          <w:rFonts/>
+          <w:i w:val="true"/>
+          <w:strike w:val="false"/>
+        </w:rPr>
+        <w:t xml:space="preserve">Nota. </w:t>
+      </w:r>
+      <w:r>
         <w:t xml:space="preserve">Base: 189 entrevistados. Selección ficticia sobre la cartografía de Lima Metropolitana y Callao (IMP PlanMet 2040). Fuente: PULSO PUCP 2026.</w:t>
       </w:r>
     </w:p>
@@ -31612,12 +32251,14 @@
         <w:fldChar w:fldCharType="end"/>
       </w:r>
       <w:r>
-        <w:rPr>
-          <w:rStyle w:val="NumeroRotulo"/>
-        </w:rPr>
-        <w:t xml:space="preserve">. </w:t>
-      </w:r>
-      <w:r>
+        <w:br w:type="textWrapping"/>
+      </w:r>
+      <w:r>
+        <w:rPr>
+          <w:rFonts/>
+          <w:i w:val="true"/>
+          <w:strike w:val="false"/>
+        </w:rPr>
         <w:t xml:space="preserve">Percepción de la comunidad de acogida, por grupo</w:t>
       </w:r>
     </w:p>
@@ -31633,7 +32274,7 @@
         </w:pBdr>
         <w:spacing w:after="0" w:before="0" w:line="240"/>
         <w:ind w:left="0" w:right="0" w:firstLine="0" w:firstLineChars="0"/>
-        <w:jc w:val="left"/>
+        <w:jc w:val="center"/>
       </w:pPr>
       <w:r>
         <w:rPr/>
@@ -31681,6 +32322,14 @@
         <w:pStyle w:val="BaseFuente"/>
       </w:pPr>
       <w:r>
+        <w:rPr>
+          <w:rFonts/>
+          <w:i w:val="true"/>
+          <w:strike w:val="false"/>
+        </w:rPr>
+        <w:t xml:space="preserve">Nota. </w:t>
+      </w:r>
+      <w:r>
         <w:t xml:space="preserve">Base: 99 entrevistados en distritos de intervención y 90 en distritos de comparación. Cifras ficticias. Fuente: PULSO PUCP 2026.</w:t>
       </w:r>
     </w:p>
@@ -31704,7 +32353,7 @@
         </w:pBdr>
         <w:spacing w:after="160" w:before="0" w:line="312"/>
         <w:ind w:left="0" w:right="0" w:firstLine="0" w:firstLineChars="0"/>
-        <w:jc w:val="left"/>
+        <w:jc w:val="both"/>
       </w:pPr>
       <w:r>
         <w:rPr>
@@ -31761,12 +32410,14 @@
         <w:fldChar w:fldCharType="end"/>
       </w:r>
       <w:r>
-        <w:rPr>
-          <w:rStyle w:val="NumeroRotulo"/>
-        </w:rPr>
-        <w:t xml:space="preserve">. </w:t>
-      </w:r>
-      <w:r>
+        <w:br w:type="textWrapping"/>
+      </w:r>
+      <w:r>
+        <w:rPr>
+          <w:rFonts/>
+          <w:i w:val="true"/>
+          <w:strike w:val="false"/>
+        </w:rPr>
         <w:t xml:space="preserve">Indicadores de la asistencia frente a su meta</w:t>
       </w:r>
     </w:p>
@@ -31782,7 +32433,7 @@
         </w:pBdr>
         <w:spacing w:after="0" w:before="0" w:line="240"/>
         <w:ind w:left="0" w:right="0" w:firstLine="0" w:firstLineChars="0"/>
-        <w:jc w:val="left"/>
+        <w:jc w:val="center"/>
       </w:pPr>
       <w:r>
         <w:rPr/>
@@ -31830,6 +32481,14 @@
         <w:pStyle w:val="BaseFuente"/>
       </w:pPr>
       <w:r>
+        <w:rPr>
+          <w:rFonts/>
+          <w:i w:val="true"/>
+          <w:strike w:val="false"/>
+        </w:rPr>
+        <w:t xml:space="preserve">Nota. </w:t>
+      </w:r>
+      <w:r>
         <w:t xml:space="preserve">La línea coral marca la meta. N = 2,296 hogares entrevistados por teléfono. Cifras ficticias. Fuente: PULSO PUCP 2026.</w:t>
       </w:r>
     </w:p>
@@ -31872,7 +32531,7 @@
         </w:pBdr>
         <w:spacing w:after="160" w:before="0" w:line="312"/>
         <w:ind w:left="0" w:right="0" w:firstLine="0" w:firstLineChars="0"/>
-        <w:jc w:val="left"/>
+        <w:jc w:val="both"/>
       </w:pPr>
       <w:r>
         <w:rPr>
@@ -31929,12 +32588,14 @@
         <w:fldChar w:fldCharType="end"/>
       </w:r>
       <w:r>
-        <w:rPr>
-          <w:rStyle w:val="NumeroRotulo"/>
-        </w:rPr>
-        <w:t xml:space="preserve">. </w:t>
-      </w:r>
-      <w:r>
+        <w:br w:type="textWrapping"/>
+      </w:r>
+      <w:r>
+        <w:rPr>
+          <w:rFonts/>
+          <w:i w:val="true"/>
+          <w:strike w:val="false"/>
+        </w:rPr>
         <w:t xml:space="preserve">Estudiantes que vivieron al menos una situación de hostigamiento, por facultad</w:t>
       </w:r>
     </w:p>
@@ -31950,7 +32611,7 @@
         </w:pBdr>
         <w:spacing w:after="0" w:before="0" w:line="240"/>
         <w:ind w:left="0" w:right="0" w:firstLine="0" w:firstLineChars="0"/>
-        <w:jc w:val="left"/>
+        <w:jc w:val="center"/>
       </w:pPr>
       <w:r>
         <w:rPr/>
@@ -31998,6 +32659,14 @@
         <w:pStyle w:val="BaseFuente"/>
       </w:pPr>
       <w:r>
+        <w:rPr>
+          <w:rFonts/>
+          <w:i w:val="true"/>
+          <w:strike w:val="false"/>
+        </w:rPr>
+        <w:t xml:space="preserve">Nota. </w:t>
+      </w:r>
+      <w:r>
         <w:t xml:space="preserve">Base: 1,855 estudiantes encuestados en aula. Entre paréntesis, los casos de cada facultad. Cifras ficticias. Fuente: PULSO PUCP 2026.</w:t>
       </w:r>
     </w:p>
@@ -32021,7 +32690,7 @@
         </w:pBdr>
         <w:spacing w:after="160" w:before="0" w:line="312"/>
         <w:ind w:left="0" w:right="0" w:firstLine="0" w:firstLineChars="0"/>
-        <w:jc w:val="left"/>
+        <w:jc w:val="both"/>
       </w:pPr>
       <w:r>
         <w:rPr>
@@ -32078,12 +32747,14 @@
         <w:fldChar w:fldCharType="end"/>
       </w:r>
       <w:r>
-        <w:rPr>
-          <w:rStyle w:val="NumeroRotulo"/>
-        </w:rPr>
-        <w:t xml:space="preserve">. </w:t>
-      </w:r>
-      <w:r>
+        <w:br w:type="textWrapping"/>
+      </w:r>
+      <w:r>
+        <w:rPr>
+          <w:rFonts/>
+          <w:i w:val="true"/>
+          <w:strike w:val="false"/>
+        </w:rPr>
         <w:t xml:space="preserve">Hombres y mujeres tienen las mismas oportunidades de ascenso</w:t>
       </w:r>
     </w:p>
@@ -32099,7 +32770,7 @@
         </w:pBdr>
         <w:spacing w:after="0" w:before="0" w:line="240"/>
         <w:ind w:left="0" w:right="0" w:firstLine="0" w:firstLineChars="0"/>
-        <w:jc w:val="left"/>
+        <w:jc w:val="center"/>
       </w:pPr>
       <w:r>
         <w:rPr/>
@@ -32147,6 +32818,14 @@
         <w:pStyle w:val="BaseFuente"/>
       </w:pPr>
       <w:r>
+        <w:rPr>
+          <w:rFonts/>
+          <w:i w:val="true"/>
+          <w:strike w:val="false"/>
+        </w:rPr>
+        <w:t xml:space="preserve">Nota. </w:t>
+      </w:r>
+      <w:r>
         <w:t xml:space="preserve">Base: 420 trabajadores y 38 directivos. Cifras ficticias. Fuente: PULSO PUCP 2026.</w:t>
       </w:r>
     </w:p>
@@ -32191,12 +32870,14 @@
         <w:fldChar w:fldCharType="end"/>
       </w:r>
       <w:r>
-        <w:rPr>
-          <w:rStyle w:val="NumeroRotulo"/>
-        </w:rPr>
-        <w:t xml:space="preserve">. </w:t>
-      </w:r>
-      <w:r>
+        <w:br w:type="textWrapping"/>
+      </w:r>
+      <w:r>
+        <w:rPr>
+          <w:rFonts/>
+          <w:i w:val="true"/>
+          <w:strike w:val="false"/>
+        </w:rPr>
         <w:t xml:space="preserve">Brecha entre trabajadores y directivos (Top Two Box)</w:t>
       </w:r>
     </w:p>
@@ -32212,7 +32893,7 @@
         </w:pBdr>
         <w:spacing w:after="0" w:before="0" w:line="240"/>
         <w:ind w:left="0" w:right="0" w:firstLine="0" w:firstLineChars="0"/>
-        <w:jc w:val="left"/>
+        <w:jc w:val="center"/>
       </w:pPr>
       <w:r>
         <w:rPr/>
@@ -32260,6 +32941,14 @@
         <w:pStyle w:val="BaseFuente"/>
       </w:pPr>
       <w:r>
+        <w:rPr>
+          <w:rFonts/>
+          <w:i w:val="true"/>
+          <w:strike w:val="false"/>
+        </w:rPr>
+        <w:t xml:space="preserve">Nota. </w:t>
+      </w:r>
+      <w:r>
         <w:t xml:space="preserve">Base: 38 directivos y 420 trabajadores. Cifras ficticias. Fuente: PULSO PUCP 2026.</w:t>
       </w:r>
     </w:p>
@@ -32313,7 +33002,7 @@
         </w:pBdr>
         <w:spacing w:after="160" w:before="0" w:line="312"/>
         <w:ind w:left="0" w:right="0" w:firstLine="0" w:firstLineChars="0"/>
-        <w:jc w:val="left"/>
+        <w:jc w:val="both"/>
       </w:pPr>
       <w:r>
         <w:rPr>
@@ -32370,12 +33059,14 @@
         <w:fldChar w:fldCharType="end"/>
       </w:r>
       <w:r>
-        <w:rPr>
-          <w:rStyle w:val="NumeroRotulo"/>
-        </w:rPr>
-        <w:t xml:space="preserve">. </w:t>
-      </w:r>
-      <w:r>
+        <w:br w:type="textWrapping"/>
+      </w:r>
+      <w:r>
+        <w:rPr>
+          <w:rFonts/>
+          <w:i w:val="true"/>
+          <w:strike w:val="false"/>
+        </w:rPr>
         <w:t xml:space="preserve">Indicadores del programa en la línea de base y en la medición final</w:t>
       </w:r>
     </w:p>
@@ -32391,7 +33082,7 @@
         </w:pBdr>
         <w:spacing w:after="0" w:before="0" w:line="240"/>
         <w:ind w:left="0" w:right="0" w:firstLine="0" w:firstLineChars="0"/>
-        <w:jc w:val="left"/>
+        <w:jc w:val="center"/>
       </w:pPr>
       <w:r>
         <w:rPr/>
@@ -32439,6 +33130,14 @@
         <w:pStyle w:val="BaseFuente"/>
       </w:pPr>
       <w:r>
+        <w:rPr>
+          <w:rFonts/>
+          <w:i w:val="true"/>
+          <w:strike w:val="false"/>
+        </w:rPr>
+        <w:t xml:space="preserve">Nota. </w:t>
+      </w:r>
+      <w:r>
         <w:t xml:space="preserve">Base: 312 participantes medidos en las dos ocasiones. Cifras ficticias. Fuente: PULSO PUCP 2026.</w:t>
       </w:r>
     </w:p>
@@ -32459,6 +33158,134 @@
       </w:r>
       <w:r>
         <w:t xml:space="preserve">.</w:t>
+      </w:r>
+    </w:p>
+    <w:p>
+      <w:pPr/>
+      <w:r>
+        <w:br w:type="page"/>
+      </w:r>
+    </w:p>
+    <w:p>
+      <w:pPr>
+        <w:pStyle w:val="Titre1"/>
+      </w:pPr>
+      <w:r>
+        <w:t xml:space="preserve">Referencias</w:t>
+      </w:r>
+    </w:p>
+    <w:p>
+      <w:pPr>
+        <w:pStyle w:val="Referencia"/>
+      </w:pPr>
+      <w:r>
+        <w:t xml:space="preserve">Agresti, A. (2013). </w:t>
+      </w:r>
+      <w:r>
+        <w:rPr>
+          <w:rFonts/>
+          <w:i w:val="true"/>
+          <w:strike w:val="false"/>
+        </w:rPr>
+        <w:t xml:space="preserve">Categorical data analysis</w:t>
+      </w:r>
+      <w:r>
+        <w:t xml:space="preserve"> (3.ª ed.). Wiley.</w:t>
+      </w:r>
+    </w:p>
+    <w:p>
+      <w:pPr>
+        <w:pStyle w:val="Referencia"/>
+      </w:pPr>
+      <w:r>
+        <w:t xml:space="preserve">American Psychological Association. (2020). </w:t>
+      </w:r>
+      <w:r>
+        <w:rPr>
+          <w:rFonts/>
+          <w:i w:val="true"/>
+          <w:strike w:val="false"/>
+        </w:rPr>
+        <w:t xml:space="preserve">Publication manual of the American Psychological Association</w:t>
+      </w:r>
+      <w:r>
+        <w:t xml:space="preserve"> (7.ª ed.). https://doi.org/10.1037/0000165-000</w:t>
+      </w:r>
+    </w:p>
+    <w:p>
+      <w:pPr>
+        <w:pStyle w:val="Referencia"/>
+      </w:pPr>
+      <w:r>
+        <w:t xml:space="preserve">Cumming, G., y Finch, S. (2005). Inference by eye: Confidence intervals and how to read pictures of data. </w:t>
+      </w:r>
+      <w:r>
+        <w:rPr>
+          <w:rFonts/>
+          <w:i w:val="true"/>
+          <w:strike w:val="false"/>
+        </w:rPr>
+        <w:t xml:space="preserve">American Psychologist, 60</w:t>
+      </w:r>
+      <w:r>
+        <w:t xml:space="preserve">(2), 170-180. https://doi.org/10.1037/0003-066X.60.2.170</w:t>
+      </w:r>
+    </w:p>
+    <w:p>
+      <w:pPr>
+        <w:pStyle w:val="Referencia"/>
+      </w:pPr>
+      <w:r>
+        <w:t xml:space="preserve">Dunn, O. J. (1961). Multiple comparisons among means. </w:t>
+      </w:r>
+      <w:r>
+        <w:rPr>
+          <w:rFonts/>
+          <w:i w:val="true"/>
+          <w:strike w:val="false"/>
+        </w:rPr>
+        <w:t xml:space="preserve">Journal of the American Statistical Association, 56</w:t>
+      </w:r>
+      <w:r>
+        <w:t xml:space="preserve">(293), 52-64. https://doi.org/10.1080/01621459.1961.10482090</w:t>
+      </w:r>
+    </w:p>
+    <w:p>
+      <w:pPr>
+        <w:pStyle w:val="Referencia"/>
+      </w:pPr>
+      <w:r>
+        <w:t xml:space="preserve">Few, S. (2012). </w:t>
+      </w:r>
+      <w:r>
+        <w:rPr>
+          <w:rFonts/>
+          <w:i w:val="true"/>
+          <w:strike w:val="false"/>
+        </w:rPr>
+        <w:t xml:space="preserve">Show me the numbers: Designing tables and graphs to enlighten</w:t>
+      </w:r>
+      <w:r>
+        <w:t xml:space="preserve"> (2.ª ed.). Analytics Press.</w:t>
+      </w:r>
+    </w:p>
+    <w:p>
+      <w:pPr>
+        <w:pStyle w:val="Referencia"/>
+      </w:pPr>
+      <w:r>
+        <w:t xml:space="preserve">Tufte, E. R. (2001). </w:t>
+      </w:r>
+      <w:r>
+        <w:rPr>
+          <w:rFonts/>
+          <w:i w:val="true"/>
+          <w:strike w:val="false"/>
+        </w:rPr>
+        <w:t xml:space="preserve">The visual display of quantitative information</w:t>
+      </w:r>
+      <w:r>
+        <w:t xml:space="preserve"> (2.ª ed.). Graphics Press.</w:t>
       </w:r>
     </w:p>
     <w:p>
@@ -33299,10 +34126,14 @@
         <w:rFonts w:asciiTheme="minorHAnsi" w:eastAsiaTheme="minorEastAsia" w:hAnsiTheme="minorHAnsi" w:cstheme="minorBidi"/>
         <w:sz w:val="24"/>
         <w:szCs w:val="24"/>
-        <w:lang w:val="en-US" w:eastAsia="en-US" w:bidi="ar-SA"/>
+        <w:lang w:val="es-PE" w:eastAsia="en-US" w:bidi="ar-SA"/>
       </w:rPr>
     </w:rPrDefault>
-    <w:pPrDefault/>
+    <w:pPrDefault>
+      <w:pPr>
+        <w:widowControl/>
+      </w:pPr>
+    </w:pPrDefault>
   </w:docDefaults>
   <w:latentStyles w:defLockedState="0" w:defUIPriority="99" w:defSemiHidden="0" w:defUnhideWhenUsed="0" w:defQFormat="0" w:count="376">
     <w:lsdException w:name="Normal" w:uiPriority="0" w:qFormat="1"/>
@@ -34136,12 +34967,12 @@
     <w:rPr>
       <w:rFonts w:ascii="Arial" w:hAnsi="Arial" w:eastAsia="Arial" w:cs="Arial"/>
       <w:i w:val="false"/>
-      <w:b w:val="true"/>
+      <w:b w:val="false"/>
       <w:u w:val="none"/>
       <w:strike w:val="false"/>
       <w:sz w:val="20"/>
       <w:szCs w:val="20"/>
-      <w:color w:val="002060"/>
+      <w:color w:val="26303F"/>
     </w:rPr>
   </w:style>
   <w:style xmlns:w="http://schemas.openxmlformats.org/wordprocessingml/2006/main" w:type="character" w:customStyle="1" w:styleId="NumeroRotulo">
@@ -34170,11 +35001,11 @@
       </w:pBdr>
       <w:spacing w:after="200" w:before="40" w:line="264"/>
       <w:ind w:left="0" w:right="0" w:firstLine="0" w:firstLineChars="0"/>
-      <w:jc w:val="left"/>
+      <w:jc w:val="center"/>
     </w:pPr>
     <w:rPr>
       <w:rFonts w:ascii="Arial" w:hAnsi="Arial" w:eastAsia="Arial" w:cs="Arial"/>
-      <w:i w:val="true"/>
+      <w:i w:val="false"/>
       <w:b w:val="false"/>
       <w:u w:val="none"/>
       <w:strike w:val="false"/>
@@ -34195,7 +35026,7 @@
       </w:pBdr>
       <w:spacing w:after="280" w:before="40" w:line="312"/>
       <w:ind w:left="0" w:right="0" w:firstLine="0" w:firstLineChars="0"/>
-      <w:jc w:val="left"/>
+      <w:jc w:val="both"/>
     </w:pPr>
     <w:rPr>
       <w:rFonts w:ascii="Arial" w:hAnsi="Arial" w:eastAsia="Arial" w:cs="Arial"/>
@@ -34246,7 +35077,7 @@
       </w:pBdr>
       <w:spacing w:after="100" w:before="0" w:line="312"/>
       <w:ind w:left="200" w:right="0" w:firstLine="0" w:firstLineChars="0"/>
-      <w:jc w:val="left"/>
+      <w:jc w:val="both"/>
     </w:pPr>
     <w:rPr>
       <w:rFonts w:ascii="Arial" w:hAnsi="Arial" w:eastAsia="Arial" w:cs="Arial"/>
@@ -34256,6 +35087,31 @@
       <w:strike w:val="false"/>
       <w:sz w:val="21"/>
       <w:szCs w:val="21"/>
+      <w:color w:val="26303F"/>
+    </w:rPr>
+  </w:style>
+  <w:style xmlns:w="http://schemas.openxmlformats.org/wordprocessingml/2006/main" w:type="paragraph" w:customStyle="1" w:styleId="Referencia">
+    <w:name w:val="Referencia"/>
+    <w:basedOn w:val="Normal"/>
+    <w:pPr>
+      <w:pBdr>
+        <w:top w:val="none" w:sz="0" w:space="0" w:color="000000"/>
+        <w:left w:val="none" w:sz="0" w:space="0" w:color="000000"/>
+        <w:bottom w:val="none" w:sz="0" w:space="0" w:color="000000"/>
+        <w:right w:val="none" w:sz="0" w:space="0" w:color="000000"/>
+      </w:pBdr>
+      <w:spacing w:after="160" w:before="0" w:line="312"/>
+      <w:ind w:left="567" w:right="0" w:firstLineChars="0" w:hanging="567"/>
+      <w:jc w:val="left"/>
+    </w:pPr>
+    <w:rPr>
+      <w:rFonts w:ascii="Arial" w:hAnsi="Arial" w:eastAsia="Arial" w:cs="Arial"/>
+      <w:i w:val="false"/>
+      <w:b w:val="false"/>
+      <w:u w:val="none"/>
+      <w:strike w:val="false"/>
+      <w:sz w:val="20"/>
+      <w:szCs w:val="20"/>
       <w:color w:val="26303F"/>
     </w:rPr>
   </w:style>

</xml_diff>

<commit_message>
docs(qa): propuesta en Word, notas sin la palabra Nota y leyenda del mapa centrada al lado
</commit_message>
<xml_diff>
--- a/docs/qa/motor-ppt-2026-10-06/4-recetario/propuesta-word.docx
+++ b/docs/qa/motor-ppt-2026-10-06/4-recetario/propuesta-word.docx
@@ -4235,14 +4235,6 @@
         <w:pStyle w:val="BaseFuente"/>
       </w:pPr>
       <w:r>
-        <w:rPr>
-          <w:rFonts/>
-          <w:i w:val="true"/>
-          <w:strike w:val="false"/>
-        </w:rPr>
-        <w:t xml:space="preserve">Nota. </w:t>
-      </w:r>
-      <w:r>
         <w:t xml:space="preserve">Base: esquema medido de una página del informe. Fuente: PULSO PUCP 2026.</w:t>
       </w:r>
     </w:p>
@@ -5219,14 +5211,6 @@
         <w:pStyle w:val="BaseFuente"/>
       </w:pPr>
       <w:r>
-        <w:rPr>
-          <w:rFonts/>
-          <w:i w:val="true"/>
-          <w:strike w:val="false"/>
-        </w:rPr>
-        <w:t xml:space="preserve">Nota. </w:t>
-      </w:r>
-      <w:r>
         <w:t xml:space="preserve">Base: 148 docentes, 1,234 estudiantes y 314 egresados. Fuente: PULSO PUCP 2026.</w:t>
       </w:r>
     </w:p>
@@ -9623,14 +9607,6 @@
         <w:pStyle w:val="BaseFuente"/>
       </w:pPr>
       <w:r>
-        <w:rPr>
-          <w:rFonts/>
-          <w:i w:val="true"/>
-          <w:strike w:val="false"/>
-        </w:rPr>
-        <w:t xml:space="preserve">Nota. </w:t>
-      </w:r>
-      <w:r>
         <w:t xml:space="preserve">Base: paletas de la identidad de PULSO PUCP. Fuente: PULSO PUCP 2026.</w:t>
       </w:r>
     </w:p>
@@ -12809,14 +12785,6 @@
         <w:pStyle w:val="BaseFuente"/>
       </w:pPr>
       <w:r>
-        <w:rPr>
-          <w:rFonts/>
-          <w:i w:val="true"/>
-          <w:strike w:val="false"/>
-        </w:rPr>
-        <w:t xml:space="preserve">Nota. </w:t>
-      </w:r>
-      <w:r>
         <w:t xml:space="preserve">Lámina «Dos gráficos con narrativa» del PPT</w:t>
       </w:r>
     </w:p>
@@ -12960,14 +12928,6 @@
         <w:pStyle w:val="BaseFuente"/>
       </w:pPr>
       <w:r>
-        <w:rPr>
-          <w:rFonts/>
-          <w:i w:val="true"/>
-          <w:strike w:val="false"/>
-        </w:rPr>
-        <w:t xml:space="preserve">Nota. </w:t>
-      </w:r>
-      <w:r>
         <w:t xml:space="preserve">Base: 56 egresados que tienen título. Fuente: PULSO PUCP 2026.</w:t>
       </w:r>
     </w:p>
@@ -13083,14 +13043,6 @@
         <w:pStyle w:val="BaseFuente"/>
       </w:pPr>
       <w:r>
-        <w:rPr>
-          <w:rFonts/>
-          <w:i w:val="true"/>
-          <w:strike w:val="false"/>
-        </w:rPr>
-        <w:t xml:space="preserve">Nota. </w:t>
-      </w:r>
-      <w:r>
         <w:t xml:space="preserve">Base: 167 egresados que respondieron. Fuente: PULSO PUCP 2026.</w:t>
       </w:r>
     </w:p>
@@ -13271,14 +13223,6 @@
         <w:pStyle w:val="BaseFuente"/>
       </w:pPr>
       <w:r>
-        <w:rPr>
-          <w:rFonts/>
-          <w:i w:val="true"/>
-          <w:strike w:val="false"/>
-        </w:rPr>
-        <w:t xml:space="preserve">Nota. </w:t>
-      </w:r>
-      <w:r>
         <w:t xml:space="preserve">Lámina «Cifras en banda superior» del PPT</w:t>
       </w:r>
     </w:p>
@@ -13870,14 +13814,6 @@
         <w:pStyle w:val="BaseFuente"/>
       </w:pPr>
       <w:r>
-        <w:rPr>
-          <w:rFonts/>
-          <w:i w:val="true"/>
-          <w:strike w:val="false"/>
-        </w:rPr>
-        <w:t xml:space="preserve">Nota. </w:t>
-      </w:r>
-      <w:r>
         <w:t xml:space="preserve">Base: 174 egresados que usan IA. Opción múltiple: los porcentajes pueden sumar más de 100. Fuente: PULSO PUCP 2026.</w:t>
       </w:r>
     </w:p>
@@ -14029,14 +13965,6 @@
         <w:pStyle w:val="BaseFuente"/>
       </w:pPr>
       <w:r>
-        <w:rPr>
-          <w:rFonts/>
-          <w:i w:val="true"/>
-          <w:strike w:val="false"/>
-        </w:rPr>
-        <w:t xml:space="preserve">Nota. </w:t>
-      </w:r>
-      <w:r>
         <w:t xml:space="preserve">Base: 1,200 entrevistados. Fuente: PULSO PUCP 2026.</w:t>
       </w:r>
     </w:p>
@@ -14188,14 +14116,6 @@
         <w:pStyle w:val="BaseFuente"/>
       </w:pPr>
       <w:r>
-        <w:rPr>
-          <w:rFonts/>
-          <w:i w:val="true"/>
-          <w:strike w:val="false"/>
-        </w:rPr>
-        <w:t xml:space="preserve">Nota. </w:t>
-      </w:r>
-      <w:r>
         <w:t xml:space="preserve">Base: 52 docentes y 172 estudiantes. Fuente: PULSO PUCP 2026.</w:t>
       </w:r>
     </w:p>
@@ -14347,14 +14267,6 @@
         <w:pStyle w:val="BaseFuente"/>
       </w:pPr>
       <w:r>
-        <w:rPr>
-          <w:rFonts/>
-          <w:i w:val="true"/>
-          <w:strike w:val="false"/>
-        </w:rPr>
-        <w:t xml:space="preserve">Nota. </w:t>
-      </w:r>
-      <w:r>
         <w:t xml:space="preserve">Base: 52 docentes y 172 estudiantes. 2021: informe consolidado anterior. Fuente: PULSO PUCP 2026.</w:t>
       </w:r>
     </w:p>
@@ -14506,14 +14418,6 @@
         <w:pStyle w:val="BaseFuente"/>
       </w:pPr>
       <w:r>
-        <w:rPr>
-          <w:rFonts/>
-          <w:i w:val="true"/>
-          <w:strike w:val="false"/>
-        </w:rPr>
-        <w:t xml:space="preserve">Nota. </w:t>
-      </w:r>
-      <w:r>
         <w:t xml:space="preserve">Base: 178 egresados. Fuente: PULSO PUCP 2026.</w:t>
       </w:r>
     </w:p>
@@ -14665,14 +14569,6 @@
         <w:pStyle w:val="BaseFuente"/>
       </w:pPr>
       <w:r>
-        <w:rPr>
-          <w:rFonts/>
-          <w:i w:val="true"/>
-          <w:strike w:val="false"/>
-        </w:rPr>
-        <w:t xml:space="preserve">Nota. </w:t>
-      </w:r>
-      <w:r>
         <w:t xml:space="preserve">Base: 178 egresados. Fuente: PULSO PUCP 2026.</w:t>
       </w:r>
     </w:p>
@@ -14824,14 +14720,6 @@
         <w:pStyle w:val="BaseFuente"/>
       </w:pPr>
       <w:r>
-        <w:rPr>
-          <w:rFonts/>
-          <w:i w:val="true"/>
-          <w:strike w:val="false"/>
-        </w:rPr>
-        <w:t xml:space="preserve">Nota. </w:t>
-      </w:r>
-      <w:r>
         <w:t xml:space="preserve">Base: 170 estudiantes que declararon su edad. Fuente: PULSO PUCP 2026.</w:t>
       </w:r>
     </w:p>
@@ -14983,14 +14871,6 @@
         <w:pStyle w:val="BaseFuente"/>
       </w:pPr>
       <w:r>
-        <w:rPr>
-          <w:rFonts/>
-          <w:i w:val="true"/>
-          <w:strike w:val="false"/>
-        </w:rPr>
-        <w:t xml:space="preserve">Nota. </w:t>
-      </w:r>
-      <w:r>
         <w:t xml:space="preserve">Base: 172 estudiantes que declararon su edad. Fuente: PULSO PUCP 2026.</w:t>
       </w:r>
     </w:p>
@@ -15142,14 +15022,6 @@
         <w:pStyle w:val="BaseFuente"/>
       </w:pPr>
       <w:r>
-        <w:rPr>
-          <w:rFonts/>
-          <w:i w:val="true"/>
-          <w:strike w:val="false"/>
-        </w:rPr>
-        <w:t xml:space="preserve">Nota. </w:t>
-      </w:r>
-      <w:r>
         <w:t xml:space="preserve">Base: 172 estudiantes. Fuente: PULSO PUCP 2026.</w:t>
       </w:r>
     </w:p>
@@ -15301,14 +15173,6 @@
         <w:pStyle w:val="BaseFuente"/>
       </w:pPr>
       <w:r>
-        <w:rPr>
-          <w:rFonts/>
-          <w:i w:val="true"/>
-          <w:strike w:val="false"/>
-        </w:rPr>
-        <w:t xml:space="preserve">Nota. </w:t>
-      </w:r>
-      <w:r>
         <w:t xml:space="preserve">Base: 52 docentes, 172 estudiantes, 178 egresados, 15 administrativos. El punto es la media. La línea va de la edad mínima a la máxima. Fuente: PULSO PUCP 2026.</w:t>
       </w:r>
     </w:p>
@@ -15460,14 +15324,6 @@
         <w:pStyle w:val="BaseFuente"/>
       </w:pPr>
       <w:r>
-        <w:rPr>
-          <w:rFonts/>
-          <w:i w:val="true"/>
-          <w:strike w:val="false"/>
-        </w:rPr>
-        <w:t xml:space="preserve">Nota. </w:t>
-      </w:r>
-      <w:r>
         <w:t xml:space="preserve">Base: 148 docentes. Fuente: PULSO PUCP 2026.</w:t>
       </w:r>
     </w:p>
@@ -15619,14 +15475,6 @@
         <w:pStyle w:val="BaseFuente"/>
       </w:pPr>
       <w:r>
-        <w:rPr>
-          <w:rFonts/>
-          <w:i w:val="true"/>
-          <w:strike w:val="false"/>
-        </w:rPr>
-        <w:t xml:space="preserve">Nota. </w:t>
-      </w:r>
-      <w:r>
         <w:t xml:space="preserve">Base: 131 egresados. Fuente: PULSO PUCP 2026.</w:t>
       </w:r>
     </w:p>
@@ -15778,14 +15626,6 @@
         <w:pStyle w:val="BaseFuente"/>
       </w:pPr>
       <w:r>
-        <w:rPr>
-          <w:rFonts/>
-          <w:i w:val="true"/>
-          <w:strike w:val="false"/>
-        </w:rPr>
-        <w:t xml:space="preserve">Nota. </w:t>
-      </w:r>
-      <w:r>
         <w:t xml:space="preserve">Base: 52 docentes, 172 estudiantes, 178 egresados, 15 administrativos. Fuente: PULSO PUCP 2026.</w:t>
       </w:r>
     </w:p>
@@ -15937,14 +15777,6 @@
         <w:pStyle w:val="BaseFuente"/>
       </w:pPr>
       <w:r>
-        <w:rPr>
-          <w:rFonts/>
-          <w:i w:val="true"/>
-          <w:strike w:val="false"/>
-        </w:rPr>
-        <w:t xml:space="preserve">Nota. </w:t>
-      </w:r>
-      <w:r>
         <w:t xml:space="preserve">Base: 46, 49, 51 y 52 docentes. 702, 845, 1,102 y 1,234 estudiantes. Fuente: PULSO PUCP 2026.</w:t>
       </w:r>
     </w:p>
@@ -16096,14 +15928,6 @@
         <w:pStyle w:val="BaseFuente"/>
       </w:pPr>
       <w:r>
-        <w:rPr>
-          <w:rFonts/>
-          <w:i w:val="true"/>
-          <w:strike w:val="false"/>
-        </w:rPr>
-        <w:t xml:space="preserve">Nota. </w:t>
-      </w:r>
-      <w:r>
         <w:t xml:space="preserve">Base: 109 estudiantes. Las columnas de Quinto a Décimo son los ciclos. El tono va de 80% (claro) a 100% (oscuro). Fuente: PULSO PUCP 2026.</w:t>
       </w:r>
     </w:p>
@@ -16255,14 +16079,6 @@
         <w:pStyle w:val="BaseFuente"/>
       </w:pPr>
       <w:r>
-        <w:rPr>
-          <w:rFonts/>
-          <w:i w:val="true"/>
-          <w:strike w:val="false"/>
-        </w:rPr>
-        <w:t xml:space="preserve">Nota. </w:t>
-      </w:r>
-      <w:r>
         <w:t xml:space="preserve">Base: 89 estudiantes hombres y 83 mujeres. Fuente: PULSO PUCP 2026.</w:t>
       </w:r>
     </w:p>
@@ -16414,14 +16230,6 @@
         <w:pStyle w:val="BaseFuente"/>
       </w:pPr>
       <w:r>
-        <w:rPr>
-          <w:rFonts/>
-          <w:i w:val="true"/>
-          <w:strike w:val="false"/>
-        </w:rPr>
-        <w:t xml:space="preserve">Nota. </w:t>
-      </w:r>
-      <w:r>
         <w:t xml:space="preserve">Base: 51 docentes, 109 estudiantes y 161 egresados. Fuente: PULSO PUCP 2026.</w:t>
       </w:r>
     </w:p>
@@ -16573,14 +16381,6 @@
         <w:pStyle w:val="BaseFuente"/>
       </w:pPr>
       <w:r>
-        <w:rPr>
-          <w:rFonts/>
-          <w:i w:val="true"/>
-          <w:strike w:val="false"/>
-        </w:rPr>
-        <w:t xml:space="preserve">Nota. </w:t>
-      </w:r>
-      <w:r>
         <w:t xml:space="preserve">Base: 224 usuarios. Cifras ficticias. Peso estimado con una regresión lineal. Fuente: PULSO PUCP 2026.</w:t>
       </w:r>
     </w:p>
@@ -16732,14 +16532,6 @@
         <w:pStyle w:val="BaseFuente"/>
       </w:pPr>
       <w:r>
-        <w:rPr>
-          <w:rFonts/>
-          <w:i w:val="true"/>
-          <w:strike w:val="false"/>
-        </w:rPr>
-        <w:t xml:space="preserve">Nota. </w:t>
-      </w:r>
-      <w:r>
         <w:t xml:space="preserve">Base: 26 docentes que respondieron «Sí». Un docente puede declarar varias. Fuente: PULSO PUCP 2026.</w:t>
       </w:r>
     </w:p>
@@ -16891,14 +16683,6 @@
         <w:pStyle w:val="BaseFuente"/>
       </w:pPr>
       <w:r>
-        <w:rPr>
-          <w:rFonts/>
-          <w:i w:val="true"/>
-          <w:strike w:val="false"/>
-        </w:rPr>
-        <w:t xml:space="preserve">Nota. </w:t>
-      </w:r>
-      <w:r>
         <w:t xml:space="preserve">La línea coral marca la meta. N = 2,296 hogares. Cifras ficticias. Fuente: PULSO PUCP 2026.</w:t>
       </w:r>
     </w:p>
@@ -17050,14 +16834,6 @@
         <w:pStyle w:val="BaseFuente"/>
       </w:pPr>
       <w:r>
-        <w:rPr>
-          <w:rFonts/>
-          <w:i w:val="true"/>
-          <w:strike w:val="false"/>
-        </w:rPr>
-        <w:t xml:space="preserve">Nota. </w:t>
-      </w:r>
-      <w:r>
         <w:t xml:space="preserve">Base: 131 egresados que respondieron la pregunta abierta. Fuente: PULSO PUCP 2026.</w:t>
       </w:r>
     </w:p>
@@ -17209,14 +16985,6 @@
         <w:pStyle w:val="BaseFuente"/>
       </w:pPr>
       <w:r>
-        <w:rPr>
-          <w:rFonts/>
-          <w:i w:val="true"/>
-          <w:strike w:val="false"/>
-        </w:rPr>
-        <w:t xml:space="preserve">Nota. </w:t>
-      </w:r>
-      <w:r>
         <w:t xml:space="preserve">Base: 1,184 personas en doce distritos. Cifras ficticias sobre la cartografía de Lima Metropolitana y Callao (IMP PlanMet 2040). Fuente: PULSO PUCP 2026.</w:t>
       </w:r>
     </w:p>
@@ -17368,14 +17136,6 @@
         <w:pStyle w:val="BaseFuente"/>
       </w:pPr>
       <w:r>
-        <w:rPr>
-          <w:rFonts/>
-          <w:i w:val="true"/>
-          <w:strike w:val="false"/>
-        </w:rPr>
-        <w:t xml:space="preserve">Nota. </w:t>
-      </w:r>
-      <w:r>
         <w:t xml:space="preserve">Base: 110 encuestas en 18 de 76 zonas. Cifras ficticias sobre las zonas censales INEI 2017. Fuente: PULSO PUCP 2026.</w:t>
       </w:r>
     </w:p>
@@ -17612,14 +17372,6 @@
         <w:pStyle w:val="BaseFuente"/>
       </w:pPr>
       <w:r>
-        <w:rPr>
-          <w:rFonts/>
-          <w:i w:val="true"/>
-          <w:strike w:val="false"/>
-        </w:rPr>
-        <w:t xml:space="preserve">Nota. </w:t>
-      </w:r>
-      <w:r>
         <w:t xml:space="preserve">Base: 39 estudiantes, 67 egresados, 18 docentes, 12 autoridades, 17 administrativos y 26 empleadores. Fuente: PULSO PUCP 2026.</w:t>
       </w:r>
     </w:p>
@@ -17771,14 +17523,6 @@
         <w:pStyle w:val="BaseFuente"/>
       </w:pPr>
       <w:r>
-        <w:rPr>
-          <w:rFonts/>
-          <w:i w:val="true"/>
-          <w:strike w:val="false"/>
-        </w:rPr>
-        <w:t xml:space="preserve">Nota. </w:t>
-      </w:r>
-      <w:r>
         <w:t xml:space="preserve">Base: 224: 52 docentes y 172 estudiantes. Fuente: PULSO PUCP 2026.</w:t>
       </w:r>
     </w:p>
@@ -17930,14 +17674,6 @@
         <w:pStyle w:val="BaseFuente"/>
       </w:pPr>
       <w:r>
-        <w:rPr>
-          <w:rFonts/>
-          <w:i w:val="true"/>
-          <w:strike w:val="false"/>
-        </w:rPr>
-        <w:t xml:space="preserve">Nota. </w:t>
-      </w:r>
-      <w:r>
         <w:t xml:space="preserve">Base: 201 estudiantes. Fuente: PULSO PUCP 2026.</w:t>
       </w:r>
     </w:p>
@@ -18053,14 +17789,6 @@
         <w:pStyle w:val="BaseFuente"/>
       </w:pPr>
       <w:r>
-        <w:rPr>
-          <w:rFonts/>
-          <w:i w:val="true"/>
-          <w:strike w:val="false"/>
-        </w:rPr>
-        <w:t xml:space="preserve">Nota. </w:t>
-      </w:r>
-      <w:r>
         <w:t xml:space="preserve">Base: 20 estudiantes que respondieron «Sí» en la pregunta anterior. Fuente: PULSO PUCP 2026.</w:t>
       </w:r>
     </w:p>
@@ -18212,14 +17940,6 @@
         <w:pStyle w:val="BaseFuente"/>
       </w:pPr>
       <w:r>
-        <w:rPr>
-          <w:rFonts/>
-          <w:i w:val="true"/>
-          <w:strike w:val="false"/>
-        </w:rPr>
-        <w:t xml:space="preserve">Nota. </w:t>
-      </w:r>
-      <w:r>
         <w:t xml:space="preserve">Base: 12 autoridades. Con menos de 30 casos se lee la frecuencia entre paréntesis. Fuente: PULSO PUCP 2026.</w:t>
       </w:r>
     </w:p>
@@ -18371,14 +18091,6 @@
         <w:pStyle w:val="BaseFuente"/>
       </w:pPr>
       <w:r>
-        <w:rPr>
-          <w:rFonts/>
-          <w:i w:val="true"/>
-          <w:strike w:val="false"/>
-        </w:rPr>
-        <w:t xml:space="preserve">Nota. </w:t>
-      </w:r>
-      <w:r>
         <w:t xml:space="preserve">Base: 201 estudiantes, 92 docentes y 25 administrativos. Fuente: PULSO PUCP 2026.</w:t>
       </w:r>
     </w:p>
@@ -18530,14 +18242,6 @@
         <w:pStyle w:val="BaseFuente"/>
       </w:pPr>
       <w:r>
-        <w:rPr>
-          <w:rFonts/>
-          <w:i w:val="true"/>
-          <w:strike w:val="false"/>
-        </w:rPr>
-        <w:t xml:space="preserve">Nota. </w:t>
-      </w:r>
-      <w:r>
         <w:t xml:space="preserve">Base: 1,234 estudiantes, 148 docentes y 43 administrativos. Fuente: PULSO PUCP 2026.</w:t>
       </w:r>
     </w:p>
@@ -18689,14 +18393,6 @@
         <w:pStyle w:val="BaseFuente"/>
       </w:pPr>
       <w:r>
-        <w:rPr>
-          <w:rFonts/>
-          <w:i w:val="true"/>
-          <w:strike w:val="false"/>
-        </w:rPr>
-        <w:t xml:space="preserve">Nota. </w:t>
-      </w:r>
-      <w:r>
         <w:t xml:space="preserve">Base: 1,234 estudiantes: 410 de primeros ciclos, 452 de ciclos intermedios y 372 de últimos ciclos. Fuente: PULSO PUCP 2026.</w:t>
       </w:r>
     </w:p>
@@ -18889,14 +18585,6 @@
         <w:pStyle w:val="BaseFuente"/>
       </w:pPr>
       <w:r>
-        <w:rPr>
-          <w:rFonts/>
-          <w:i w:val="true"/>
-          <w:strike w:val="false"/>
-        </w:rPr>
-        <w:t xml:space="preserve">Nota. </w:t>
-      </w:r>
-      <w:r>
         <w:t xml:space="preserve">Base: 1,234 estudiantes, 314 egresados y 148 docentes. Fuente: PULSO PUCP 2026.</w:t>
       </w:r>
     </w:p>
@@ -19048,14 +18736,6 @@
         <w:pStyle w:val="BaseFuente"/>
       </w:pPr>
       <w:r>
-        <w:rPr>
-          <w:rFonts/>
-          <w:i w:val="true"/>
-          <w:strike w:val="false"/>
-        </w:rPr>
-        <w:t xml:space="preserve">Nota. </w:t>
-      </w:r>
-      <w:r>
         <w:t xml:space="preserve">Base: 148 docentes. Fuente: PULSO PUCP 2026.</w:t>
       </w:r>
     </w:p>
@@ -19207,14 +18887,6 @@
         <w:pStyle w:val="BaseFuente"/>
       </w:pPr>
       <w:r>
-        <w:rPr>
-          <w:rFonts/>
-          <w:i w:val="true"/>
-          <w:strike w:val="false"/>
-        </w:rPr>
-        <w:t xml:space="preserve">Nota. </w:t>
-      </w:r>
-      <w:r>
         <w:t xml:space="preserve">Base: 1,234 estudiantes, 314 egresados y 148 docentes. Fuente: PULSO PUCP 2026.</w:t>
       </w:r>
     </w:p>
@@ -19366,14 +19038,6 @@
         <w:pStyle w:val="BaseFuente"/>
       </w:pPr>
       <w:r>
-        <w:rPr>
-          <w:rFonts/>
-          <w:i w:val="true"/>
-          <w:strike w:val="false"/>
-        </w:rPr>
-        <w:t xml:space="preserve">Nota. </w:t>
-      </w:r>
-      <w:r>
         <w:t xml:space="preserve">Base: 1,234 estudiantes en 2026 y 1,102 en 2021. 2021: informe consolidado anterior. Fuente: PULSO PUCP 2026.</w:t>
       </w:r>
     </w:p>
@@ -20649,14 +20313,6 @@
       <w:pPr>
         <w:pStyle w:val="BaseFuente"/>
       </w:pPr>
-      <w:r>
-        <w:rPr>
-          <w:rFonts/>
-          <w:i w:val="true"/>
-          <w:strike w:val="false"/>
-        </w:rPr>
-        <w:t xml:space="preserve">Nota. </w:t>
-      </w:r>
       <w:r>
         <w:t xml:space="preserve">Base: 52 docentes, 172 estudiantes, 178 egresados, 15 administrativos. Prueba z para proporciones (Agresti, 2013) con corrección de Bonferroni dentro de la fila (Dunn, 1961), α = 0.05. Fuente: PULSO PUCP 2026.</w:t>
       </w:r>
@@ -20773,14 +20429,6 @@
         <w:pStyle w:val="BaseFuente"/>
       </w:pPr>
       <w:r>
-        <w:rPr>
-          <w:rFonts/>
-          <w:i w:val="true"/>
-          <w:strike w:val="false"/>
-        </w:rPr>
-        <w:t xml:space="preserve">Nota. </w:t>
-      </w:r>
-      <w:r>
         <w:t xml:space="preserve">Base: 52 docentes, 172 estudiantes, 178 egresados, 15 administrativos. Las letras indican frente a qué públicos la cifra es significativamente mayor. Fuente: PULSO PUCP 2026.</w:t>
       </w:r>
     </w:p>
@@ -22271,14 +21919,6 @@
         <w:pStyle w:val="BaseFuente"/>
       </w:pPr>
       <w:r>
-        <w:rPr>
-          <w:rFonts/>
-          <w:i w:val="true"/>
-          <w:strike w:val="false"/>
-        </w:rPr>
-        <w:t xml:space="preserve">Nota. </w:t>
-      </w:r>
-      <w:r>
         <w:t xml:space="preserve">Base: ejemplo ficticio con 250 casos. El punto repartido va a «En desacuerdo», la categoría con mayor resto (0.4).</w:t>
       </w:r>
     </w:p>
@@ -23133,14 +22773,6 @@
       <w:pPr>
         <w:pStyle w:val="BaseFuente"/>
       </w:pPr>
-      <w:r>
-        <w:rPr>
-          <w:rFonts/>
-          <w:i w:val="true"/>
-          <w:strike w:val="false"/>
-        </w:rPr>
-        <w:t xml:space="preserve">Nota. </w:t>
-      </w:r>
       <w:r>
         <w:t xml:space="preserve">Fuente: PULSO PUCP 2026.</w:t>
       </w:r>
@@ -24798,14 +24430,6 @@
       <w:pPr>
         <w:pStyle w:val="BaseFuente"/>
       </w:pPr>
-      <w:r>
-        <w:rPr>
-          <w:rFonts/>
-          <w:i w:val="true"/>
-          <w:strike w:val="false"/>
-        </w:rPr>
-        <w:t xml:space="preserve">Nota. </w:t>
-      </w:r>
       <w:r>
         <w:t xml:space="preserve">Base: 51 docentes, 109 estudiantes y 161 egresados. Fuente: PULSO PUCP 2026.</w:t>
       </w:r>
@@ -26878,14 +26502,6 @@
         <w:pStyle w:val="BaseFuente"/>
       </w:pPr>
       <w:r>
-        <w:rPr>
-          <w:rFonts/>
-          <w:i w:val="true"/>
-          <w:strike w:val="false"/>
-        </w:rPr>
-        <w:t xml:space="preserve">Nota. </w:t>
-      </w:r>
-      <w:r>
         <w:t xml:space="preserve">Base: 52 docentes y 172 estudiantes. Fuente: PULSO PUCP 2026.</w:t>
       </w:r>
     </w:p>
@@ -28677,14 +28293,6 @@
         <w:pStyle w:val="BaseFuente"/>
       </w:pPr>
       <w:r>
-        <w:rPr>
-          <w:rFonts/>
-          <w:i w:val="true"/>
-          <w:strike w:val="false"/>
-        </w:rPr>
-        <w:t xml:space="preserve">Nota. </w:t>
-      </w:r>
-      <w:r>
         <w:t xml:space="preserve">Base: 62 respuestas en «Otros». Fuente: PULSO PUCP 2026.</w:t>
       </w:r>
     </w:p>
@@ -30594,14 +30202,6 @@
       <w:pPr>
         <w:pStyle w:val="BaseFuente"/>
       </w:pPr>
-      <w:r>
-        <w:rPr>
-          <w:rFonts/>
-          <w:i w:val="true"/>
-          <w:strike w:val="false"/>
-        </w:rPr>
-        <w:t xml:space="preserve">Nota. </w:t>
-      </w:r>
       <w:r>
         <w:t xml:space="preserve">Base: 12 autoridades. Fuente: PULSO PUCP 2026.</w:t>
       </w:r>
@@ -31266,14 +30866,6 @@
         <w:pStyle w:val="BaseFuente"/>
       </w:pPr>
       <w:r>
-        <w:rPr>
-          <w:rFonts/>
-          <w:i w:val="true"/>
-          <w:strike w:val="false"/>
-        </w:rPr>
-        <w:t xml:space="preserve">Nota. </w:t>
-      </w:r>
-      <w:r>
         <w:t xml:space="preserve">Base: 52 docentes, 172 estudiantes, 178 egresados y 15 administrativos. Fuente: PULSO PUCP 2026.</w:t>
       </w:r>
     </w:p>
@@ -31441,14 +31033,6 @@
         <w:pStyle w:val="BaseFuente"/>
       </w:pPr>
       <w:r>
-        <w:rPr>
-          <w:rFonts/>
-          <w:i w:val="true"/>
-          <w:strike w:val="false"/>
-        </w:rPr>
-        <w:t xml:space="preserve">Nota. </w:t>
-      </w:r>
-      <w:r>
         <w:t xml:space="preserve">Base: 52 docentes y 178 egresados. Fuente: PULSO PUCP 2026.</w:t>
       </w:r>
     </w:p>
@@ -31594,14 +31178,6 @@
         <w:pStyle w:val="BaseFuente"/>
       </w:pPr>
       <w:r>
-        <w:rPr>
-          <w:rFonts/>
-          <w:i w:val="true"/>
-          <w:strike w:val="false"/>
-        </w:rPr>
-        <w:t xml:space="preserve">Nota. </w:t>
-      </w:r>
-      <w:r>
         <w:t xml:space="preserve">Base: 176 egresados. Fuente: PULSO PUCP 2026.</w:t>
       </w:r>
     </w:p>
@@ -31717,14 +31293,6 @@
         <w:pStyle w:val="BaseFuente"/>
       </w:pPr>
       <w:r>
-        <w:rPr>
-          <w:rFonts/>
-          <w:i w:val="true"/>
-          <w:strike w:val="false"/>
-        </w:rPr>
-        <w:t xml:space="preserve">Nota. </w:t>
-      </w:r>
-      <w:r>
         <w:t xml:space="preserve">Base: 172 egresados. Fuente: PULSO PUCP 2026.</w:t>
       </w:r>
     </w:p>
@@ -31876,14 +31444,6 @@
         <w:pStyle w:val="BaseFuente"/>
       </w:pPr>
       <w:r>
-        <w:rPr>
-          <w:rFonts/>
-          <w:i w:val="true"/>
-          <w:strike w:val="false"/>
-        </w:rPr>
-        <w:t xml:space="preserve">Nota. </w:t>
-      </w:r>
-      <w:r>
         <w:t xml:space="preserve">Base: 1,200 entrevistados: 312 de 18 a 29 años, 641 de 30 a 59 y 247 de 60 a más. Cifras ficticias. Fuente: PULSO PUCP 2026.</w:t>
       </w:r>
     </w:p>
@@ -31999,14 +31559,6 @@
         <w:pStyle w:val="BaseFuente"/>
       </w:pPr>
       <w:r>
-        <w:rPr>
-          <w:rFonts/>
-          <w:i w:val="true"/>
-          <w:strike w:val="false"/>
-        </w:rPr>
-        <w:t xml:space="preserve">Nota. </w:t>
-      </w:r>
-      <w:r>
         <w:t xml:space="preserve">Base: 1,200 entrevistados en cada ola. Cifras ficticias. Fuente: PULSO PUCP 2026.</w:t>
       </w:r>
     </w:p>
@@ -32199,14 +31751,6 @@
         <w:pStyle w:val="BaseFuente"/>
       </w:pPr>
       <w:r>
-        <w:rPr>
-          <w:rFonts/>
-          <w:i w:val="true"/>
-          <w:strike w:val="false"/>
-        </w:rPr>
-        <w:t xml:space="preserve">Nota. </w:t>
-      </w:r>
-      <w:r>
         <w:t xml:space="preserve">Base: 189 entrevistados. Selección ficticia sobre la cartografía de Lima Metropolitana y Callao (IMP PlanMet 2040). Fuente: PULSO PUCP 2026.</w:t>
       </w:r>
     </w:p>
@@ -32322,14 +31866,6 @@
         <w:pStyle w:val="BaseFuente"/>
       </w:pPr>
       <w:r>
-        <w:rPr>
-          <w:rFonts/>
-          <w:i w:val="true"/>
-          <w:strike w:val="false"/>
-        </w:rPr>
-        <w:t xml:space="preserve">Nota. </w:t>
-      </w:r>
-      <w:r>
         <w:t xml:space="preserve">Base: 99 entrevistados en distritos de intervención y 90 en distritos de comparación. Cifras ficticias. Fuente: PULSO PUCP 2026.</w:t>
       </w:r>
     </w:p>
@@ -32481,14 +32017,6 @@
         <w:pStyle w:val="BaseFuente"/>
       </w:pPr>
       <w:r>
-        <w:rPr>
-          <w:rFonts/>
-          <w:i w:val="true"/>
-          <w:strike w:val="false"/>
-        </w:rPr>
-        <w:t xml:space="preserve">Nota. </w:t>
-      </w:r>
-      <w:r>
         <w:t xml:space="preserve">La línea coral marca la meta. N = 2,296 hogares entrevistados por teléfono. Cifras ficticias. Fuente: PULSO PUCP 2026.</w:t>
       </w:r>
     </w:p>
@@ -32659,14 +32187,6 @@
         <w:pStyle w:val="BaseFuente"/>
       </w:pPr>
       <w:r>
-        <w:rPr>
-          <w:rFonts/>
-          <w:i w:val="true"/>
-          <w:strike w:val="false"/>
-        </w:rPr>
-        <w:t xml:space="preserve">Nota. </w:t>
-      </w:r>
-      <w:r>
         <w:t xml:space="preserve">Base: 1,855 estudiantes encuestados en aula. Entre paréntesis, los casos de cada facultad. Cifras ficticias. Fuente: PULSO PUCP 2026.</w:t>
       </w:r>
     </w:p>
@@ -32818,14 +32338,6 @@
         <w:pStyle w:val="BaseFuente"/>
       </w:pPr>
       <w:r>
-        <w:rPr>
-          <w:rFonts/>
-          <w:i w:val="true"/>
-          <w:strike w:val="false"/>
-        </w:rPr>
-        <w:t xml:space="preserve">Nota. </w:t>
-      </w:r>
-      <w:r>
         <w:t xml:space="preserve">Base: 420 trabajadores y 38 directivos. Cifras ficticias. Fuente: PULSO PUCP 2026.</w:t>
       </w:r>
     </w:p>
@@ -32941,14 +32453,6 @@
         <w:pStyle w:val="BaseFuente"/>
       </w:pPr>
       <w:r>
-        <w:rPr>
-          <w:rFonts/>
-          <w:i w:val="true"/>
-          <w:strike w:val="false"/>
-        </w:rPr>
-        <w:t xml:space="preserve">Nota. </w:t>
-      </w:r>
-      <w:r>
         <w:t xml:space="preserve">Base: 38 directivos y 420 trabajadores. Cifras ficticias. Fuente: PULSO PUCP 2026.</w:t>
       </w:r>
     </w:p>
@@ -33129,14 +32633,6 @@
       <w:pPr>
         <w:pStyle w:val="BaseFuente"/>
       </w:pPr>
-      <w:r>
-        <w:rPr>
-          <w:rFonts/>
-          <w:i w:val="true"/>
-          <w:strike w:val="false"/>
-        </w:rPr>
-        <w:t xml:space="preserve">Nota. </w:t>
-      </w:r>
       <w:r>
         <w:t xml:space="preserve">Base: 312 participantes medidos en las dos ocasiones. Cifras ficticias. Fuente: PULSO PUCP 2026.</w:t>
       </w:r>

</xml_diff>

<commit_message>
docs(qa): propuesta en Word con más gráficos por tipo de estudio y lectura pegada a su gráfico
</commit_message>
<xml_diff>
--- a/docs/qa/motor-ppt-2026-10-06/4-recetario/propuesta-word.docx
+++ b/docs/qa/motor-ppt-2026-10-06/4-recetario/propuesta-word.docx
@@ -5208,7 +5208,7 @@
     </w:p>
     <w:p>
       <w:pPr>
-        <w:pStyle w:val="BaseFuente"/>
+        <w:pStyle w:val="BaseFuenteLectura"/>
       </w:pPr>
       <w:r>
         <w:t xml:space="preserve">Base: 148 docentes, 1,234 estudiantes y 314 egresados. Fuente: PULSO PUCP 2026.</w:t>
@@ -13040,7 +13040,7 @@
     </w:p>
     <w:p>
       <w:pPr>
-        <w:pStyle w:val="BaseFuente"/>
+        <w:pStyle w:val="BaseFuenteLectura"/>
       </w:pPr>
       <w:r>
         <w:t xml:space="preserve">Base: 167 egresados que respondieron. Fuente: PULSO PUCP 2026.</w:t>
@@ -18390,7 +18390,7 @@
     </w:p>
     <w:p>
       <w:pPr>
-        <w:pStyle w:val="BaseFuente"/>
+        <w:pStyle w:val="BaseFuenteLectura"/>
       </w:pPr>
       <w:r>
         <w:t xml:space="preserve">Base: 1,234 estudiantes: 410 de primeros ciclos, 452 de ciclos intermedios y 372 de últimos ciclos. Fuente: PULSO PUCP 2026.</w:t>
@@ -19035,7 +19035,7 @@
     </w:p>
     <w:p>
       <w:pPr>
-        <w:pStyle w:val="BaseFuente"/>
+        <w:pStyle w:val="BaseFuenteLectura"/>
       </w:pPr>
       <w:r>
         <w:t xml:space="preserve">Base: 1,234 estudiantes en 2026 y 1,102 en 2021. 2021: informe consolidado anterior. Fuente: PULSO PUCP 2026.</w:t>
@@ -20426,7 +20426,7 @@
     </w:p>
     <w:p>
       <w:pPr>
-        <w:pStyle w:val="BaseFuente"/>
+        <w:pStyle w:val="BaseFuenteLectura"/>
       </w:pPr>
       <w:r>
         <w:t xml:space="preserve">Base: 52 docentes, 172 estudiantes, 178 egresados, 15 administrativos. Las letras indican frente a qué públicos la cifra es significativamente mayor. Fuente: PULSO PUCP 2026.</w:t>
@@ -30863,7 +30863,7 @@
     </w:p>
     <w:p>
       <w:pPr>
-        <w:pStyle w:val="BaseFuente"/>
+        <w:pStyle w:val="BaseFuenteLectura"/>
       </w:pPr>
       <w:r>
         <w:t xml:space="preserve">Base: 52 docentes, 172 estudiantes, 178 egresados y 15 administrativos. Fuente: PULSO PUCP 2026.</w:t>
@@ -31030,7 +31030,7 @@
     </w:p>
     <w:p>
       <w:pPr>
-        <w:pStyle w:val="BaseFuente"/>
+        <w:pStyle w:val="BaseFuenteLectura"/>
       </w:pPr>
       <w:r>
         <w:t xml:space="preserve">Base: 52 docentes y 178 egresados. Fuente: PULSO PUCP 2026.</w:t>
@@ -31298,42 +31298,6 @@
     </w:p>
     <w:p>
       <w:pPr>
-        <w:pStyle w:val="Titre2"/>
-      </w:pPr>
-      <w:r>
-        <w:t xml:space="preserve">7.2. Opinión pública</w:t>
-      </w:r>
-    </w:p>
-    <w:p>
-      <w:pPr>
-        <w:pStyle w:val="Normal"/>
-        <w:keepNext/>
-        <w:pBdr>
-          <w:top w:val="none" w:sz="0" w:space="0" w:color="000000"/>
-          <w:left w:val="none" w:sz="0" w:space="0" w:color="000000"/>
-          <w:bottom w:val="none" w:sz="0" w:space="0" w:color="000000"/>
-          <w:right w:val="none" w:sz="0" w:space="0" w:color="000000"/>
-        </w:pBdr>
-        <w:spacing w:after="160" w:before="0" w:line="312"/>
-        <w:ind w:left="0" w:right="0" w:firstLine="0" w:firstLineChars="0"/>
-        <w:jc w:val="both"/>
-      </w:pPr>
-      <w:r>
-        <w:rPr>
-          <w:rFonts w:ascii="Arial" w:hAnsi="Arial" w:eastAsia="Arial" w:cs="Arial"/>
-          <w:i w:val="false"/>
-          <w:b w:val="false"/>
-          <w:u w:val="none"/>
-          <w:strike w:val="false"/>
-          <w:sz w:val="21"/>
-          <w:szCs w:val="21"/>
-          <w:color w:val="26303F"/>
-        </w:rPr>
-        <w:t xml:space="preserve">Encuesta a la población en una o varias olas. Las preguntas se cruzan por edad, sexo o zona, y la fila Total va al final.</w:t>
-      </w:r>
-    </w:p>
-    <w:p>
-      <w:pPr>
         <w:pStyle w:val="RotuloGrafico"/>
       </w:pPr>
       <w:r>
@@ -31381,7 +31345,7 @@
           <w:i w:val="true"/>
           <w:strike w:val="false"/>
         </w:rPr>
-        <w:t xml:space="preserve">La democracia es preferible a cualquier otra forma de gobierno, por grupo de edad</w:t>
+        <w:t xml:space="preserve">Top Two Box de las competencias del perfil de egreso, por actor</w:t>
       </w:r>
     </w:p>
     <w:p>
@@ -31402,7 +31366,7 @@
         <w:rPr/>
         <w:drawing>
           <wp:inline distT="0" distB="0" distL="0" distR="0">
-            <wp:extent cx="5733288" cy="2607869"/>
+            <wp:extent cx="5733288" cy="2176272"/>
             <wp:docPr id="113" name="" descr=""/>
             <wp:cNvGraphicFramePr>
               <a:graphicFrameLocks xmlns:a="http://schemas.openxmlformats.org/drawingml/2006/main" noChangeAspect="1"/>
@@ -31417,7 +31381,426 @@
                     </pic:cNvPicPr>
                   </pic:nvPicPr>
                   <pic:blipFill>
+                    <a:blip r:embed="rId43"/>
+                    <a:stretch>
+                      <a:fillRect/>
+                    </a:stretch>
+                  </pic:blipFill>
+                  <pic:spPr bwMode="auto">
+                    <a:xfrm>
+                      <a:off x="0" y="0"/>
+                      <a:ext cx="5733288" cy="2176272"/>
+                    </a:xfrm>
+                    <a:prstGeom prst="rect">
+                      <a:avLst/>
+                    </a:prstGeom>
+                    <a:noFill/>
+                  </pic:spPr>
+                </pic:pic>
+              </a:graphicData>
+            </a:graphic>
+          </wp:inline>
+        </w:drawing>
+      </w:r>
+    </w:p>
+    <w:p>
+      <w:pPr>
+        <w:pStyle w:val="BaseFuenteLectura"/>
+      </w:pPr>
+      <w:r>
+        <w:t xml:space="preserve">Base: 51 docentes, 109 estudiantes y 161 egresados. Fuente: PULSO PUCP 2026.</w:t>
+      </w:r>
+    </w:p>
+    <w:p>
+      <w:pPr>
+        <w:pStyle w:val="Lectura"/>
+      </w:pPr>
+      <w:r>
+        <w:t xml:space="preserve">Las seis competencias superan el </w:t>
+      </w:r>
+      <w:r>
+        <w:rPr>
+          <w:rFonts/>
+          <w:b w:val="true"/>
+          <w:strike w:val="false"/>
+        </w:rPr>
+        <w:t xml:space="preserve">90%</w:t>
+      </w:r>
+      <w:r>
+        <w:t xml:space="preserve"> de acuerdo en los tres públicos. Las diferencias entre públicos son de pocos puntos.</w:t>
+      </w:r>
+    </w:p>
+    <w:p>
+      <w:pPr>
+        <w:pStyle w:val="RotuloGrafico"/>
+      </w:pPr>
+      <w:r>
+        <w:rPr>
+          <w:rStyle w:val="NumeroRotulo"/>
+        </w:rPr>
+        <w:t xml:space="preserve">Gráfico </w:t>
+      </w:r>
+      <w:r>
+        <w:rPr>
+          <w:rStyle w:val="NumeroRotulo"/>
+        </w:rPr>
+        <w:fldChar w:fldCharType="begin"/>
+      </w:r>
+      <w:r>
+        <w:rPr>
+          <w:rStyle w:val="NumeroRotulo"/>
+        </w:rPr>
+        <w:instrText xml:space="preserve"> SEQ Gráfico \* ARABIC </w:instrText>
+      </w:r>
+      <w:r>
+        <w:rPr>
+          <w:rStyle w:val="NumeroRotulo"/>
+        </w:rPr>
+        <w:fldChar w:fldCharType="separate"/>
+      </w:r>
+      <w:r>
+        <w:rPr>
+          <w:rStyle w:val="NumeroRotulo"/>
+        </w:rPr>
+        <w:t>47</w:t>
+      </w:r>
+      <w:r>
+        <w:rPr>
+          <w:rStyle w:val="NumeroRotulo"/>
+        </w:rPr>
+        <w:fldChar w:fldCharType="end"/>
+      </w:r>
+      <w:r>
+        <w:br w:type="textWrapping"/>
+      </w:r>
+      <w:r>
+        <w:rPr>
+          <w:rFonts/>
+          <w:i w:val="true"/>
+          <w:strike w:val="false"/>
+        </w:rPr>
+        <w:t xml:space="preserve">Valoración del personal administrativo sobre su gestión y desarrollo</w:t>
+      </w:r>
+    </w:p>
+    <w:p>
+      <w:pPr>
+        <w:pStyle w:val="Normal"/>
+        <w:keepNext/>
+        <w:pBdr>
+          <w:top w:val="none" w:sz="0" w:space="0" w:color="000000"/>
+          <w:left w:val="none" w:sz="0" w:space="0" w:color="000000"/>
+          <w:bottom w:val="none" w:sz="0" w:space="0" w:color="000000"/>
+          <w:right w:val="none" w:sz="0" w:space="0" w:color="000000"/>
+        </w:pBdr>
+        <w:spacing w:after="0" w:before="0" w:line="240"/>
+        <w:ind w:left="0" w:right="0" w:firstLine="0" w:firstLineChars="0"/>
+        <w:jc w:val="center"/>
+      </w:pPr>
+      <w:r>
+        <w:rPr/>
+        <w:drawing>
+          <wp:inline distT="0" distB="0" distL="0" distR="0">
+            <wp:extent cx="5733288" cy="5452019"/>
+            <wp:docPr id="115" name="" descr=""/>
+            <wp:cNvGraphicFramePr>
+              <a:graphicFrameLocks xmlns:a="http://schemas.openxmlformats.org/drawingml/2006/main" noChangeAspect="1"/>
+            </wp:cNvGraphicFramePr>
+            <a:graphic xmlns:a="http://schemas.openxmlformats.org/drawingml/2006/main">
+              <a:graphicData uri="http://schemas.openxmlformats.org/drawingml/2006/picture">
+                <pic:pic xmlns:pic="http://schemas.openxmlformats.org/drawingml/2006/picture">
+                  <pic:nvPicPr>
+                    <pic:cNvPr id="116" name=""/>
+                    <pic:cNvPicPr>
+                      <a:picLocks noChangeAspect="1" noChangeArrowheads="1"/>
+                    </pic:cNvPicPr>
+                  </pic:nvPicPr>
+                  <pic:blipFill>
                     <a:blip r:embed="rId67"/>
+                    <a:stretch>
+                      <a:fillRect/>
+                    </a:stretch>
+                  </pic:blipFill>
+                  <pic:spPr bwMode="auto">
+                    <a:xfrm>
+                      <a:off x="0" y="0"/>
+                      <a:ext cx="5733288" cy="5452019"/>
+                    </a:xfrm>
+                    <a:prstGeom prst="rect">
+                      <a:avLst/>
+                    </a:prstGeom>
+                    <a:noFill/>
+                  </pic:spPr>
+                </pic:pic>
+              </a:graphicData>
+            </a:graphic>
+          </wp:inline>
+        </w:drawing>
+      </w:r>
+    </w:p>
+    <w:p>
+      <w:pPr>
+        <w:pStyle w:val="BaseFuente"/>
+      </w:pPr>
+      <w:r>
+        <w:t xml:space="preserve">Base: 15 administrativos. Fuente: PULSO PUCP 2026.</w:t>
+      </w:r>
+    </w:p>
+    <w:p>
+      <w:pPr>
+        <w:pStyle w:val="RotuloGrafico"/>
+      </w:pPr>
+      <w:r>
+        <w:rPr>
+          <w:rStyle w:val="NumeroRotulo"/>
+        </w:rPr>
+        <w:t xml:space="preserve">Gráfico </w:t>
+      </w:r>
+      <w:r>
+        <w:rPr>
+          <w:rStyle w:val="NumeroRotulo"/>
+        </w:rPr>
+        <w:fldChar w:fldCharType="begin"/>
+      </w:r>
+      <w:r>
+        <w:rPr>
+          <w:rStyle w:val="NumeroRotulo"/>
+        </w:rPr>
+        <w:instrText xml:space="preserve"> SEQ Gráfico \* ARABIC </w:instrText>
+      </w:r>
+      <w:r>
+        <w:rPr>
+          <w:rStyle w:val="NumeroRotulo"/>
+        </w:rPr>
+        <w:fldChar w:fldCharType="separate"/>
+      </w:r>
+      <w:r>
+        <w:rPr>
+          <w:rStyle w:val="NumeroRotulo"/>
+        </w:rPr>
+        <w:t>48</w:t>
+      </w:r>
+      <w:r>
+        <w:rPr>
+          <w:rStyle w:val="NumeroRotulo"/>
+        </w:rPr>
+        <w:fldChar w:fldCharType="end"/>
+      </w:r>
+      <w:r>
+        <w:br w:type="textWrapping"/>
+      </w:r>
+      <w:r>
+        <w:rPr>
+          <w:rFonts/>
+          <w:i w:val="true"/>
+          <w:strike w:val="false"/>
+        </w:rPr>
+        <w:t xml:space="preserve">Nivel curricular, estudiantes</w:t>
+      </w:r>
+    </w:p>
+    <w:p>
+      <w:pPr>
+        <w:pStyle w:val="Normal"/>
+        <w:keepNext/>
+        <w:pBdr>
+          <w:top w:val="none" w:sz="0" w:space="0" w:color="000000"/>
+          <w:left w:val="none" w:sz="0" w:space="0" w:color="000000"/>
+          <w:bottom w:val="none" w:sz="0" w:space="0" w:color="000000"/>
+          <w:right w:val="none" w:sz="0" w:space="0" w:color="000000"/>
+        </w:pBdr>
+        <w:spacing w:after="0" w:before="0" w:line="240"/>
+        <w:ind w:left="0" w:right="0" w:firstLine="0" w:firstLineChars="0"/>
+        <w:jc w:val="center"/>
+      </w:pPr>
+      <w:r>
+        <w:rPr/>
+        <w:drawing>
+          <wp:inline distT="0" distB="0" distL="0" distR="0">
+            <wp:extent cx="5733288" cy="1810512"/>
+            <wp:docPr id="117" name="" descr=""/>
+            <wp:cNvGraphicFramePr>
+              <a:graphicFrameLocks xmlns:a="http://schemas.openxmlformats.org/drawingml/2006/main" noChangeAspect="1"/>
+            </wp:cNvGraphicFramePr>
+            <a:graphic xmlns:a="http://schemas.openxmlformats.org/drawingml/2006/main">
+              <a:graphicData uri="http://schemas.openxmlformats.org/drawingml/2006/picture">
+                <pic:pic xmlns:pic="http://schemas.openxmlformats.org/drawingml/2006/picture">
+                  <pic:nvPicPr>
+                    <pic:cNvPr id="118" name=""/>
+                    <pic:cNvPicPr>
+                      <a:picLocks noChangeAspect="1" noChangeArrowheads="1"/>
+                    </pic:cNvPicPr>
+                  </pic:nvPicPr>
+                  <pic:blipFill>
+                    <a:blip r:embed="rId68"/>
+                    <a:stretch>
+                      <a:fillRect/>
+                    </a:stretch>
+                  </pic:blipFill>
+                  <pic:spPr bwMode="auto">
+                    <a:xfrm>
+                      <a:off x="0" y="0"/>
+                      <a:ext cx="5733288" cy="1810512"/>
+                    </a:xfrm>
+                    <a:prstGeom prst="rect">
+                      <a:avLst/>
+                    </a:prstGeom>
+                    <a:noFill/>
+                  </pic:spPr>
+                </pic:pic>
+              </a:graphicData>
+            </a:graphic>
+          </wp:inline>
+        </w:drawing>
+      </w:r>
+    </w:p>
+    <w:p>
+      <w:pPr>
+        <w:pStyle w:val="BaseFuenteLectura"/>
+      </w:pPr>
+      <w:r>
+        <w:t xml:space="preserve">Base: 172 estudiantes. Fuente: PULSO PUCP 2026.</w:t>
+      </w:r>
+    </w:p>
+    <w:p>
+      <w:pPr>
+        <w:pStyle w:val="Lectura"/>
+      </w:pPr>
+      <w:r>
+        <w:t xml:space="preserve">La mayor parte de los estudiantes encuestados cursa noveno ciclo (</w:t>
+      </w:r>
+      <w:r>
+        <w:rPr>
+          <w:rFonts/>
+          <w:b w:val="true"/>
+          <w:strike w:val="false"/>
+        </w:rPr>
+        <w:t xml:space="preserve">21%</w:t>
+      </w:r>
+      <w:r>
+        <w:t xml:space="preserve">).</w:t>
+      </w:r>
+    </w:p>
+    <w:p>
+      <w:pPr>
+        <w:pStyle w:val="Titre2"/>
+      </w:pPr>
+      <w:r>
+        <w:t xml:space="preserve">7.2. Opinión pública</w:t>
+      </w:r>
+    </w:p>
+    <w:p>
+      <w:pPr>
+        <w:pStyle w:val="Normal"/>
+        <w:keepNext/>
+        <w:pBdr>
+          <w:top w:val="none" w:sz="0" w:space="0" w:color="000000"/>
+          <w:left w:val="none" w:sz="0" w:space="0" w:color="000000"/>
+          <w:bottom w:val="none" w:sz="0" w:space="0" w:color="000000"/>
+          <w:right w:val="none" w:sz="0" w:space="0" w:color="000000"/>
+        </w:pBdr>
+        <w:spacing w:after="160" w:before="0" w:line="312"/>
+        <w:ind w:left="0" w:right="0" w:firstLine="0" w:firstLineChars="0"/>
+        <w:jc w:val="both"/>
+      </w:pPr>
+      <w:r>
+        <w:rPr>
+          <w:rFonts w:ascii="Arial" w:hAnsi="Arial" w:eastAsia="Arial" w:cs="Arial"/>
+          <w:i w:val="false"/>
+          <w:b w:val="false"/>
+          <w:u w:val="none"/>
+          <w:strike w:val="false"/>
+          <w:sz w:val="21"/>
+          <w:szCs w:val="21"/>
+          <w:color w:val="26303F"/>
+        </w:rPr>
+        <w:t xml:space="preserve">Encuesta a la población en una o varias olas. Las preguntas se cruzan por edad, sexo o zona, y la fila Total va al final.</w:t>
+      </w:r>
+    </w:p>
+    <w:p>
+      <w:pPr>
+        <w:pStyle w:val="RotuloGrafico"/>
+      </w:pPr>
+      <w:r>
+        <w:rPr>
+          <w:rStyle w:val="NumeroRotulo"/>
+        </w:rPr>
+        <w:t xml:space="preserve">Gráfico </w:t>
+      </w:r>
+      <w:r>
+        <w:rPr>
+          <w:rStyle w:val="NumeroRotulo"/>
+        </w:rPr>
+        <w:fldChar w:fldCharType="begin"/>
+      </w:r>
+      <w:r>
+        <w:rPr>
+          <w:rStyle w:val="NumeroRotulo"/>
+        </w:rPr>
+        <w:instrText xml:space="preserve"> SEQ Gráfico \* ARABIC </w:instrText>
+      </w:r>
+      <w:r>
+        <w:rPr>
+          <w:rStyle w:val="NumeroRotulo"/>
+        </w:rPr>
+        <w:fldChar w:fldCharType="separate"/>
+      </w:r>
+      <w:r>
+        <w:rPr>
+          <w:rStyle w:val="NumeroRotulo"/>
+        </w:rPr>
+        <w:t>49</w:t>
+      </w:r>
+      <w:r>
+        <w:rPr>
+          <w:rStyle w:val="NumeroRotulo"/>
+        </w:rPr>
+        <w:fldChar w:fldCharType="end"/>
+      </w:r>
+      <w:r>
+        <w:br w:type="textWrapping"/>
+      </w:r>
+      <w:r>
+        <w:rPr>
+          <w:rFonts/>
+          <w:i w:val="true"/>
+          <w:strike w:val="false"/>
+        </w:rPr>
+        <w:t xml:space="preserve">La democracia es preferible a cualquier otra forma de gobierno, por grupo de edad</w:t>
+      </w:r>
+    </w:p>
+    <w:p>
+      <w:pPr>
+        <w:pStyle w:val="Normal"/>
+        <w:keepNext/>
+        <w:pBdr>
+          <w:top w:val="none" w:sz="0" w:space="0" w:color="000000"/>
+          <w:left w:val="none" w:sz="0" w:space="0" w:color="000000"/>
+          <w:bottom w:val="none" w:sz="0" w:space="0" w:color="000000"/>
+          <w:right w:val="none" w:sz="0" w:space="0" w:color="000000"/>
+        </w:pBdr>
+        <w:spacing w:after="0" w:before="0" w:line="240"/>
+        <w:ind w:left="0" w:right="0" w:firstLine="0" w:firstLineChars="0"/>
+        <w:jc w:val="center"/>
+      </w:pPr>
+      <w:r>
+        <w:rPr/>
+        <w:drawing>
+          <wp:inline distT="0" distB="0" distL="0" distR="0">
+            <wp:extent cx="5733288" cy="2607869"/>
+            <wp:docPr id="119" name="" descr=""/>
+            <wp:cNvGraphicFramePr>
+              <a:graphicFrameLocks xmlns:a="http://schemas.openxmlformats.org/drawingml/2006/main" noChangeAspect="1"/>
+            </wp:cNvGraphicFramePr>
+            <a:graphic xmlns:a="http://schemas.openxmlformats.org/drawingml/2006/main">
+              <a:graphicData uri="http://schemas.openxmlformats.org/drawingml/2006/picture">
+                <pic:pic xmlns:pic="http://schemas.openxmlformats.org/drawingml/2006/picture">
+                  <pic:nvPicPr>
+                    <pic:cNvPr id="120" name=""/>
+                    <pic:cNvPicPr>
+                      <a:picLocks noChangeAspect="1" noChangeArrowheads="1"/>
+                    </pic:cNvPicPr>
+                  </pic:nvPicPr>
+                  <pic:blipFill>
+                    <a:blip r:embed="rId69"/>
                     <a:stretch>
                       <a:fillRect/>
                     </a:stretch>
@@ -31479,7 +31862,7 @@
         <w:rPr>
           <w:rStyle w:val="NumeroRotulo"/>
         </w:rPr>
-        <w:t>47</w:t>
+        <w:t>50</w:t>
       </w:r>
       <w:r>
         <w:rPr>
@@ -31518,7 +31901,7 @@
         <w:drawing>
           <wp:inline distT="0" distB="0" distL="0" distR="0">
             <wp:extent cx="5733288" cy="1993392"/>
-            <wp:docPr id="115" name="" descr=""/>
+            <wp:docPr id="121" name="" descr=""/>
             <wp:cNvGraphicFramePr>
               <a:graphicFrameLocks xmlns:a="http://schemas.openxmlformats.org/drawingml/2006/main" noChangeAspect="1"/>
             </wp:cNvGraphicFramePr>
@@ -31526,13 +31909,13 @@
               <a:graphicData uri="http://schemas.openxmlformats.org/drawingml/2006/picture">
                 <pic:pic xmlns:pic="http://schemas.openxmlformats.org/drawingml/2006/picture">
                   <pic:nvPicPr>
-                    <pic:cNvPr id="116" name=""/>
+                    <pic:cNvPr id="122" name=""/>
                     <pic:cNvPicPr>
                       <a:picLocks noChangeAspect="1" noChangeArrowheads="1"/>
                     </pic:cNvPicPr>
                   </pic:nvPicPr>
                   <pic:blipFill>
-                    <a:blip r:embed="rId68"/>
+                    <a:blip r:embed="rId70"/>
                     <a:stretch>
                       <a:fillRect/>
                     </a:stretch>
@@ -31556,7 +31939,7 @@
     </w:p>
     <w:p>
       <w:pPr>
-        <w:pStyle w:val="BaseFuente"/>
+        <w:pStyle w:val="BaseFuenteLectura"/>
       </w:pPr>
       <w:r>
         <w:t xml:space="preserve">Base: 1,200 entrevistados en cada ola. Cifras ficticias. Fuente: PULSO PUCP 2026.</w:t>
@@ -31601,6 +31984,236 @@
       </w:r>
       <w:r>
         <w:t xml:space="preserve"> en diciembre.</w:t>
+      </w:r>
+    </w:p>
+    <w:p>
+      <w:pPr>
+        <w:pStyle w:val="RotuloGrafico"/>
+      </w:pPr>
+      <w:r>
+        <w:rPr>
+          <w:rStyle w:val="NumeroRotulo"/>
+        </w:rPr>
+        <w:t xml:space="preserve">Gráfico </w:t>
+      </w:r>
+      <w:r>
+        <w:rPr>
+          <w:rStyle w:val="NumeroRotulo"/>
+        </w:rPr>
+        <w:fldChar w:fldCharType="begin"/>
+      </w:r>
+      <w:r>
+        <w:rPr>
+          <w:rStyle w:val="NumeroRotulo"/>
+        </w:rPr>
+        <w:instrText xml:space="preserve"> SEQ Gráfico \* ARABIC </w:instrText>
+      </w:r>
+      <w:r>
+        <w:rPr>
+          <w:rStyle w:val="NumeroRotulo"/>
+        </w:rPr>
+        <w:fldChar w:fldCharType="separate"/>
+      </w:r>
+      <w:r>
+        <w:rPr>
+          <w:rStyle w:val="NumeroRotulo"/>
+        </w:rPr>
+        <w:t>51</w:t>
+      </w:r>
+      <w:r>
+        <w:rPr>
+          <w:rStyle w:val="NumeroRotulo"/>
+        </w:rPr>
+        <w:fldChar w:fldCharType="end"/>
+      </w:r>
+      <w:r>
+        <w:br w:type="textWrapping"/>
+      </w:r>
+      <w:r>
+        <w:rPr>
+          <w:rFonts/>
+          <w:i w:val="true"/>
+          <w:strike w:val="false"/>
+        </w:rPr>
+        <w:t xml:space="preserve">Opinión sobre la gestión, Lima Metropolitana frente al resto del país</w:t>
+      </w:r>
+    </w:p>
+    <w:p>
+      <w:pPr>
+        <w:pStyle w:val="Normal"/>
+        <w:keepNext/>
+        <w:pBdr>
+          <w:top w:val="none" w:sz="0" w:space="0" w:color="000000"/>
+          <w:left w:val="none" w:sz="0" w:space="0" w:color="000000"/>
+          <w:bottom w:val="none" w:sz="0" w:space="0" w:color="000000"/>
+          <w:right w:val="none" w:sz="0" w:space="0" w:color="000000"/>
+        </w:pBdr>
+        <w:spacing w:after="0" w:before="0" w:line="240"/>
+        <w:ind w:left="0" w:right="0" w:firstLine="0" w:firstLineChars="0"/>
+        <w:jc w:val="center"/>
+      </w:pPr>
+      <w:r>
+        <w:rPr/>
+        <w:drawing>
+          <wp:inline distT="0" distB="0" distL="0" distR="0">
+            <wp:extent cx="5733288" cy="1993392"/>
+            <wp:docPr id="123" name="" descr=""/>
+            <wp:cNvGraphicFramePr>
+              <a:graphicFrameLocks xmlns:a="http://schemas.openxmlformats.org/drawingml/2006/main" noChangeAspect="1"/>
+            </wp:cNvGraphicFramePr>
+            <a:graphic xmlns:a="http://schemas.openxmlformats.org/drawingml/2006/main">
+              <a:graphicData uri="http://schemas.openxmlformats.org/drawingml/2006/picture">
+                <pic:pic xmlns:pic="http://schemas.openxmlformats.org/drawingml/2006/picture">
+                  <pic:nvPicPr>
+                    <pic:cNvPr id="124" name=""/>
+                    <pic:cNvPicPr>
+                      <a:picLocks noChangeAspect="1" noChangeArrowheads="1"/>
+                    </pic:cNvPicPr>
+                  </pic:nvPicPr>
+                  <pic:blipFill>
+                    <a:blip r:embed="rId71"/>
+                    <a:stretch>
+                      <a:fillRect/>
+                    </a:stretch>
+                  </pic:blipFill>
+                  <pic:spPr bwMode="auto">
+                    <a:xfrm>
+                      <a:off x="0" y="0"/>
+                      <a:ext cx="5733288" cy="1993392"/>
+                    </a:xfrm>
+                    <a:prstGeom prst="rect">
+                      <a:avLst/>
+                    </a:prstGeom>
+                    <a:noFill/>
+                  </pic:spPr>
+                </pic:pic>
+              </a:graphicData>
+            </a:graphic>
+          </wp:inline>
+        </w:drawing>
+      </w:r>
+    </w:p>
+    <w:p>
+      <w:pPr>
+        <w:pStyle w:val="BaseFuente"/>
+      </w:pPr>
+      <w:r>
+        <w:t xml:space="preserve">Base: 1,200 entrevistados: 480 en Lima Metropolitana y 720 en el resto del país. Cifras ficticias. Fuente: PULSO PUCP 2026.</w:t>
+      </w:r>
+    </w:p>
+    <w:p>
+      <w:pPr>
+        <w:pStyle w:val="RotuloGrafico"/>
+      </w:pPr>
+      <w:r>
+        <w:rPr>
+          <w:rStyle w:val="NumeroRotulo"/>
+        </w:rPr>
+        <w:t xml:space="preserve">Gráfico </w:t>
+      </w:r>
+      <w:r>
+        <w:rPr>
+          <w:rStyle w:val="NumeroRotulo"/>
+        </w:rPr>
+        <w:fldChar w:fldCharType="begin"/>
+      </w:r>
+      <w:r>
+        <w:rPr>
+          <w:rStyle w:val="NumeroRotulo"/>
+        </w:rPr>
+        <w:instrText xml:space="preserve"> SEQ Gráfico \* ARABIC </w:instrText>
+      </w:r>
+      <w:r>
+        <w:rPr>
+          <w:rStyle w:val="NumeroRotulo"/>
+        </w:rPr>
+        <w:fldChar w:fldCharType="separate"/>
+      </w:r>
+      <w:r>
+        <w:rPr>
+          <w:rStyle w:val="NumeroRotulo"/>
+        </w:rPr>
+        <w:t>52</w:t>
+      </w:r>
+      <w:r>
+        <w:rPr>
+          <w:rStyle w:val="NumeroRotulo"/>
+        </w:rPr>
+        <w:fldChar w:fldCharType="end"/>
+      </w:r>
+      <w:r>
+        <w:br w:type="textWrapping"/>
+      </w:r>
+      <w:r>
+        <w:rPr>
+          <w:rFonts/>
+          <w:i w:val="true"/>
+          <w:strike w:val="false"/>
+        </w:rPr>
+        <w:t xml:space="preserve">¿Cuál es el principal problema del país?</w:t>
+      </w:r>
+    </w:p>
+    <w:p>
+      <w:pPr>
+        <w:pStyle w:val="Normal"/>
+        <w:keepNext/>
+        <w:pBdr>
+          <w:top w:val="none" w:sz="0" w:space="0" w:color="000000"/>
+          <w:left w:val="none" w:sz="0" w:space="0" w:color="000000"/>
+          <w:bottom w:val="none" w:sz="0" w:space="0" w:color="000000"/>
+          <w:right w:val="none" w:sz="0" w:space="0" w:color="000000"/>
+        </w:pBdr>
+        <w:spacing w:after="0" w:before="0" w:line="240"/>
+        <w:ind w:left="0" w:right="0" w:firstLine="0" w:firstLineChars="0"/>
+        <w:jc w:val="center"/>
+      </w:pPr>
+      <w:r>
+        <w:rPr/>
+        <w:drawing>
+          <wp:inline distT="0" distB="0" distL="0" distR="0">
+            <wp:extent cx="5733288" cy="2212848"/>
+            <wp:docPr id="125" name="" descr=""/>
+            <wp:cNvGraphicFramePr>
+              <a:graphicFrameLocks xmlns:a="http://schemas.openxmlformats.org/drawingml/2006/main" noChangeAspect="1"/>
+            </wp:cNvGraphicFramePr>
+            <a:graphic xmlns:a="http://schemas.openxmlformats.org/drawingml/2006/main">
+              <a:graphicData uri="http://schemas.openxmlformats.org/drawingml/2006/picture">
+                <pic:pic xmlns:pic="http://schemas.openxmlformats.org/drawingml/2006/picture">
+                  <pic:nvPicPr>
+                    <pic:cNvPr id="126" name=""/>
+                    <pic:cNvPicPr>
+                      <a:picLocks noChangeAspect="1" noChangeArrowheads="1"/>
+                    </pic:cNvPicPr>
+                  </pic:nvPicPr>
+                  <pic:blipFill>
+                    <a:blip r:embed="rId72"/>
+                    <a:stretch>
+                      <a:fillRect/>
+                    </a:stretch>
+                  </pic:blipFill>
+                  <pic:spPr bwMode="auto">
+                    <a:xfrm>
+                      <a:off x="0" y="0"/>
+                      <a:ext cx="5733288" cy="2212848"/>
+                    </a:xfrm>
+                    <a:prstGeom prst="rect">
+                      <a:avLst/>
+                    </a:prstGeom>
+                    <a:noFill/>
+                  </pic:spPr>
+                </pic:pic>
+              </a:graphicData>
+            </a:graphic>
+          </wp:inline>
+        </w:drawing>
+      </w:r>
+    </w:p>
+    <w:p>
+      <w:pPr>
+        <w:pStyle w:val="BaseFuente"/>
+      </w:pPr>
+      <w:r>
+        <w:t xml:space="preserve">Base: 1,200 entrevistados. Cifras ficticias. Fuente: PULSO PUCP 2026.</w:t>
       </w:r>
     </w:p>
     <w:p>
@@ -31671,7 +32284,7 @@
         <w:rPr>
           <w:rStyle w:val="NumeroRotulo"/>
         </w:rPr>
-        <w:t>48</w:t>
+        <w:t>53</w:t>
       </w:r>
       <w:r>
         <w:rPr>
@@ -31710,7 +32323,7 @@
         <w:drawing>
           <wp:inline distT="0" distB="0" distL="0" distR="0">
             <wp:extent cx="3633774" cy="3090672"/>
-            <wp:docPr id="117" name="" descr=""/>
+            <wp:docPr id="127" name="" descr=""/>
             <wp:cNvGraphicFramePr>
               <a:graphicFrameLocks xmlns:a="http://schemas.openxmlformats.org/drawingml/2006/main" noChangeAspect="1"/>
             </wp:cNvGraphicFramePr>
@@ -31718,13 +32331,13 @@
               <a:graphicData uri="http://schemas.openxmlformats.org/drawingml/2006/picture">
                 <pic:pic xmlns:pic="http://schemas.openxmlformats.org/drawingml/2006/picture">
                   <pic:nvPicPr>
-                    <pic:cNvPr id="118" name=""/>
+                    <pic:cNvPr id="128" name=""/>
                     <pic:cNvPicPr>
                       <a:picLocks noChangeAspect="1" noChangeArrowheads="1"/>
                     </pic:cNvPicPr>
                   </pic:nvPicPr>
                   <pic:blipFill>
-                    <a:blip r:embed="rId69"/>
+                    <a:blip r:embed="rId73"/>
                     <a:stretch>
                       <a:fillRect/>
                     </a:stretch>
@@ -31786,7 +32399,7 @@
         <w:rPr>
           <w:rStyle w:val="NumeroRotulo"/>
         </w:rPr>
-        <w:t>49</w:t>
+        <w:t>54</w:t>
       </w:r>
       <w:r>
         <w:rPr>
@@ -31825,7 +32438,7 @@
         <w:drawing>
           <wp:inline distT="0" distB="0" distL="0" distR="0">
             <wp:extent cx="5733288" cy="2176272"/>
-            <wp:docPr id="119" name="" descr=""/>
+            <wp:docPr id="129" name="" descr=""/>
             <wp:cNvGraphicFramePr>
               <a:graphicFrameLocks xmlns:a="http://schemas.openxmlformats.org/drawingml/2006/main" noChangeAspect="1"/>
             </wp:cNvGraphicFramePr>
@@ -31833,13 +32446,13 @@
               <a:graphicData uri="http://schemas.openxmlformats.org/drawingml/2006/picture">
                 <pic:pic xmlns:pic="http://schemas.openxmlformats.org/drawingml/2006/picture">
                   <pic:nvPicPr>
-                    <pic:cNvPr id="120" name=""/>
+                    <pic:cNvPr id="130" name=""/>
                     <pic:cNvPicPr>
                       <a:picLocks noChangeAspect="1" noChangeArrowheads="1"/>
                     </pic:cNvPicPr>
                   </pic:nvPicPr>
                   <pic:blipFill>
-                    <a:blip r:embed="rId70"/>
+                    <a:blip r:embed="rId74"/>
                     <a:stretch>
                       <a:fillRect/>
                     </a:stretch>
@@ -31871,6 +32484,351 @@
     </w:p>
     <w:p>
       <w:pPr>
+        <w:pStyle w:val="RotuloGrafico"/>
+      </w:pPr>
+      <w:r>
+        <w:rPr>
+          <w:rStyle w:val="NumeroRotulo"/>
+        </w:rPr>
+        <w:t xml:space="preserve">Gráfico </w:t>
+      </w:r>
+      <w:r>
+        <w:rPr>
+          <w:rStyle w:val="NumeroRotulo"/>
+        </w:rPr>
+        <w:fldChar w:fldCharType="begin"/>
+      </w:r>
+      <w:r>
+        <w:rPr>
+          <w:rStyle w:val="NumeroRotulo"/>
+        </w:rPr>
+        <w:instrText xml:space="preserve"> SEQ Gráfico \* ARABIC </w:instrText>
+      </w:r>
+      <w:r>
+        <w:rPr>
+          <w:rStyle w:val="NumeroRotulo"/>
+        </w:rPr>
+        <w:fldChar w:fldCharType="separate"/>
+      </w:r>
+      <w:r>
+        <w:rPr>
+          <w:rStyle w:val="NumeroRotulo"/>
+        </w:rPr>
+        <w:t>55</w:t>
+      </w:r>
+      <w:r>
+        <w:rPr>
+          <w:rStyle w:val="NumeroRotulo"/>
+        </w:rPr>
+        <w:fldChar w:fldCharType="end"/>
+      </w:r>
+      <w:r>
+        <w:br w:type="textWrapping"/>
+      </w:r>
+      <w:r>
+        <w:rPr>
+          <w:rFonts/>
+          <w:i w:val="true"/>
+          <w:strike w:val="false"/>
+        </w:rPr>
+        <w:t xml:space="preserve">Zonas aplicadas en un distrito de intervención</w:t>
+      </w:r>
+    </w:p>
+    <w:p>
+      <w:pPr>
+        <w:pStyle w:val="Normal"/>
+        <w:keepNext/>
+        <w:pBdr>
+          <w:top w:val="none" w:sz="0" w:space="0" w:color="000000"/>
+          <w:left w:val="none" w:sz="0" w:space="0" w:color="000000"/>
+          <w:bottom w:val="none" w:sz="0" w:space="0" w:color="000000"/>
+          <w:right w:val="none" w:sz="0" w:space="0" w:color="000000"/>
+        </w:pBdr>
+        <w:spacing w:after="0" w:before="0" w:line="240"/>
+        <w:ind w:left="0" w:right="0" w:firstLine="0" w:firstLineChars="0"/>
+        <w:jc w:val="center"/>
+      </w:pPr>
+      <w:r>
+        <w:rPr/>
+        <w:drawing>
+          <wp:inline distT="0" distB="0" distL="0" distR="0">
+            <wp:extent cx="4400481" cy="3273552"/>
+            <wp:docPr id="131" name="" descr=""/>
+            <wp:cNvGraphicFramePr>
+              <a:graphicFrameLocks xmlns:a="http://schemas.openxmlformats.org/drawingml/2006/main" noChangeAspect="1"/>
+            </wp:cNvGraphicFramePr>
+            <a:graphic xmlns:a="http://schemas.openxmlformats.org/drawingml/2006/main">
+              <a:graphicData uri="http://schemas.openxmlformats.org/drawingml/2006/picture">
+                <pic:pic xmlns:pic="http://schemas.openxmlformats.org/drawingml/2006/picture">
+                  <pic:nvPicPr>
+                    <pic:cNvPr id="132" name=""/>
+                    <pic:cNvPicPr>
+                      <a:picLocks noChangeAspect="1" noChangeArrowheads="1"/>
+                    </pic:cNvPicPr>
+                  </pic:nvPicPr>
+                  <pic:blipFill>
+                    <a:blip r:embed="rId75"/>
+                    <a:stretch>
+                      <a:fillRect/>
+                    </a:stretch>
+                  </pic:blipFill>
+                  <pic:spPr bwMode="auto">
+                    <a:xfrm>
+                      <a:off x="0" y="0"/>
+                      <a:ext cx="4400481" cy="3273552"/>
+                    </a:xfrm>
+                    <a:prstGeom prst="rect">
+                      <a:avLst/>
+                    </a:prstGeom>
+                    <a:noFill/>
+                  </pic:spPr>
+                </pic:pic>
+              </a:graphicData>
+            </a:graphic>
+          </wp:inline>
+        </w:drawing>
+      </w:r>
+    </w:p>
+    <w:p>
+      <w:pPr>
+        <w:pStyle w:val="BaseFuente"/>
+      </w:pPr>
+      <w:r>
+        <w:t xml:space="preserve">Base: 18 zonas aplicadas de 76. Selección ficticia sobre las zonas censales INEI 2017. Fuente: PULSO PUCP 2026.</w:t>
+      </w:r>
+    </w:p>
+    <w:p>
+      <w:pPr>
+        <w:pStyle w:val="RotuloGrafico"/>
+      </w:pPr>
+      <w:r>
+        <w:rPr>
+          <w:rStyle w:val="NumeroRotulo"/>
+        </w:rPr>
+        <w:t xml:space="preserve">Gráfico </w:t>
+      </w:r>
+      <w:r>
+        <w:rPr>
+          <w:rStyle w:val="NumeroRotulo"/>
+        </w:rPr>
+        <w:fldChar w:fldCharType="begin"/>
+      </w:r>
+      <w:r>
+        <w:rPr>
+          <w:rStyle w:val="NumeroRotulo"/>
+        </w:rPr>
+        <w:instrText xml:space="preserve"> SEQ Gráfico \* ARABIC </w:instrText>
+      </w:r>
+      <w:r>
+        <w:rPr>
+          <w:rStyle w:val="NumeroRotulo"/>
+        </w:rPr>
+        <w:fldChar w:fldCharType="separate"/>
+      </w:r>
+      <w:r>
+        <w:rPr>
+          <w:rStyle w:val="NumeroRotulo"/>
+        </w:rPr>
+        <w:t>56</w:t>
+      </w:r>
+      <w:r>
+        <w:rPr>
+          <w:rStyle w:val="NumeroRotulo"/>
+        </w:rPr>
+        <w:fldChar w:fldCharType="end"/>
+      </w:r>
+      <w:r>
+        <w:br w:type="textWrapping"/>
+      </w:r>
+      <w:r>
+        <w:rPr>
+          <w:rFonts/>
+          <w:i w:val="true"/>
+          <w:strike w:val="false"/>
+        </w:rPr>
+        <w:t xml:space="preserve">Me siento seguro caminando de noche en mi barrio, por grupo</w:t>
+      </w:r>
+    </w:p>
+    <w:p>
+      <w:pPr>
+        <w:pStyle w:val="Normal"/>
+        <w:keepNext/>
+        <w:pBdr>
+          <w:top w:val="none" w:sz="0" w:space="0" w:color="000000"/>
+          <w:left w:val="none" w:sz="0" w:space="0" w:color="000000"/>
+          <w:bottom w:val="none" w:sz="0" w:space="0" w:color="000000"/>
+          <w:right w:val="none" w:sz="0" w:space="0" w:color="000000"/>
+        </w:pBdr>
+        <w:spacing w:after="0" w:before="0" w:line="240"/>
+        <w:ind w:left="0" w:right="0" w:firstLine="0" w:firstLineChars="0"/>
+        <w:jc w:val="center"/>
+      </w:pPr>
+      <w:r>
+        <w:rPr/>
+        <w:drawing>
+          <wp:inline distT="0" distB="0" distL="0" distR="0">
+            <wp:extent cx="5733288" cy="1751990"/>
+            <wp:docPr id="133" name="" descr=""/>
+            <wp:cNvGraphicFramePr>
+              <a:graphicFrameLocks xmlns:a="http://schemas.openxmlformats.org/drawingml/2006/main" noChangeAspect="1"/>
+            </wp:cNvGraphicFramePr>
+            <a:graphic xmlns:a="http://schemas.openxmlformats.org/drawingml/2006/main">
+              <a:graphicData uri="http://schemas.openxmlformats.org/drawingml/2006/picture">
+                <pic:pic xmlns:pic="http://schemas.openxmlformats.org/drawingml/2006/picture">
+                  <pic:nvPicPr>
+                    <pic:cNvPr id="134" name=""/>
+                    <pic:cNvPicPr>
+                      <a:picLocks noChangeAspect="1" noChangeArrowheads="1"/>
+                    </pic:cNvPicPr>
+                  </pic:nvPicPr>
+                  <pic:blipFill>
+                    <a:blip r:embed="rId76"/>
+                    <a:stretch>
+                      <a:fillRect/>
+                    </a:stretch>
+                  </pic:blipFill>
+                  <pic:spPr bwMode="auto">
+                    <a:xfrm>
+                      <a:off x="0" y="0"/>
+                      <a:ext cx="5733288" cy="1751990"/>
+                    </a:xfrm>
+                    <a:prstGeom prst="rect">
+                      <a:avLst/>
+                    </a:prstGeom>
+                    <a:noFill/>
+                  </pic:spPr>
+                </pic:pic>
+              </a:graphicData>
+            </a:graphic>
+          </wp:inline>
+        </w:drawing>
+      </w:r>
+    </w:p>
+    <w:p>
+      <w:pPr>
+        <w:pStyle w:val="BaseFuente"/>
+      </w:pPr>
+      <w:r>
+        <w:t xml:space="preserve">Base: 99 entrevistados en distritos de intervención y 90 en distritos de comparación. Cifras ficticias. Fuente: PULSO PUCP 2026.</w:t>
+      </w:r>
+    </w:p>
+    <w:p>
+      <w:pPr>
+        <w:pStyle w:val="RotuloGrafico"/>
+      </w:pPr>
+      <w:r>
+        <w:rPr>
+          <w:rStyle w:val="NumeroRotulo"/>
+        </w:rPr>
+        <w:t xml:space="preserve">Gráfico </w:t>
+      </w:r>
+      <w:r>
+        <w:rPr>
+          <w:rStyle w:val="NumeroRotulo"/>
+        </w:rPr>
+        <w:fldChar w:fldCharType="begin"/>
+      </w:r>
+      <w:r>
+        <w:rPr>
+          <w:rStyle w:val="NumeroRotulo"/>
+        </w:rPr>
+        <w:instrText xml:space="preserve"> SEQ Gráfico \* ARABIC </w:instrText>
+      </w:r>
+      <w:r>
+        <w:rPr>
+          <w:rStyle w:val="NumeroRotulo"/>
+        </w:rPr>
+        <w:fldChar w:fldCharType="separate"/>
+      </w:r>
+      <w:r>
+        <w:rPr>
+          <w:rStyle w:val="NumeroRotulo"/>
+        </w:rPr>
+        <w:t>57</w:t>
+      </w:r>
+      <w:r>
+        <w:rPr>
+          <w:rStyle w:val="NumeroRotulo"/>
+        </w:rPr>
+        <w:fldChar w:fldCharType="end"/>
+      </w:r>
+      <w:r>
+        <w:br w:type="textWrapping"/>
+      </w:r>
+      <w:r>
+        <w:rPr>
+          <w:rFonts/>
+          <w:i w:val="true"/>
+          <w:strike w:val="false"/>
+        </w:rPr>
+        <w:t xml:space="preserve">Servicios del barrio que usó en el último año</w:t>
+      </w:r>
+    </w:p>
+    <w:p>
+      <w:pPr>
+        <w:pStyle w:val="Normal"/>
+        <w:keepNext/>
+        <w:pBdr>
+          <w:top w:val="none" w:sz="0" w:space="0" w:color="000000"/>
+          <w:left w:val="none" w:sz="0" w:space="0" w:color="000000"/>
+          <w:bottom w:val="none" w:sz="0" w:space="0" w:color="000000"/>
+          <w:right w:val="none" w:sz="0" w:space="0" w:color="000000"/>
+        </w:pBdr>
+        <w:spacing w:after="0" w:before="0" w:line="240"/>
+        <w:ind w:left="0" w:right="0" w:firstLine="0" w:firstLineChars="0"/>
+        <w:jc w:val="center"/>
+      </w:pPr>
+      <w:r>
+        <w:rPr/>
+        <w:drawing>
+          <wp:inline distT="0" distB="0" distL="0" distR="0">
+            <wp:extent cx="5733288" cy="1965960"/>
+            <wp:docPr id="135" name="" descr=""/>
+            <wp:cNvGraphicFramePr>
+              <a:graphicFrameLocks xmlns:a="http://schemas.openxmlformats.org/drawingml/2006/main" noChangeAspect="1"/>
+            </wp:cNvGraphicFramePr>
+            <a:graphic xmlns:a="http://schemas.openxmlformats.org/drawingml/2006/main">
+              <a:graphicData uri="http://schemas.openxmlformats.org/drawingml/2006/picture">
+                <pic:pic xmlns:pic="http://schemas.openxmlformats.org/drawingml/2006/picture">
+                  <pic:nvPicPr>
+                    <pic:cNvPr id="136" name=""/>
+                    <pic:cNvPicPr>
+                      <a:picLocks noChangeAspect="1" noChangeArrowheads="1"/>
+                    </pic:cNvPicPr>
+                  </pic:nvPicPr>
+                  <pic:blipFill>
+                    <a:blip r:embed="rId77"/>
+                    <a:stretch>
+                      <a:fillRect/>
+                    </a:stretch>
+                  </pic:blipFill>
+                  <pic:spPr bwMode="auto">
+                    <a:xfrm>
+                      <a:off x="0" y="0"/>
+                      <a:ext cx="5733288" cy="1965960"/>
+                    </a:xfrm>
+                    <a:prstGeom prst="rect">
+                      <a:avLst/>
+                    </a:prstGeom>
+                    <a:noFill/>
+                  </pic:spPr>
+                </pic:pic>
+              </a:graphicData>
+            </a:graphic>
+          </wp:inline>
+        </w:drawing>
+      </w:r>
+    </w:p>
+    <w:p>
+      <w:pPr>
+        <w:pStyle w:val="BaseFuente"/>
+      </w:pPr>
+      <w:r>
+        <w:t xml:space="preserve">Base: 189 entrevistados. Opción múltiple: los porcentajes pueden sumar más de 100. Cifras ficticias. Fuente: PULSO PUCP 2026.</w:t>
+      </w:r>
+    </w:p>
+    <w:p>
+      <w:pPr>
         <w:pStyle w:val="Titre2"/>
       </w:pPr>
       <w:r>
@@ -31937,7 +32895,7 @@
         <w:rPr>
           <w:rStyle w:val="NumeroRotulo"/>
         </w:rPr>
-        <w:t>50</w:t>
+        <w:t>58</w:t>
       </w:r>
       <w:r>
         <w:rPr>
@@ -31976,7 +32934,7 @@
         <w:drawing>
           <wp:inline distT="0" distB="0" distL="0" distR="0">
             <wp:extent cx="5733288" cy="2450592"/>
-            <wp:docPr id="121" name="" descr=""/>
+            <wp:docPr id="137" name="" descr=""/>
             <wp:cNvGraphicFramePr>
               <a:graphicFrameLocks xmlns:a="http://schemas.openxmlformats.org/drawingml/2006/main" noChangeAspect="1"/>
             </wp:cNvGraphicFramePr>
@@ -31984,7 +32942,7 @@
               <a:graphicData uri="http://schemas.openxmlformats.org/drawingml/2006/picture">
                 <pic:pic xmlns:pic="http://schemas.openxmlformats.org/drawingml/2006/picture">
                   <pic:nvPicPr>
-                    <pic:cNvPr id="122" name=""/>
+                    <pic:cNvPr id="138" name=""/>
                     <pic:cNvPicPr>
                       <a:picLocks noChangeAspect="1" noChangeArrowheads="1"/>
                     </pic:cNvPicPr>
@@ -32014,7 +32972,7 @@
     </w:p>
     <w:p>
       <w:pPr>
-        <w:pStyle w:val="BaseFuente"/>
+        <w:pStyle w:val="BaseFuenteLectura"/>
       </w:pPr>
       <w:r>
         <w:t xml:space="preserve">La línea coral marca la meta. N = 2,296 hogares entrevistados por teléfono. Cifras ficticias. Fuente: PULSO PUCP 2026.</w:t>
@@ -32037,6 +32995,381 @@
       </w:r>
       <w:r>
         <w:t xml:space="preserve"> por debajo de la suya.</w:t>
+      </w:r>
+    </w:p>
+    <w:p>
+      <w:pPr>
+        <w:pStyle w:val="RotuloGrafico"/>
+      </w:pPr>
+      <w:r>
+        <w:rPr>
+          <w:rStyle w:val="NumeroRotulo"/>
+        </w:rPr>
+        <w:t xml:space="preserve">Gráfico </w:t>
+      </w:r>
+      <w:r>
+        <w:rPr>
+          <w:rStyle w:val="NumeroRotulo"/>
+        </w:rPr>
+        <w:fldChar w:fldCharType="begin"/>
+      </w:r>
+      <w:r>
+        <w:rPr>
+          <w:rStyle w:val="NumeroRotulo"/>
+        </w:rPr>
+        <w:instrText xml:space="preserve"> SEQ Gráfico \* ARABIC </w:instrText>
+      </w:r>
+      <w:r>
+        <w:rPr>
+          <w:rStyle w:val="NumeroRotulo"/>
+        </w:rPr>
+        <w:fldChar w:fldCharType="separate"/>
+      </w:r>
+      <w:r>
+        <w:rPr>
+          <w:rStyle w:val="NumeroRotulo"/>
+        </w:rPr>
+        <w:t>59</w:t>
+      </w:r>
+      <w:r>
+        <w:rPr>
+          <w:rStyle w:val="NumeroRotulo"/>
+        </w:rPr>
+        <w:fldChar w:fldCharType="end"/>
+      </w:r>
+      <w:r>
+        <w:br w:type="textWrapping"/>
+      </w:r>
+      <w:r>
+        <w:rPr>
+          <w:rFonts/>
+          <w:i w:val="true"/>
+          <w:strike w:val="false"/>
+        </w:rPr>
+        <w:t xml:space="preserve">¿Recibió la asistencia completa?</w:t>
+      </w:r>
+    </w:p>
+    <w:p>
+      <w:pPr>
+        <w:pStyle w:val="Normal"/>
+        <w:keepNext/>
+        <w:pBdr>
+          <w:top w:val="none" w:sz="0" w:space="0" w:color="000000"/>
+          <w:left w:val="none" w:sz="0" w:space="0" w:color="000000"/>
+          <w:bottom w:val="none" w:sz="0" w:space="0" w:color="000000"/>
+          <w:right w:val="none" w:sz="0" w:space="0" w:color="000000"/>
+        </w:pBdr>
+        <w:spacing w:after="0" w:before="0" w:line="240"/>
+        <w:ind w:left="0" w:right="0" w:firstLine="0" w:firstLineChars="0"/>
+        <w:jc w:val="center"/>
+      </w:pPr>
+      <w:r>
+        <w:rPr/>
+        <w:drawing>
+          <wp:inline distT="0" distB="0" distL="0" distR="0">
+            <wp:extent cx="5733288" cy="1170432"/>
+            <wp:docPr id="139" name="" descr=""/>
+            <wp:cNvGraphicFramePr>
+              <a:graphicFrameLocks xmlns:a="http://schemas.openxmlformats.org/drawingml/2006/main" noChangeAspect="1"/>
+            </wp:cNvGraphicFramePr>
+            <a:graphic xmlns:a="http://schemas.openxmlformats.org/drawingml/2006/main">
+              <a:graphicData uri="http://schemas.openxmlformats.org/drawingml/2006/picture">
+                <pic:pic xmlns:pic="http://schemas.openxmlformats.org/drawingml/2006/picture">
+                  <pic:nvPicPr>
+                    <pic:cNvPr id="140" name=""/>
+                    <pic:cNvPicPr>
+                      <a:picLocks noChangeAspect="1" noChangeArrowheads="1"/>
+                    </pic:cNvPicPr>
+                  </pic:nvPicPr>
+                  <pic:blipFill>
+                    <a:blip r:embed="rId78"/>
+                    <a:stretch>
+                      <a:fillRect/>
+                    </a:stretch>
+                  </pic:blipFill>
+                  <pic:spPr bwMode="auto">
+                    <a:xfrm>
+                      <a:off x="0" y="0"/>
+                      <a:ext cx="5733288" cy="1170432"/>
+                    </a:xfrm>
+                    <a:prstGeom prst="rect">
+                      <a:avLst/>
+                    </a:prstGeom>
+                    <a:noFill/>
+                  </pic:spPr>
+                </pic:pic>
+              </a:graphicData>
+            </a:graphic>
+          </wp:inline>
+        </w:drawing>
+      </w:r>
+    </w:p>
+    <w:p>
+      <w:pPr>
+        <w:pStyle w:val="BaseFuente"/>
+      </w:pPr>
+      <w:r>
+        <w:t xml:space="preserve">Base: 2,296 hogares. Cifras ficticias. Fuente: PULSO PUCP 2026.</w:t>
+      </w:r>
+    </w:p>
+    <w:p>
+      <w:pPr>
+        <w:pStyle w:val="RotuloGrafico"/>
+      </w:pPr>
+      <w:r>
+        <w:rPr>
+          <w:rStyle w:val="NumeroRotulo"/>
+        </w:rPr>
+        <w:t xml:space="preserve">Gráfico </w:t>
+      </w:r>
+      <w:r>
+        <w:rPr>
+          <w:rStyle w:val="NumeroRotulo"/>
+        </w:rPr>
+        <w:fldChar w:fldCharType="begin"/>
+      </w:r>
+      <w:r>
+        <w:rPr>
+          <w:rStyle w:val="NumeroRotulo"/>
+        </w:rPr>
+        <w:instrText xml:space="preserve"> SEQ Gráfico \* ARABIC </w:instrText>
+      </w:r>
+      <w:r>
+        <w:rPr>
+          <w:rStyle w:val="NumeroRotulo"/>
+        </w:rPr>
+        <w:fldChar w:fldCharType="separate"/>
+      </w:r>
+      <w:r>
+        <w:rPr>
+          <w:rStyle w:val="NumeroRotulo"/>
+        </w:rPr>
+        <w:t>60</w:t>
+      </w:r>
+      <w:r>
+        <w:rPr>
+          <w:rStyle w:val="NumeroRotulo"/>
+        </w:rPr>
+        <w:fldChar w:fldCharType="end"/>
+      </w:r>
+      <w:r>
+        <w:br w:type="textWrapping"/>
+      </w:r>
+      <w:r>
+        <w:rPr>
+          <w:rFonts/>
+          <w:i w:val="true"/>
+          <w:strike w:val="false"/>
+        </w:rPr>
+        <w:t xml:space="preserve">¿En qué usó principalmente el dinero recibido?</w:t>
+      </w:r>
+    </w:p>
+    <w:p>
+      <w:pPr>
+        <w:pStyle w:val="Normal"/>
+        <w:keepNext/>
+        <w:pBdr>
+          <w:top w:val="none" w:sz="0" w:space="0" w:color="000000"/>
+          <w:left w:val="none" w:sz="0" w:space="0" w:color="000000"/>
+          <w:bottom w:val="none" w:sz="0" w:space="0" w:color="000000"/>
+          <w:right w:val="none" w:sz="0" w:space="0" w:color="000000"/>
+        </w:pBdr>
+        <w:spacing w:after="0" w:before="0" w:line="240"/>
+        <w:ind w:left="0" w:right="0" w:firstLine="0" w:firstLineChars="0"/>
+        <w:jc w:val="center"/>
+      </w:pPr>
+      <w:r>
+        <w:rPr/>
+        <w:drawing>
+          <wp:inline distT="0" distB="0" distL="0" distR="0">
+            <wp:extent cx="5733288" cy="1965960"/>
+            <wp:docPr id="141" name="" descr=""/>
+            <wp:cNvGraphicFramePr>
+              <a:graphicFrameLocks xmlns:a="http://schemas.openxmlformats.org/drawingml/2006/main" noChangeAspect="1"/>
+            </wp:cNvGraphicFramePr>
+            <a:graphic xmlns:a="http://schemas.openxmlformats.org/drawingml/2006/main">
+              <a:graphicData uri="http://schemas.openxmlformats.org/drawingml/2006/picture">
+                <pic:pic xmlns:pic="http://schemas.openxmlformats.org/drawingml/2006/picture">
+                  <pic:nvPicPr>
+                    <pic:cNvPr id="142" name=""/>
+                    <pic:cNvPicPr>
+                      <a:picLocks noChangeAspect="1" noChangeArrowheads="1"/>
+                    </pic:cNvPicPr>
+                  </pic:nvPicPr>
+                  <pic:blipFill>
+                    <a:blip r:embed="rId79"/>
+                    <a:stretch>
+                      <a:fillRect/>
+                    </a:stretch>
+                  </pic:blipFill>
+                  <pic:spPr bwMode="auto">
+                    <a:xfrm>
+                      <a:off x="0" y="0"/>
+                      <a:ext cx="5733288" cy="1965960"/>
+                    </a:xfrm>
+                    <a:prstGeom prst="rect">
+                      <a:avLst/>
+                    </a:prstGeom>
+                    <a:noFill/>
+                  </pic:spPr>
+                </pic:pic>
+              </a:graphicData>
+            </a:graphic>
+          </wp:inline>
+        </w:drawing>
+      </w:r>
+    </w:p>
+    <w:p>
+      <w:pPr>
+        <w:pStyle w:val="BaseFuente"/>
+      </w:pPr>
+      <w:r>
+        <w:t xml:space="preserve">Base: 2,296 hogares. Opción múltiple: los porcentajes pueden sumar más de 100. Cifras ficticias. Fuente: PULSO PUCP 2026.</w:t>
+      </w:r>
+    </w:p>
+    <w:p>
+      <w:pPr>
+        <w:pStyle w:val="RotuloGrafico"/>
+      </w:pPr>
+      <w:r>
+        <w:rPr>
+          <w:rStyle w:val="NumeroRotulo"/>
+        </w:rPr>
+        <w:t xml:space="preserve">Gráfico </w:t>
+      </w:r>
+      <w:r>
+        <w:rPr>
+          <w:rStyle w:val="NumeroRotulo"/>
+        </w:rPr>
+        <w:fldChar w:fldCharType="begin"/>
+      </w:r>
+      <w:r>
+        <w:rPr>
+          <w:rStyle w:val="NumeroRotulo"/>
+        </w:rPr>
+        <w:instrText xml:space="preserve"> SEQ Gráfico \* ARABIC </w:instrText>
+      </w:r>
+      <w:r>
+        <w:rPr>
+          <w:rStyle w:val="NumeroRotulo"/>
+        </w:rPr>
+        <w:fldChar w:fldCharType="separate"/>
+      </w:r>
+      <w:r>
+        <w:rPr>
+          <w:rStyle w:val="NumeroRotulo"/>
+        </w:rPr>
+        <w:t>61</w:t>
+      </w:r>
+      <w:r>
+        <w:rPr>
+          <w:rStyle w:val="NumeroRotulo"/>
+        </w:rPr>
+        <w:fldChar w:fldCharType="end"/>
+      </w:r>
+      <w:r>
+        <w:br w:type="textWrapping"/>
+      </w:r>
+      <w:r>
+        <w:rPr>
+          <w:rFonts/>
+          <w:i w:val="true"/>
+          <w:strike w:val="false"/>
+        </w:rPr>
+        <w:t xml:space="preserve">Indicadores clave en tres rondas de monitoreo</w:t>
+      </w:r>
+    </w:p>
+    <w:p>
+      <w:pPr>
+        <w:pStyle w:val="Normal"/>
+        <w:keepNext/>
+        <w:pBdr>
+          <w:top w:val="none" w:sz="0" w:space="0" w:color="000000"/>
+          <w:left w:val="none" w:sz="0" w:space="0" w:color="000000"/>
+          <w:bottom w:val="none" w:sz="0" w:space="0" w:color="000000"/>
+          <w:right w:val="none" w:sz="0" w:space="0" w:color="000000"/>
+        </w:pBdr>
+        <w:spacing w:after="0" w:before="0" w:line="240"/>
+        <w:ind w:left="0" w:right="0" w:firstLine="0" w:firstLineChars="0"/>
+        <w:jc w:val="center"/>
+      </w:pPr>
+      <w:r>
+        <w:rPr/>
+        <w:drawing>
+          <wp:inline distT="0" distB="0" distL="0" distR="0">
+            <wp:extent cx="5733288" cy="1993392"/>
+            <wp:docPr id="143" name="" descr=""/>
+            <wp:cNvGraphicFramePr>
+              <a:graphicFrameLocks xmlns:a="http://schemas.openxmlformats.org/drawingml/2006/main" noChangeAspect="1"/>
+            </wp:cNvGraphicFramePr>
+            <a:graphic xmlns:a="http://schemas.openxmlformats.org/drawingml/2006/main">
+              <a:graphicData uri="http://schemas.openxmlformats.org/drawingml/2006/picture">
+                <pic:pic xmlns:pic="http://schemas.openxmlformats.org/drawingml/2006/picture">
+                  <pic:nvPicPr>
+                    <pic:cNvPr id="144" name=""/>
+                    <pic:cNvPicPr>
+                      <a:picLocks noChangeAspect="1" noChangeArrowheads="1"/>
+                    </pic:cNvPicPr>
+                  </pic:nvPicPr>
+                  <pic:blipFill>
+                    <a:blip r:embed="rId80"/>
+                    <a:stretch>
+                      <a:fillRect/>
+                    </a:stretch>
+                  </pic:blipFill>
+                  <pic:spPr bwMode="auto">
+                    <a:xfrm>
+                      <a:off x="0" y="0"/>
+                      <a:ext cx="5733288" cy="1993392"/>
+                    </a:xfrm>
+                    <a:prstGeom prst="rect">
+                      <a:avLst/>
+                    </a:prstGeom>
+                    <a:noFill/>
+                  </pic:spPr>
+                </pic:pic>
+              </a:graphicData>
+            </a:graphic>
+          </wp:inline>
+        </w:drawing>
+      </w:r>
+    </w:p>
+    <w:p>
+      <w:pPr>
+        <w:pStyle w:val="BaseFuenteLectura"/>
+      </w:pPr>
+      <w:r>
+        <w:t xml:space="preserve">Base: 2,140, 2,205 y 2,296 hogares en cada ronda. Cifras ficticias. Fuente: PULSO PUCP 2026.</w:t>
+      </w:r>
+    </w:p>
+    <w:p>
+      <w:pPr>
+        <w:pStyle w:val="Lectura"/>
+      </w:pPr>
+      <w:r>
+        <w:t xml:space="preserve">Los dos indicadores mejoran ronda a ronda. El conocimiento del mecanismo de quejas sube </w:t>
+      </w:r>
+      <w:r>
+        <w:rPr>
+          <w:rFonts/>
+          <w:b w:val="true"/>
+          <w:strike w:val="false"/>
+        </w:rPr>
+        <w:t xml:space="preserve">13 puntos</w:t>
+      </w:r>
+      <w:r>
+        <w:t xml:space="preserve">, pero sigue lejos de su meta de </w:t>
+      </w:r>
+      <w:r>
+        <w:rPr>
+          <w:rFonts/>
+          <w:b w:val="true"/>
+          <w:strike w:val="false"/>
+        </w:rPr>
+        <w:t xml:space="preserve">60%</w:t>
+      </w:r>
+      <w:r>
+        <w:t xml:space="preserve">.</w:t>
       </w:r>
     </w:p>
     <w:p>
@@ -32107,7 +33440,7 @@
         <w:rPr>
           <w:rStyle w:val="NumeroRotulo"/>
         </w:rPr>
-        <w:t>51</w:t>
+        <w:t>62</w:t>
       </w:r>
       <w:r>
         <w:rPr>
@@ -32146,7 +33479,7 @@
         <w:drawing>
           <wp:inline distT="0" distB="0" distL="0" distR="0">
             <wp:extent cx="5733288" cy="2212848"/>
-            <wp:docPr id="123" name="" descr=""/>
+            <wp:docPr id="145" name="" descr=""/>
             <wp:cNvGraphicFramePr>
               <a:graphicFrameLocks xmlns:a="http://schemas.openxmlformats.org/drawingml/2006/main" noChangeAspect="1"/>
             </wp:cNvGraphicFramePr>
@@ -32154,13 +33487,13 @@
               <a:graphicData uri="http://schemas.openxmlformats.org/drawingml/2006/picture">
                 <pic:pic xmlns:pic="http://schemas.openxmlformats.org/drawingml/2006/picture">
                   <pic:nvPicPr>
-                    <pic:cNvPr id="124" name=""/>
+                    <pic:cNvPr id="146" name=""/>
                     <pic:cNvPicPr>
                       <a:picLocks noChangeAspect="1" noChangeArrowheads="1"/>
                     </pic:cNvPicPr>
                   </pic:nvPicPr>
                   <pic:blipFill>
-                    <a:blip r:embed="rId71"/>
+                    <a:blip r:embed="rId81"/>
                     <a:stretch>
                       <a:fillRect/>
                     </a:stretch>
@@ -32192,6 +33525,359 @@
     </w:p>
     <w:p>
       <w:pPr>
+        <w:pStyle w:val="RotuloGrafico"/>
+      </w:pPr>
+      <w:r>
+        <w:rPr>
+          <w:rStyle w:val="NumeroRotulo"/>
+        </w:rPr>
+        <w:t xml:space="preserve">Gráfico </w:t>
+      </w:r>
+      <w:r>
+        <w:rPr>
+          <w:rStyle w:val="NumeroRotulo"/>
+        </w:rPr>
+        <w:fldChar w:fldCharType="begin"/>
+      </w:r>
+      <w:r>
+        <w:rPr>
+          <w:rStyle w:val="NumeroRotulo"/>
+        </w:rPr>
+        <w:instrText xml:space="preserve"> SEQ Gráfico \* ARABIC </w:instrText>
+      </w:r>
+      <w:r>
+        <w:rPr>
+          <w:rStyle w:val="NumeroRotulo"/>
+        </w:rPr>
+        <w:fldChar w:fldCharType="separate"/>
+      </w:r>
+      <w:r>
+        <w:rPr>
+          <w:rStyle w:val="NumeroRotulo"/>
+        </w:rPr>
+        <w:t>63</w:t>
+      </w:r>
+      <w:r>
+        <w:rPr>
+          <w:rStyle w:val="NumeroRotulo"/>
+        </w:rPr>
+        <w:fldChar w:fldCharType="end"/>
+      </w:r>
+      <w:r>
+        <w:br w:type="textWrapping"/>
+      </w:r>
+      <w:r>
+        <w:rPr>
+          <w:rFonts/>
+          <w:i w:val="true"/>
+          <w:strike w:val="false"/>
+        </w:rPr>
+        <w:t xml:space="preserve">Estudiantes que vivieron al menos una situación de hostigamiento, por sexo</w:t>
+      </w:r>
+    </w:p>
+    <w:p>
+      <w:pPr>
+        <w:pStyle w:val="Normal"/>
+        <w:keepNext/>
+        <w:pBdr>
+          <w:top w:val="none" w:sz="0" w:space="0" w:color="000000"/>
+          <w:left w:val="none" w:sz="0" w:space="0" w:color="000000"/>
+          <w:bottom w:val="none" w:sz="0" w:space="0" w:color="000000"/>
+          <w:right w:val="none" w:sz="0" w:space="0" w:color="000000"/>
+        </w:pBdr>
+        <w:spacing w:after="0" w:before="0" w:line="240"/>
+        <w:ind w:left="0" w:right="0" w:firstLine="0" w:firstLineChars="0"/>
+        <w:jc w:val="center"/>
+      </w:pPr>
+      <w:r>
+        <w:rPr/>
+        <w:drawing>
+          <wp:inline distT="0" distB="0" distL="0" distR="0">
+            <wp:extent cx="5733288" cy="1993392"/>
+            <wp:docPr id="147" name="" descr=""/>
+            <wp:cNvGraphicFramePr>
+              <a:graphicFrameLocks xmlns:a="http://schemas.openxmlformats.org/drawingml/2006/main" noChangeAspect="1"/>
+            </wp:cNvGraphicFramePr>
+            <a:graphic xmlns:a="http://schemas.openxmlformats.org/drawingml/2006/main">
+              <a:graphicData uri="http://schemas.openxmlformats.org/drawingml/2006/picture">
+                <pic:pic xmlns:pic="http://schemas.openxmlformats.org/drawingml/2006/picture">
+                  <pic:nvPicPr>
+                    <pic:cNvPr id="148" name=""/>
+                    <pic:cNvPicPr>
+                      <a:picLocks noChangeAspect="1" noChangeArrowheads="1"/>
+                    </pic:cNvPicPr>
+                  </pic:nvPicPr>
+                  <pic:blipFill>
+                    <a:blip r:embed="rId82"/>
+                    <a:stretch>
+                      <a:fillRect/>
+                    </a:stretch>
+                  </pic:blipFill>
+                  <pic:spPr bwMode="auto">
+                    <a:xfrm>
+                      <a:off x="0" y="0"/>
+                      <a:ext cx="5733288" cy="1993392"/>
+                    </a:xfrm>
+                    <a:prstGeom prst="rect">
+                      <a:avLst/>
+                    </a:prstGeom>
+                    <a:noFill/>
+                  </pic:spPr>
+                </pic:pic>
+              </a:graphicData>
+            </a:graphic>
+          </wp:inline>
+        </w:drawing>
+      </w:r>
+    </w:p>
+    <w:p>
+      <w:pPr>
+        <w:pStyle w:val="BaseFuente"/>
+      </w:pPr>
+      <w:r>
+        <w:t xml:space="preserve">Base: 1,855 estudiantes: 1,011 mujeres y 844 hombres. Cifras ficticias. Fuente: PULSO PUCP 2026.</w:t>
+      </w:r>
+    </w:p>
+    <w:p>
+      <w:pPr>
+        <w:pStyle w:val="RotuloGrafico"/>
+      </w:pPr>
+      <w:r>
+        <w:rPr>
+          <w:rStyle w:val="NumeroRotulo"/>
+        </w:rPr>
+        <w:t xml:space="preserve">Gráfico </w:t>
+      </w:r>
+      <w:r>
+        <w:rPr>
+          <w:rStyle w:val="NumeroRotulo"/>
+        </w:rPr>
+        <w:fldChar w:fldCharType="begin"/>
+      </w:r>
+      <w:r>
+        <w:rPr>
+          <w:rStyle w:val="NumeroRotulo"/>
+        </w:rPr>
+        <w:instrText xml:space="preserve"> SEQ Gráfico \* ARABIC </w:instrText>
+      </w:r>
+      <w:r>
+        <w:rPr>
+          <w:rStyle w:val="NumeroRotulo"/>
+        </w:rPr>
+        <w:fldChar w:fldCharType="separate"/>
+      </w:r>
+      <w:r>
+        <w:rPr>
+          <w:rStyle w:val="NumeroRotulo"/>
+        </w:rPr>
+        <w:t>64</w:t>
+      </w:r>
+      <w:r>
+        <w:rPr>
+          <w:rStyle w:val="NumeroRotulo"/>
+        </w:rPr>
+        <w:fldChar w:fldCharType="end"/>
+      </w:r>
+      <w:r>
+        <w:br w:type="textWrapping"/>
+      </w:r>
+      <w:r>
+        <w:rPr>
+          <w:rFonts/>
+          <w:i w:val="true"/>
+          <w:strike w:val="false"/>
+        </w:rPr>
+        <w:t xml:space="preserve">Situaciones de hostigamiento por tipo y facultad</w:t>
+      </w:r>
+    </w:p>
+    <w:p>
+      <w:pPr>
+        <w:pStyle w:val="Normal"/>
+        <w:keepNext/>
+        <w:pBdr>
+          <w:top w:val="none" w:sz="0" w:space="0" w:color="000000"/>
+          <w:left w:val="none" w:sz="0" w:space="0" w:color="000000"/>
+          <w:bottom w:val="none" w:sz="0" w:space="0" w:color="000000"/>
+          <w:right w:val="none" w:sz="0" w:space="0" w:color="000000"/>
+        </w:pBdr>
+        <w:spacing w:after="0" w:before="0" w:line="240"/>
+        <w:ind w:left="0" w:right="0" w:firstLine="0" w:firstLineChars="0"/>
+        <w:jc w:val="center"/>
+      </w:pPr>
+      <w:r>
+        <w:rPr/>
+        <w:drawing>
+          <wp:inline distT="0" distB="0" distL="0" distR="0">
+            <wp:extent cx="5733288" cy="1810512"/>
+            <wp:docPr id="149" name="" descr=""/>
+            <wp:cNvGraphicFramePr>
+              <a:graphicFrameLocks xmlns:a="http://schemas.openxmlformats.org/drawingml/2006/main" noChangeAspect="1"/>
+            </wp:cNvGraphicFramePr>
+            <a:graphic xmlns:a="http://schemas.openxmlformats.org/drawingml/2006/main">
+              <a:graphicData uri="http://schemas.openxmlformats.org/drawingml/2006/picture">
+                <pic:pic xmlns:pic="http://schemas.openxmlformats.org/drawingml/2006/picture">
+                  <pic:nvPicPr>
+                    <pic:cNvPr id="150" name=""/>
+                    <pic:cNvPicPr>
+                      <a:picLocks noChangeAspect="1" noChangeArrowheads="1"/>
+                    </pic:cNvPicPr>
+                  </pic:nvPicPr>
+                  <pic:blipFill>
+                    <a:blip r:embed="rId83"/>
+                    <a:stretch>
+                      <a:fillRect/>
+                    </a:stretch>
+                  </pic:blipFill>
+                  <pic:spPr bwMode="auto">
+                    <a:xfrm>
+                      <a:off x="0" y="0"/>
+                      <a:ext cx="5733288" cy="1810512"/>
+                    </a:xfrm>
+                    <a:prstGeom prst="rect">
+                      <a:avLst/>
+                    </a:prstGeom>
+                    <a:noFill/>
+                  </pic:spPr>
+                </pic:pic>
+              </a:graphicData>
+            </a:graphic>
+          </wp:inline>
+        </w:drawing>
+      </w:r>
+    </w:p>
+    <w:p>
+      <w:pPr>
+        <w:pStyle w:val="BaseFuente"/>
+      </w:pPr>
+      <w:r>
+        <w:t xml:space="preserve">Base: 1,547 estudiantes de cuatro facultades. Cifras ficticias. El tono va de 0% (claro) a 20% (oscuro). Fuente: PULSO PUCP 2026.</w:t>
+      </w:r>
+    </w:p>
+    <w:p>
+      <w:pPr>
+        <w:pStyle w:val="RotuloGrafico"/>
+      </w:pPr>
+      <w:r>
+        <w:rPr>
+          <w:rStyle w:val="NumeroRotulo"/>
+        </w:rPr>
+        <w:t xml:space="preserve">Gráfico </w:t>
+      </w:r>
+      <w:r>
+        <w:rPr>
+          <w:rStyle w:val="NumeroRotulo"/>
+        </w:rPr>
+        <w:fldChar w:fldCharType="begin"/>
+      </w:r>
+      <w:r>
+        <w:rPr>
+          <w:rStyle w:val="NumeroRotulo"/>
+        </w:rPr>
+        <w:instrText xml:space="preserve"> SEQ Gráfico \* ARABIC </w:instrText>
+      </w:r>
+      <w:r>
+        <w:rPr>
+          <w:rStyle w:val="NumeroRotulo"/>
+        </w:rPr>
+        <w:fldChar w:fldCharType="separate"/>
+      </w:r>
+      <w:r>
+        <w:rPr>
+          <w:rStyle w:val="NumeroRotulo"/>
+        </w:rPr>
+        <w:t>65</w:t>
+      </w:r>
+      <w:r>
+        <w:rPr>
+          <w:rStyle w:val="NumeroRotulo"/>
+        </w:rPr>
+        <w:fldChar w:fldCharType="end"/>
+      </w:r>
+      <w:r>
+        <w:br w:type="textWrapping"/>
+      </w:r>
+      <w:r>
+        <w:rPr>
+          <w:rFonts/>
+          <w:i w:val="true"/>
+          <w:strike w:val="false"/>
+        </w:rPr>
+        <w:t xml:space="preserve">¿Sabe a dónde acudir para presentar una denuncia?</w:t>
+      </w:r>
+    </w:p>
+    <w:p>
+      <w:pPr>
+        <w:pStyle w:val="Normal"/>
+        <w:keepNext/>
+        <w:pBdr>
+          <w:top w:val="none" w:sz="0" w:space="0" w:color="000000"/>
+          <w:left w:val="none" w:sz="0" w:space="0" w:color="000000"/>
+          <w:bottom w:val="none" w:sz="0" w:space="0" w:color="000000"/>
+          <w:right w:val="none" w:sz="0" w:space="0" w:color="000000"/>
+        </w:pBdr>
+        <w:spacing w:after="0" w:before="0" w:line="240"/>
+        <w:ind w:left="0" w:right="0" w:firstLine="0" w:firstLineChars="0"/>
+        <w:jc w:val="center"/>
+      </w:pPr>
+      <w:r>
+        <w:rPr/>
+        <w:drawing>
+          <wp:inline distT="0" distB="0" distL="0" distR="0">
+            <wp:extent cx="5733288" cy="1170432"/>
+            <wp:docPr id="151" name="" descr=""/>
+            <wp:cNvGraphicFramePr>
+              <a:graphicFrameLocks xmlns:a="http://schemas.openxmlformats.org/drawingml/2006/main" noChangeAspect="1"/>
+            </wp:cNvGraphicFramePr>
+            <a:graphic xmlns:a="http://schemas.openxmlformats.org/drawingml/2006/main">
+              <a:graphicData uri="http://schemas.openxmlformats.org/drawingml/2006/picture">
+                <pic:pic xmlns:pic="http://schemas.openxmlformats.org/drawingml/2006/picture">
+                  <pic:nvPicPr>
+                    <pic:cNvPr id="152" name=""/>
+                    <pic:cNvPicPr>
+                      <a:picLocks noChangeAspect="1" noChangeArrowheads="1"/>
+                    </pic:cNvPicPr>
+                  </pic:nvPicPr>
+                  <pic:blipFill>
+                    <a:blip r:embed="rId84"/>
+                    <a:stretch>
+                      <a:fillRect/>
+                    </a:stretch>
+                  </pic:blipFill>
+                  <pic:spPr bwMode="auto">
+                    <a:xfrm>
+                      <a:off x="0" y="0"/>
+                      <a:ext cx="5733288" cy="1170432"/>
+                    </a:xfrm>
+                    <a:prstGeom prst="rect">
+                      <a:avLst/>
+                    </a:prstGeom>
+                    <a:noFill/>
+                  </pic:spPr>
+                </pic:pic>
+              </a:graphicData>
+            </a:graphic>
+          </wp:inline>
+        </w:drawing>
+      </w:r>
+    </w:p>
+    <w:p>
+      <w:pPr>
+        <w:pStyle w:val="BaseFuenteLectura"/>
+      </w:pPr>
+      <w:r>
+        <w:t xml:space="preserve">Base: 1,855 estudiantes. Cifras ficticias. Fuente: PULSO PUCP 2026.</w:t>
+      </w:r>
+    </w:p>
+    <w:p>
+      <w:pPr>
+        <w:pStyle w:val="Lectura"/>
+      </w:pPr>
+      <w:r>
+        <w:t xml:space="preserve">Seis de cada diez estudiantes no sabe a dónde acudir para presentar una denuncia.</w:t>
+      </w:r>
+    </w:p>
+    <w:p>
+      <w:pPr>
         <w:pStyle w:val="Titre2"/>
       </w:pPr>
       <w:r>
@@ -32258,7 +33944,7 @@
         <w:rPr>
           <w:rStyle w:val="NumeroRotulo"/>
         </w:rPr>
-        <w:t>52</w:t>
+        <w:t>66</w:t>
       </w:r>
       <w:r>
         <w:rPr>
@@ -32297,7 +33983,7 @@
         <w:drawing>
           <wp:inline distT="0" distB="0" distL="0" distR="0">
             <wp:extent cx="5733288" cy="1751990"/>
-            <wp:docPr id="125" name="" descr=""/>
+            <wp:docPr id="153" name="" descr=""/>
             <wp:cNvGraphicFramePr>
               <a:graphicFrameLocks xmlns:a="http://schemas.openxmlformats.org/drawingml/2006/main" noChangeAspect="1"/>
             </wp:cNvGraphicFramePr>
@@ -32305,13 +33991,13 @@
               <a:graphicData uri="http://schemas.openxmlformats.org/drawingml/2006/picture">
                 <pic:pic xmlns:pic="http://schemas.openxmlformats.org/drawingml/2006/picture">
                   <pic:nvPicPr>
-                    <pic:cNvPr id="126" name=""/>
+                    <pic:cNvPr id="154" name=""/>
                     <pic:cNvPicPr>
                       <a:picLocks noChangeAspect="1" noChangeArrowheads="1"/>
                     </pic:cNvPicPr>
                   </pic:nvPicPr>
                   <pic:blipFill>
-                    <a:blip r:embed="rId72"/>
+                    <a:blip r:embed="rId85"/>
                     <a:stretch>
                       <a:fillRect/>
                     </a:stretch>
@@ -32373,7 +34059,7 @@
         <w:rPr>
           <w:rStyle w:val="NumeroRotulo"/>
         </w:rPr>
-        <w:t>53</w:t>
+        <w:t>67</w:t>
       </w:r>
       <w:r>
         <w:rPr>
@@ -32412,7 +34098,7 @@
         <w:drawing>
           <wp:inline distT="0" distB="0" distL="0" distR="0">
             <wp:extent cx="5733288" cy="2176272"/>
-            <wp:docPr id="127" name="" descr=""/>
+            <wp:docPr id="155" name="" descr=""/>
             <wp:cNvGraphicFramePr>
               <a:graphicFrameLocks xmlns:a="http://schemas.openxmlformats.org/drawingml/2006/main" noChangeAspect="1"/>
             </wp:cNvGraphicFramePr>
@@ -32420,13 +34106,13 @@
               <a:graphicData uri="http://schemas.openxmlformats.org/drawingml/2006/picture">
                 <pic:pic xmlns:pic="http://schemas.openxmlformats.org/drawingml/2006/picture">
                   <pic:nvPicPr>
-                    <pic:cNvPr id="128" name=""/>
+                    <pic:cNvPr id="156" name=""/>
                     <pic:cNvPicPr>
                       <a:picLocks noChangeAspect="1" noChangeArrowheads="1"/>
                     </pic:cNvPicPr>
                   </pic:nvPicPr>
                   <pic:blipFill>
-                    <a:blip r:embed="rId73"/>
+                    <a:blip r:embed="rId86"/>
                     <a:stretch>
                       <a:fillRect/>
                     </a:stretch>
@@ -32450,7 +34136,7 @@
     </w:p>
     <w:p>
       <w:pPr>
-        <w:pStyle w:val="BaseFuente"/>
+        <w:pStyle w:val="BaseFuenteLectura"/>
       </w:pPr>
       <w:r>
         <w:t xml:space="preserve">Base: 38 directivos y 420 trabajadores. Cifras ficticias. Fuente: PULSO PUCP 2026.</w:t>
@@ -32484,6 +34170,236 @@
       </w:r>
       <w:r>
         <w:t xml:space="preserve"> de los trabajadores.</w:t>
+      </w:r>
+    </w:p>
+    <w:p>
+      <w:pPr>
+        <w:pStyle w:val="RotuloGrafico"/>
+      </w:pPr>
+      <w:r>
+        <w:rPr>
+          <w:rStyle w:val="NumeroRotulo"/>
+        </w:rPr>
+        <w:t xml:space="preserve">Gráfico </w:t>
+      </w:r>
+      <w:r>
+        <w:rPr>
+          <w:rStyle w:val="NumeroRotulo"/>
+        </w:rPr>
+        <w:fldChar w:fldCharType="begin"/>
+      </w:r>
+      <w:r>
+        <w:rPr>
+          <w:rStyle w:val="NumeroRotulo"/>
+        </w:rPr>
+        <w:instrText xml:space="preserve"> SEQ Gráfico \* ARABIC </w:instrText>
+      </w:r>
+      <w:r>
+        <w:rPr>
+          <w:rStyle w:val="NumeroRotulo"/>
+        </w:rPr>
+        <w:fldChar w:fldCharType="separate"/>
+      </w:r>
+      <w:r>
+        <w:rPr>
+          <w:rStyle w:val="NumeroRotulo"/>
+        </w:rPr>
+        <w:t>68</w:t>
+      </w:r>
+      <w:r>
+        <w:rPr>
+          <w:rStyle w:val="NumeroRotulo"/>
+        </w:rPr>
+        <w:fldChar w:fldCharType="end"/>
+      </w:r>
+      <w:r>
+        <w:br w:type="textWrapping"/>
+      </w:r>
+      <w:r>
+        <w:rPr>
+          <w:rFonts/>
+          <w:i w:val="true"/>
+          <w:strike w:val="false"/>
+        </w:rPr>
+        <w:t xml:space="preserve">Igualdad de oportunidades por área (Top Two Box)</w:t>
+      </w:r>
+    </w:p>
+    <w:p>
+      <w:pPr>
+        <w:pStyle w:val="Normal"/>
+        <w:keepNext/>
+        <w:pBdr>
+          <w:top w:val="none" w:sz="0" w:space="0" w:color="000000"/>
+          <w:left w:val="none" w:sz="0" w:space="0" w:color="000000"/>
+          <w:bottom w:val="none" w:sz="0" w:space="0" w:color="000000"/>
+          <w:right w:val="none" w:sz="0" w:space="0" w:color="000000"/>
+        </w:pBdr>
+        <w:spacing w:after="0" w:before="0" w:line="240"/>
+        <w:ind w:left="0" w:right="0" w:firstLine="0" w:firstLineChars="0"/>
+        <w:jc w:val="center"/>
+      </w:pPr>
+      <w:r>
+        <w:rPr/>
+        <w:drawing>
+          <wp:inline distT="0" distB="0" distL="0" distR="0">
+            <wp:extent cx="5733288" cy="1810512"/>
+            <wp:docPr id="157" name="" descr=""/>
+            <wp:cNvGraphicFramePr>
+              <a:graphicFrameLocks xmlns:a="http://schemas.openxmlformats.org/drawingml/2006/main" noChangeAspect="1"/>
+            </wp:cNvGraphicFramePr>
+            <a:graphic xmlns:a="http://schemas.openxmlformats.org/drawingml/2006/main">
+              <a:graphicData uri="http://schemas.openxmlformats.org/drawingml/2006/picture">
+                <pic:pic xmlns:pic="http://schemas.openxmlformats.org/drawingml/2006/picture">
+                  <pic:nvPicPr>
+                    <pic:cNvPr id="158" name=""/>
+                    <pic:cNvPicPr>
+                      <a:picLocks noChangeAspect="1" noChangeArrowheads="1"/>
+                    </pic:cNvPicPr>
+                  </pic:nvPicPr>
+                  <pic:blipFill>
+                    <a:blip r:embed="rId87"/>
+                    <a:stretch>
+                      <a:fillRect/>
+                    </a:stretch>
+                  </pic:blipFill>
+                  <pic:spPr bwMode="auto">
+                    <a:xfrm>
+                      <a:off x="0" y="0"/>
+                      <a:ext cx="5733288" cy="1810512"/>
+                    </a:xfrm>
+                    <a:prstGeom prst="rect">
+                      <a:avLst/>
+                    </a:prstGeom>
+                    <a:noFill/>
+                  </pic:spPr>
+                </pic:pic>
+              </a:graphicData>
+            </a:graphic>
+          </wp:inline>
+        </w:drawing>
+      </w:r>
+    </w:p>
+    <w:p>
+      <w:pPr>
+        <w:pStyle w:val="BaseFuente"/>
+      </w:pPr>
+      <w:r>
+        <w:t xml:space="preserve">Base: 458 personas: 196 de operaciones, 104 de administración, 120 del área comercial y 38 directivos. Cifras ficticias. El tono va de 50% (claro) a 100% (oscuro). Fuente: PULSO PUCP 2026.</w:t>
+      </w:r>
+    </w:p>
+    <w:p>
+      <w:pPr>
+        <w:pStyle w:val="RotuloGrafico"/>
+      </w:pPr>
+      <w:r>
+        <w:rPr>
+          <w:rStyle w:val="NumeroRotulo"/>
+        </w:rPr>
+        <w:t xml:space="preserve">Gráfico </w:t>
+      </w:r>
+      <w:r>
+        <w:rPr>
+          <w:rStyle w:val="NumeroRotulo"/>
+        </w:rPr>
+        <w:fldChar w:fldCharType="begin"/>
+      </w:r>
+      <w:r>
+        <w:rPr>
+          <w:rStyle w:val="NumeroRotulo"/>
+        </w:rPr>
+        <w:instrText xml:space="preserve"> SEQ Gráfico \* ARABIC </w:instrText>
+      </w:r>
+      <w:r>
+        <w:rPr>
+          <w:rStyle w:val="NumeroRotulo"/>
+        </w:rPr>
+        <w:fldChar w:fldCharType="separate"/>
+      </w:r>
+      <w:r>
+        <w:rPr>
+          <w:rStyle w:val="NumeroRotulo"/>
+        </w:rPr>
+        <w:t>69</w:t>
+      </w:r>
+      <w:r>
+        <w:rPr>
+          <w:rStyle w:val="NumeroRotulo"/>
+        </w:rPr>
+        <w:fldChar w:fldCharType="end"/>
+      </w:r>
+      <w:r>
+        <w:br w:type="textWrapping"/>
+      </w:r>
+      <w:r>
+        <w:rPr>
+          <w:rFonts/>
+          <w:i w:val="true"/>
+          <w:strike w:val="false"/>
+        </w:rPr>
+        <w:t xml:space="preserve">Qué debería mejorar primero la organización</w:t>
+      </w:r>
+    </w:p>
+    <w:p>
+      <w:pPr>
+        <w:pStyle w:val="Normal"/>
+        <w:keepNext/>
+        <w:pBdr>
+          <w:top w:val="none" w:sz="0" w:space="0" w:color="000000"/>
+          <w:left w:val="none" w:sz="0" w:space="0" w:color="000000"/>
+          <w:bottom w:val="none" w:sz="0" w:space="0" w:color="000000"/>
+          <w:right w:val="none" w:sz="0" w:space="0" w:color="000000"/>
+        </w:pBdr>
+        <w:spacing w:after="0" w:before="0" w:line="240"/>
+        <w:ind w:left="0" w:right="0" w:firstLine="0" w:firstLineChars="0"/>
+        <w:jc w:val="center"/>
+      </w:pPr>
+      <w:r>
+        <w:rPr/>
+        <w:drawing>
+          <wp:inline distT="0" distB="0" distL="0" distR="0">
+            <wp:extent cx="5733288" cy="2176272"/>
+            <wp:docPr id="159" name="" descr=""/>
+            <wp:cNvGraphicFramePr>
+              <a:graphicFrameLocks xmlns:a="http://schemas.openxmlformats.org/drawingml/2006/main" noChangeAspect="1"/>
+            </wp:cNvGraphicFramePr>
+            <a:graphic xmlns:a="http://schemas.openxmlformats.org/drawingml/2006/main">
+              <a:graphicData uri="http://schemas.openxmlformats.org/drawingml/2006/picture">
+                <pic:pic xmlns:pic="http://schemas.openxmlformats.org/drawingml/2006/picture">
+                  <pic:nvPicPr>
+                    <pic:cNvPr id="160" name=""/>
+                    <pic:cNvPicPr>
+                      <a:picLocks noChangeAspect="1" noChangeArrowheads="1"/>
+                    </pic:cNvPicPr>
+                  </pic:nvPicPr>
+                  <pic:blipFill>
+                    <a:blip r:embed="rId88"/>
+                    <a:stretch>
+                      <a:fillRect/>
+                    </a:stretch>
+                  </pic:blipFill>
+                  <pic:spPr bwMode="auto">
+                    <a:xfrm>
+                      <a:off x="0" y="0"/>
+                      <a:ext cx="5733288" cy="2176272"/>
+                    </a:xfrm>
+                    <a:prstGeom prst="rect">
+                      <a:avLst/>
+                    </a:prstGeom>
+                    <a:noFill/>
+                  </pic:spPr>
+                </pic:pic>
+              </a:graphicData>
+            </a:graphic>
+          </wp:inline>
+        </w:drawing>
+      </w:r>
+    </w:p>
+    <w:p>
+      <w:pPr>
+        <w:pStyle w:val="BaseFuente"/>
+      </w:pPr>
+      <w:r>
+        <w:t xml:space="preserve">Base: 420 trabajadores. Cifras ficticias. Fuente: PULSO PUCP 2026.</w:t>
       </w:r>
     </w:p>
     <w:p>
@@ -32554,7 +34470,7 @@
         <w:rPr>
           <w:rStyle w:val="NumeroRotulo"/>
         </w:rPr>
-        <w:t>54</w:t>
+        <w:t>70</w:t>
       </w:r>
       <w:r>
         <w:rPr>
@@ -32593,7 +34509,7 @@
         <w:drawing>
           <wp:inline distT="0" distB="0" distL="0" distR="0">
             <wp:extent cx="5733288" cy="1993392"/>
-            <wp:docPr id="129" name="" descr=""/>
+            <wp:docPr id="161" name="" descr=""/>
             <wp:cNvGraphicFramePr>
               <a:graphicFrameLocks xmlns:a="http://schemas.openxmlformats.org/drawingml/2006/main" noChangeAspect="1"/>
             </wp:cNvGraphicFramePr>
@@ -32601,13 +34517,13 @@
               <a:graphicData uri="http://schemas.openxmlformats.org/drawingml/2006/picture">
                 <pic:pic xmlns:pic="http://schemas.openxmlformats.org/drawingml/2006/picture">
                   <pic:nvPicPr>
-                    <pic:cNvPr id="130" name=""/>
+                    <pic:cNvPr id="162" name=""/>
                     <pic:cNvPicPr>
                       <a:picLocks noChangeAspect="1" noChangeArrowheads="1"/>
                     </pic:cNvPicPr>
                   </pic:nvPicPr>
                   <pic:blipFill>
-                    <a:blip r:embed="rId74"/>
+                    <a:blip r:embed="rId89"/>
                     <a:stretch>
                       <a:fillRect/>
                     </a:stretch>
@@ -32631,7 +34547,7 @@
     </w:p>
     <w:p>
       <w:pPr>
-        <w:pStyle w:val="BaseFuente"/>
+        <w:pStyle w:val="BaseFuenteLectura"/>
       </w:pPr>
       <w:r>
         <w:t xml:space="preserve">Base: 312 participantes medidos en las dos ocasiones. Cifras ficticias. Fuente: PULSO PUCP 2026.</w:t>
@@ -32654,6 +34570,255 @@
       </w:r>
       <w:r>
         <w:t xml:space="preserve">.</w:t>
+      </w:r>
+    </w:p>
+    <w:p>
+      <w:pPr>
+        <w:pStyle w:val="RotuloGrafico"/>
+      </w:pPr>
+      <w:r>
+        <w:rPr>
+          <w:rStyle w:val="NumeroRotulo"/>
+        </w:rPr>
+        <w:t xml:space="preserve">Gráfico </w:t>
+      </w:r>
+      <w:r>
+        <w:rPr>
+          <w:rStyle w:val="NumeroRotulo"/>
+        </w:rPr>
+        <w:fldChar w:fldCharType="begin"/>
+      </w:r>
+      <w:r>
+        <w:rPr>
+          <w:rStyle w:val="NumeroRotulo"/>
+        </w:rPr>
+        <w:instrText xml:space="preserve"> SEQ Gráfico \* ARABIC </w:instrText>
+      </w:r>
+      <w:r>
+        <w:rPr>
+          <w:rStyle w:val="NumeroRotulo"/>
+        </w:rPr>
+        <w:fldChar w:fldCharType="separate"/>
+      </w:r>
+      <w:r>
+        <w:rPr>
+          <w:rStyle w:val="NumeroRotulo"/>
+        </w:rPr>
+        <w:t>71</w:t>
+      </w:r>
+      <w:r>
+        <w:rPr>
+          <w:rStyle w:val="NumeroRotulo"/>
+        </w:rPr>
+        <w:fldChar w:fldCharType="end"/>
+      </w:r>
+      <w:r>
+        <w:br w:type="textWrapping"/>
+      </w:r>
+      <w:r>
+        <w:rPr>
+          <w:rFonts/>
+          <w:i w:val="true"/>
+          <w:strike w:val="false"/>
+        </w:rPr>
+        <w:t xml:space="preserve">Me siento capaz de administrar el dinero de mi hogar, en la línea de base y en la medición final</w:t>
+      </w:r>
+    </w:p>
+    <w:p>
+      <w:pPr>
+        <w:pStyle w:val="Normal"/>
+        <w:keepNext/>
+        <w:pBdr>
+          <w:top w:val="none" w:sz="0" w:space="0" w:color="000000"/>
+          <w:left w:val="none" w:sz="0" w:space="0" w:color="000000"/>
+          <w:bottom w:val="none" w:sz="0" w:space="0" w:color="000000"/>
+          <w:right w:val="none" w:sz="0" w:space="0" w:color="000000"/>
+        </w:pBdr>
+        <w:spacing w:after="0" w:before="0" w:line="240"/>
+        <w:ind w:left="0" w:right="0" w:firstLine="0" w:firstLineChars="0"/>
+        <w:jc w:val="center"/>
+      </w:pPr>
+      <w:r>
+        <w:rPr/>
+        <w:drawing>
+          <wp:inline distT="0" distB="0" distL="0" distR="0">
+            <wp:extent cx="5733288" cy="1751990"/>
+            <wp:docPr id="163" name="" descr=""/>
+            <wp:cNvGraphicFramePr>
+              <a:graphicFrameLocks xmlns:a="http://schemas.openxmlformats.org/drawingml/2006/main" noChangeAspect="1"/>
+            </wp:cNvGraphicFramePr>
+            <a:graphic xmlns:a="http://schemas.openxmlformats.org/drawingml/2006/main">
+              <a:graphicData uri="http://schemas.openxmlformats.org/drawingml/2006/picture">
+                <pic:pic xmlns:pic="http://schemas.openxmlformats.org/drawingml/2006/picture">
+                  <pic:nvPicPr>
+                    <pic:cNvPr id="164" name=""/>
+                    <pic:cNvPicPr>
+                      <a:picLocks noChangeAspect="1" noChangeArrowheads="1"/>
+                    </pic:cNvPicPr>
+                  </pic:nvPicPr>
+                  <pic:blipFill>
+                    <a:blip r:embed="rId90"/>
+                    <a:stretch>
+                      <a:fillRect/>
+                    </a:stretch>
+                  </pic:blipFill>
+                  <pic:spPr bwMode="auto">
+                    <a:xfrm>
+                      <a:off x="0" y="0"/>
+                      <a:ext cx="5733288" cy="1751990"/>
+                    </a:xfrm>
+                    <a:prstGeom prst="rect">
+                      <a:avLst/>
+                    </a:prstGeom>
+                    <a:noFill/>
+                  </pic:spPr>
+                </pic:pic>
+              </a:graphicData>
+            </a:graphic>
+          </wp:inline>
+        </w:drawing>
+      </w:r>
+    </w:p>
+    <w:p>
+      <w:pPr>
+        <w:pStyle w:val="BaseFuente"/>
+      </w:pPr>
+      <w:r>
+        <w:t xml:space="preserve">Base: 312 participantes medidos en las dos ocasiones. Cifras ficticias. Fuente: PULSO PUCP 2026.</w:t>
+      </w:r>
+    </w:p>
+    <w:p>
+      <w:pPr>
+        <w:pStyle w:val="RotuloGrafico"/>
+      </w:pPr>
+      <w:r>
+        <w:rPr>
+          <w:rStyle w:val="NumeroRotulo"/>
+        </w:rPr>
+        <w:t xml:space="preserve">Gráfico </w:t>
+      </w:r>
+      <w:r>
+        <w:rPr>
+          <w:rStyle w:val="NumeroRotulo"/>
+        </w:rPr>
+        <w:fldChar w:fldCharType="begin"/>
+      </w:r>
+      <w:r>
+        <w:rPr>
+          <w:rStyle w:val="NumeroRotulo"/>
+        </w:rPr>
+        <w:instrText xml:space="preserve"> SEQ Gráfico \* ARABIC </w:instrText>
+      </w:r>
+      <w:r>
+        <w:rPr>
+          <w:rStyle w:val="NumeroRotulo"/>
+        </w:rPr>
+        <w:fldChar w:fldCharType="separate"/>
+      </w:r>
+      <w:r>
+        <w:rPr>
+          <w:rStyle w:val="NumeroRotulo"/>
+        </w:rPr>
+        <w:t>72</w:t>
+      </w:r>
+      <w:r>
+        <w:rPr>
+          <w:rStyle w:val="NumeroRotulo"/>
+        </w:rPr>
+        <w:fldChar w:fldCharType="end"/>
+      </w:r>
+      <w:r>
+        <w:br w:type="textWrapping"/>
+      </w:r>
+      <w:r>
+        <w:rPr>
+          <w:rFonts/>
+          <w:i w:val="true"/>
+          <w:strike w:val="false"/>
+        </w:rPr>
+        <w:t xml:space="preserve">Puntaje promedio en la prueba de conocimientos financieros (de 0 a 20)</w:t>
+      </w:r>
+    </w:p>
+    <w:p>
+      <w:pPr>
+        <w:pStyle w:val="Normal"/>
+        <w:keepNext/>
+        <w:pBdr>
+          <w:top w:val="none" w:sz="0" w:space="0" w:color="000000"/>
+          <w:left w:val="none" w:sz="0" w:space="0" w:color="000000"/>
+          <w:bottom w:val="none" w:sz="0" w:space="0" w:color="000000"/>
+          <w:right w:val="none" w:sz="0" w:space="0" w:color="000000"/>
+        </w:pBdr>
+        <w:spacing w:after="0" w:before="0" w:line="240"/>
+        <w:ind w:left="0" w:right="0" w:firstLine="0" w:firstLineChars="0"/>
+        <w:jc w:val="center"/>
+      </w:pPr>
+      <w:r>
+        <w:rPr/>
+        <w:drawing>
+          <wp:inline distT="0" distB="0" distL="0" distR="0">
+            <wp:extent cx="5733288" cy="1627632"/>
+            <wp:docPr id="165" name="" descr=""/>
+            <wp:cNvGraphicFramePr>
+              <a:graphicFrameLocks xmlns:a="http://schemas.openxmlformats.org/drawingml/2006/main" noChangeAspect="1"/>
+            </wp:cNvGraphicFramePr>
+            <a:graphic xmlns:a="http://schemas.openxmlformats.org/drawingml/2006/main">
+              <a:graphicData uri="http://schemas.openxmlformats.org/drawingml/2006/picture">
+                <pic:pic xmlns:pic="http://schemas.openxmlformats.org/drawingml/2006/picture">
+                  <pic:nvPicPr>
+                    <pic:cNvPr id="166" name=""/>
+                    <pic:cNvPicPr>
+                      <a:picLocks noChangeAspect="1" noChangeArrowheads="1"/>
+                    </pic:cNvPicPr>
+                  </pic:nvPicPr>
+                  <pic:blipFill>
+                    <a:blip r:embed="rId91"/>
+                    <a:stretch>
+                      <a:fillRect/>
+                    </a:stretch>
+                  </pic:blipFill>
+                  <pic:spPr bwMode="auto">
+                    <a:xfrm>
+                      <a:off x="0" y="0"/>
+                      <a:ext cx="5733288" cy="1627632"/>
+                    </a:xfrm>
+                    <a:prstGeom prst="rect">
+                      <a:avLst/>
+                    </a:prstGeom>
+                    <a:noFill/>
+                  </pic:spPr>
+                </pic:pic>
+              </a:graphicData>
+            </a:graphic>
+          </wp:inline>
+        </w:drawing>
+      </w:r>
+    </w:p>
+    <w:p>
+      <w:pPr>
+        <w:pStyle w:val="BaseFuenteLectura"/>
+      </w:pPr>
+      <w:r>
+        <w:t xml:space="preserve">Base: 312 participantes. Cifras ficticias. Fuente: PULSO PUCP 2026.</w:t>
+      </w:r>
+    </w:p>
+    <w:p>
+      <w:pPr>
+        <w:pStyle w:val="Lectura"/>
+      </w:pPr>
+      <w:r>
+        <w:t xml:space="preserve">El puntaje promedio sube </w:t>
+      </w:r>
+      <w:r>
+        <w:rPr>
+          <w:rFonts/>
+          <w:b w:val="true"/>
+          <w:strike w:val="false"/>
+        </w:rPr>
+        <w:t xml:space="preserve">3.6 puntos</w:t>
+      </w:r>
+      <w:r>
+        <w:t xml:space="preserve"> entre la línea de base y la medición final.</w:t>
       </w:r>
     </w:p>
     <w:p>
@@ -32920,7 +35085,7 @@
         <w:drawing>
           <wp:inline distT="0" distB="0" distL="0" distR="0">
             <wp:extent cx="1988860" cy="914400"/>
-            <wp:docPr id="131" name="" descr=""/>
+            <wp:docPr id="167" name="" descr=""/>
             <wp:cNvGraphicFramePr>
               <a:graphicFrameLocks xmlns:a="http://schemas.openxmlformats.org/drawingml/2006/main" noChangeAspect="1"/>
             </wp:cNvGraphicFramePr>
@@ -32928,13 +35093,13 @@
               <a:graphicData uri="http://schemas.openxmlformats.org/drawingml/2006/picture">
                 <pic:pic xmlns:pic="http://schemas.openxmlformats.org/drawingml/2006/picture">
                   <pic:nvPicPr>
-                    <pic:cNvPr id="132" name=""/>
+                    <pic:cNvPr id="168" name=""/>
                     <pic:cNvPicPr>
                       <a:picLocks noChangeAspect="1" noChangeArrowheads="1"/>
                     </pic:cNvPicPr>
                   </pic:nvPicPr>
                   <pic:blipFill>
-                    <a:blip r:embed="rId75"/>
+                    <a:blip r:embed="rId92"/>
                     <a:stretch>
                       <a:fillRect/>
                     </a:stretch>
@@ -34510,6 +36675,32 @@
       <w:color w:val="5A6480"/>
     </w:rPr>
   </w:style>
+  <w:style xmlns:w="http://schemas.openxmlformats.org/wordprocessingml/2006/main" w:type="paragraph" w:customStyle="1" w:styleId="BaseFuenteLectura">
+    <w:name w:val="Base y fuente con lectura"/>
+    <w:basedOn w:val="Normal"/>
+    <w:pPr>
+      <w:keepNext/>
+      <w:pBdr>
+        <w:top w:val="none" w:sz="0" w:space="0" w:color="000000"/>
+        <w:left w:val="none" w:sz="0" w:space="0" w:color="000000"/>
+        <w:bottom w:val="none" w:sz="0" w:space="0" w:color="000000"/>
+        <w:right w:val="none" w:sz="0" w:space="0" w:color="000000"/>
+      </w:pBdr>
+      <w:spacing w:after="200" w:before="40" w:line="264"/>
+      <w:ind w:left="0" w:right="0" w:firstLine="0" w:firstLineChars="0"/>
+      <w:jc w:val="center"/>
+    </w:pPr>
+    <w:rPr>
+      <w:rFonts w:ascii="Arial" w:hAnsi="Arial" w:eastAsia="Arial" w:cs="Arial"/>
+      <w:i w:val="false"/>
+      <w:b w:val="false"/>
+      <w:u w:val="none"/>
+      <w:strike w:val="false"/>
+      <w:sz w:val="17"/>
+      <w:szCs w:val="17"/>
+      <w:color w:val="5A6480"/>
+    </w:rPr>
+  </w:style>
   <w:style xmlns:w="http://schemas.openxmlformats.org/wordprocessingml/2006/main" w:type="paragraph" w:customStyle="1" w:styleId="Lectura">
     <w:name w:val="Lectura"/>
     <w:basedOn w:val="Normal"/>

</xml_diff>